<commit_message>
comienzo paso de fases
</commit_message>
<xml_diff>
--- a/GUION.docx
+++ b/GUION.docx
@@ -140,6 +140,7 @@
           <w:lang w:eastAsia="es-ES"/>
         </w:rPr>
       </w:pPr>
+      <w:commentRangeStart w:id="1"/>
       <w:r>
         <w:rPr>
           <w:b/>
@@ -154,14 +155,14 @@
         </w:rPr>
         <w:t xml:space="preserve"> ¡Vamos mi pequeño aprendiz! ¡Utiliza </w:t>
       </w:r>
-      <w:commentRangeStart w:id="1"/>
+      <w:commentRangeStart w:id="2"/>
       <w:r>
         <w:rPr>
           <w:lang w:eastAsia="es-ES"/>
         </w:rPr>
         <w:t xml:space="preserve">W, A, S, D </w:t>
       </w:r>
-      <w:commentRangeEnd w:id="1"/>
+      <w:commentRangeEnd w:id="2"/>
       <w:r>
         <w:rPr>
           <w:rStyle w:val="Refdecomentario"/>
@@ -169,7 +170,7 @@
           <w:szCs w:val="24"/>
           <w:lang w:eastAsia="es-ES"/>
         </w:rPr>
-        <w:commentReference w:id="1"/>
+        <w:commentReference w:id="2"/>
       </w:r>
       <w:r>
         <w:rPr>
@@ -271,14 +272,14 @@
         </w:rPr>
         <w:t xml:space="preserve"> Bien muchacho, ahora tenemos que hacernos paso entre </w:t>
       </w:r>
-      <w:commentRangeStart w:id="2"/>
+      <w:commentRangeStart w:id="3"/>
       <w:r>
         <w:rPr>
           <w:lang w:eastAsia="es-ES"/>
         </w:rPr>
         <w:t xml:space="preserve">los monjes </w:t>
       </w:r>
-      <w:commentRangeEnd w:id="2"/>
+      <w:commentRangeEnd w:id="3"/>
       <w:r>
         <w:rPr>
           <w:rStyle w:val="Refdecomentario"/>
@@ -286,7 +287,7 @@
           <w:szCs w:val="24"/>
           <w:lang w:eastAsia="es-ES"/>
         </w:rPr>
-        <w:commentReference w:id="2"/>
+        <w:commentReference w:id="3"/>
       </w:r>
       <w:r>
         <w:rPr>
@@ -760,7 +761,176 @@
         <w:rPr>
           <w:lang w:eastAsia="es-ES"/>
         </w:rPr>
-        <w:t xml:space="preserve"> Mira Benjamín, allí al principio de la sala se encuentra nuestra princesa la Infanta, tan bella como su madre, pero mucho más jovial. Acércate joven para presentar tus respetos a la joven pareja, mas no se te olvide todo lo ya aprendido.</w:t>
+        <w:t xml:space="preserve"> Mira Benjamín, allí al </w:t>
+      </w:r>
+      <w:r>
+        <w:rPr>
+          <w:lang w:eastAsia="es-ES"/>
+        </w:rPr>
+        <w:t>fondo</w:t>
+      </w:r>
+      <w:r>
+        <w:rPr>
+          <w:lang w:eastAsia="es-ES"/>
+        </w:rPr>
+        <w:t xml:space="preserve"> de la </w:t>
+      </w:r>
+      <w:r>
+        <w:rPr>
+          <w:lang w:eastAsia="es-ES"/>
+        </w:rPr>
+        <w:t>plaza</w:t>
+      </w:r>
+      <w:r>
+        <w:rPr>
+          <w:lang w:eastAsia="es-ES"/>
+        </w:rPr>
+        <w:t xml:space="preserve"> se encuentra nuestra princesa la Infanta, tan bella como su madre, pero mucho más jovial. Acércate joven para presentar tus respetos a la joven pareja, </w:t>
+      </w:r>
+      <w:r>
+        <w:rPr>
+          <w:strike/>
+          <w:lang w:eastAsia="es-ES"/>
+        </w:rPr>
+        <w:t>mas no se te olvide todo lo ya aprendido</w:t>
+      </w:r>
+      <w:r>
+        <w:rPr>
+          <w:lang w:eastAsia="es-ES"/>
+        </w:rPr>
+        <w:t>.</w:t>
+      </w:r>
+    </w:p>
+    <w:p>
+      <w:pPr>
+        <w:jc w:val="both"/>
+        <w:rPr>
+          <w:lang w:eastAsia="es-ES"/>
+        </w:rPr>
+      </w:pPr>
+    </w:p>
+    <w:p>
+      <w:pPr>
+        <w:jc w:val="both"/>
+        <w:rPr>
+          <w:lang w:eastAsia="es-ES"/>
+        </w:rPr>
+      </w:pPr>
+      <w:r>
+        <w:rPr>
+          <w:b/>
+          <w:bCs/>
+          <w:lang w:eastAsia="es-ES"/>
+        </w:rPr>
+        <w:t>BENJAMÍN:</w:t>
+      </w:r>
+      <w:r>
+        <w:rPr>
+          <w:lang w:eastAsia="es-ES"/>
+        </w:rPr>
+        <w:t xml:space="preserve"> A sus pies mis señores, es un honor para mí poder presenciar tan magnánimo acontecimiento.</w:t>
+      </w:r>
+    </w:p>
+    <w:p>
+      <w:pPr>
+        <w:jc w:val="both"/>
+        <w:rPr>
+          <w:lang w:eastAsia="es-ES"/>
+        </w:rPr>
+      </w:pPr>
+      <w:r>
+        <w:rPr>
+          <w:b/>
+          <w:bCs/>
+          <w:lang w:eastAsia="es-ES"/>
+        </w:rPr>
+        <w:t>ISABEL:</w:t>
+      </w:r>
+      <w:r>
+        <w:rPr>
+          <w:lang w:eastAsia="es-ES"/>
+        </w:rPr>
+        <w:t xml:space="preserve"> </w:t>
+      </w:r>
+      <w:r>
+        <w:rPr>
+          <w:lang w:eastAsia="es-ES"/>
+        </w:rPr>
+        <w:t>Levántate joven Bufón y deje sus presentes en aquella mesa de allá</w:t>
+      </w:r>
+      <w:r>
+        <w:rPr>
+          <w:lang w:eastAsia="es-ES"/>
+        </w:rPr>
+        <w:t>.</w:t>
+      </w:r>
+    </w:p>
+    <w:p>
+      <w:pPr>
+        <w:jc w:val="both"/>
+        <w:rPr>
+          <w:lang w:eastAsia="es-ES"/>
+        </w:rPr>
+      </w:pPr>
+      <w:r>
+        <w:rPr>
+          <w:b/>
+          <w:bCs/>
+          <w:lang w:eastAsia="es-ES"/>
+        </w:rPr>
+        <w:t>BENJAMÍN:</w:t>
+      </w:r>
+      <w:r>
+        <w:rPr>
+          <w:lang w:eastAsia="es-ES"/>
+        </w:rPr>
+        <w:t xml:space="preserve"> </w:t>
+      </w:r>
+      <w:r>
+        <w:rPr>
+          <w:lang w:eastAsia="es-ES"/>
+        </w:rPr>
+        <w:t>Pero, ¿cómo que mis presentes? Si no tengo cosa alguna que mis encantos</w:t>
+      </w:r>
+      <w:r>
+        <w:rPr>
+          <w:lang w:eastAsia="es-ES"/>
+        </w:rPr>
+        <w:t>.</w:t>
+      </w:r>
+    </w:p>
+    <w:p>
+      <w:pPr>
+        <w:jc w:val="both"/>
+        <w:rPr>
+          <w:lang w:eastAsia="es-ES"/>
+        </w:rPr>
+      </w:pPr>
+      <w:r>
+        <w:rPr>
+          <w:b/>
+          <w:bCs/>
+          <w:lang w:eastAsia="es-ES"/>
+        </w:rPr>
+        <w:t>ISABEL:</w:t>
+      </w:r>
+      <w:r>
+        <w:rPr>
+          <w:lang w:eastAsia="es-ES"/>
+        </w:rPr>
+        <w:t xml:space="preserve"> </w:t>
+      </w:r>
+      <w:r>
+        <w:rPr>
+          <w:lang w:eastAsia="es-ES"/>
+        </w:rPr>
+        <w:t>¡¿Osas presentarte ante los monarcas de dos reinos con las manos vacías?! Si esto no cambia al final de la celebración atente a las consecuencias</w:t>
+      </w:r>
+      <w:r>
+        <w:rPr>
+          <w:lang w:eastAsia="es-ES"/>
+        </w:rPr>
+        <w:t>.</w:t>
       </w:r>
     </w:p>
     <w:p>
@@ -796,8 +966,8 @@
         </w:rPr>
         <w:t xml:space="preserve"> primera interacción con la Infanta quien le dice que como osa presentarse con las manos vacías y que tiene que volver con un regalo digno de una princesa. El jugador mediante el espionaje y engatusar a los npcs tendrá que encontrar dicho regalo, que acabará siendo un collar de perlas, teniendo que encontrar la información, los materiales y </w:t>
       </w:r>
-      <w:commentRangeStart w:id="3"/>
       <w:commentRangeStart w:id="4"/>
+      <w:commentRangeStart w:id="5"/>
       <w:r>
         <w:rPr>
           <w:i/>
@@ -806,7 +976,7 @@
         </w:rPr>
         <w:t xml:space="preserve">montarlo </w:t>
       </w:r>
-      <w:commentRangeEnd w:id="3"/>
+      <w:commentRangeEnd w:id="4"/>
       <w:r>
         <w:rPr>
           <w:rStyle w:val="Refdecomentario"/>
@@ -816,9 +986,9 @@
           <w:szCs w:val="24"/>
           <w:lang w:eastAsia="es-ES"/>
         </w:rPr>
-        <w:commentReference w:id="3"/>
-      </w:r>
-      <w:commentRangeEnd w:id="4"/>
+        <w:commentReference w:id="4"/>
+      </w:r>
+      <w:commentRangeEnd w:id="5"/>
       <w:r>
         <w:rPr>
           <w:rStyle w:val="Refdecomentario"/>
@@ -828,7 +998,7 @@
           <w:szCs w:val="24"/>
           <w:lang w:eastAsia="es-ES"/>
         </w:rPr>
-        <w:commentReference w:id="4"/>
+        <w:commentReference w:id="5"/>
       </w:r>
     </w:p>
     <w:p>
@@ -862,6 +1032,7 @@
           <w:bCs/>
           <w:lang w:eastAsia="es-ES"/>
         </w:rPr>
+        <w:lastRenderedPageBreak/>
         <w:t>ARLEQUINO:</w:t>
       </w:r>
       <w:r>
@@ -1054,608 +1225,7 @@
         </w:rPr>
         <w:t>Infanta.</w:t>
       </w:r>
-    </w:p>
-    <w:p>
-      <w:pPr>
-        <w:jc w:val="both"/>
-        <w:rPr>
-          <w:lang w:eastAsia="es-ES"/>
-        </w:rPr>
-      </w:pPr>
-    </w:p>
-    <w:p>
-      <w:pPr>
-        <w:jc w:val="both"/>
-        <w:rPr>
-          <w:i/>
-          <w:iCs/>
-          <w:lang w:eastAsia="es-ES"/>
-        </w:rPr>
-      </w:pPr>
-    </w:p>
-    <w:p>
-      <w:pPr>
-        <w:jc w:val="both"/>
-        <w:rPr>
-          <w:i/>
-          <w:iCs/>
-          <w:lang w:eastAsia="es-ES"/>
-        </w:rPr>
-      </w:pPr>
-      <w:r>
-        <w:rPr>
-          <w:i/>
-          <w:iCs/>
-          <w:lang w:eastAsia="es-ES"/>
-        </w:rPr>
-        <w:t>Conversación de desbloqueo</w:t>
-      </w:r>
-    </w:p>
-    <w:p>
-      <w:pPr>
-        <w:jc w:val="both"/>
-        <w:rPr>
-          <w:lang w:eastAsia="es-ES"/>
-        </w:rPr>
-      </w:pPr>
-      <w:r>
-        <w:rPr>
-          <w:b/>
-          <w:bCs/>
-          <w:lang w:eastAsia="es-ES"/>
-        </w:rPr>
-        <w:t>ALDEANO 1:</w:t>
-      </w:r>
-      <w:r>
-        <w:rPr>
-          <w:lang w:eastAsia="es-ES"/>
-        </w:rPr>
-        <w:t xml:space="preserve"> Pues yo he oído decir que a la princesa le gustan mucho los animales. </w:t>
-      </w:r>
-    </w:p>
-    <w:p>
-      <w:pPr>
-        <w:jc w:val="both"/>
-        <w:rPr>
-          <w:lang w:eastAsia="es-ES"/>
-        </w:rPr>
-      </w:pPr>
-      <w:r>
-        <w:rPr>
-          <w:b/>
-          <w:bCs/>
-          <w:lang w:eastAsia="es-ES"/>
-        </w:rPr>
-        <w:t xml:space="preserve">ALDEANO 2: </w:t>
-      </w:r>
-      <w:r>
-        <w:rPr>
-          <w:lang w:eastAsia="es-ES"/>
-        </w:rPr>
-        <w:t>No creo que un animal sea un regalo propicio por su casamiento, a fin de cuentas puede conseguir el animal que quiera en cualquier otro momento.</w:t>
-      </w:r>
-    </w:p>
-    <w:p>
-      <w:pPr>
-        <w:jc w:val="both"/>
-        <w:rPr>
-          <w:lang w:eastAsia="es-ES"/>
-        </w:rPr>
-      </w:pPr>
-      <w:r>
-        <w:rPr>
-          <w:b/>
-          <w:bCs/>
-          <w:lang w:eastAsia="es-ES"/>
-        </w:rPr>
-        <w:t>ALDEANO 3:</w:t>
-      </w:r>
-      <w:r>
-        <w:rPr>
-          <w:lang w:eastAsia="es-ES"/>
-        </w:rPr>
-        <w:t xml:space="preserve"> Ni animales, ni manjares ni otro tipo de víveres, las joyas es lo que más congratula a su majestad, si agradarla queréis más os vale buscar una joya sin igual.</w:t>
-      </w:r>
-    </w:p>
-    <w:p>
-      <w:pPr>
-        <w:jc w:val="both"/>
-        <w:rPr>
-          <w:lang w:eastAsia="es-ES"/>
-        </w:rPr>
-      </w:pPr>
-    </w:p>
-    <w:p>
-      <w:pPr>
-        <w:jc w:val="both"/>
-        <w:rPr>
-          <w:i/>
-          <w:iCs/>
-          <w:lang w:eastAsia="es-ES"/>
-        </w:rPr>
-      </w:pPr>
-      <w:r>
-        <w:rPr>
-          <w:i/>
-          <w:iCs/>
-          <w:lang w:eastAsia="es-ES"/>
-        </w:rPr>
-        <w:t>FRASES DESBLOQUEADAS</w:t>
-      </w:r>
-    </w:p>
-    <w:p>
-      <w:pPr>
-        <w:jc w:val="both"/>
-        <w:rPr>
-          <w:lang w:eastAsia="es-ES"/>
-        </w:rPr>
-      </w:pPr>
-      <w:r>
-        <w:rPr>
-          <w:b/>
-          <w:bCs/>
-          <w:lang w:eastAsia="es-ES"/>
-        </w:rPr>
-        <w:t>ARLEQUINO:</w:t>
-      </w:r>
-      <w:r>
-        <w:rPr>
-          <w:lang w:eastAsia="es-ES"/>
-        </w:rPr>
-        <w:t xml:space="preserve"> Con que joyas quiere su majestad, pues joyas tendrá. Si no sabes por dónde empezar, aquí te dejo un hilo para el dichoso collar.</w:t>
-      </w:r>
-    </w:p>
-    <w:p>
-      <w:pPr>
-        <w:jc w:val="both"/>
-        <w:rPr>
-          <w:lang w:eastAsia="es-ES"/>
-        </w:rPr>
-      </w:pPr>
-      <w:r>
-        <w:rPr>
-          <w:b/>
-          <w:bCs/>
-          <w:lang w:eastAsia="es-ES"/>
-        </w:rPr>
-        <w:t>MERCADER:</w:t>
-      </w:r>
-      <w:r>
-        <w:rPr>
-          <w:lang w:eastAsia="es-ES"/>
-        </w:rPr>
-        <w:t xml:space="preserve"> Así que de joyas va la cosa. Poseo todo tipo de piedras preciosas de India así como perlas que yo mismo saqué del mismísimo mar. Mas esté seguro de que aquello que desea comprar pues luego la Infanta cargará su ira contra vos.</w:t>
-      </w:r>
-    </w:p>
-    <w:p>
-      <w:pPr>
-        <w:jc w:val="both"/>
-        <w:rPr>
-          <w:lang w:eastAsia="es-ES"/>
-        </w:rPr>
-      </w:pPr>
-      <w:r>
-        <w:rPr>
-          <w:b/>
-          <w:bCs/>
-          <w:lang w:eastAsia="es-ES"/>
-        </w:rPr>
-        <w:t>HERERRO:</w:t>
-      </w:r>
-      <w:r>
-        <w:rPr>
-          <w:lang w:eastAsia="es-ES"/>
-        </w:rPr>
-        <w:t xml:space="preserve"> Armas tal vez no sirvan en esta ocasión pero un enganche para dicha alhaja sí puedo proporcionarle. Si vuesa merced me hace el favor de descubrir el misterio del líquido granate que esconden los monjes de este convento con tanto recelo le daré aquello que le será de ayuda.</w:t>
-      </w:r>
-    </w:p>
-    <w:p>
-      <w:pPr>
-        <w:jc w:val="both"/>
-        <w:rPr>
-          <w:i/>
-          <w:iCs/>
-          <w:lang w:eastAsia="es-ES"/>
-        </w:rPr>
-      </w:pPr>
-    </w:p>
-    <w:p>
-      <w:pPr>
-        <w:jc w:val="both"/>
-        <w:rPr>
-          <w:i/>
-          <w:iCs/>
-          <w:lang w:eastAsia="es-ES"/>
-        </w:rPr>
-      </w:pPr>
-      <w:r>
-        <w:rPr>
-          <w:i/>
-          <w:iCs/>
-          <w:lang w:eastAsia="es-ES"/>
-        </w:rPr>
-        <w:lastRenderedPageBreak/>
-        <w:t xml:space="preserve">En este momento los monjes desbloquean conversación/interacción, son 4 y cada uno dará algo de información acerca de la creación de la </w:t>
-      </w:r>
-      <w:commentRangeStart w:id="5"/>
-      <w:r>
-        <w:rPr>
-          <w:i/>
-          <w:iCs/>
-          <w:lang w:eastAsia="es-ES"/>
-        </w:rPr>
-        <w:t>ginja portuguesa</w:t>
-      </w:r>
-      <w:commentRangeEnd w:id="5"/>
-      <w:r>
-        <w:rPr>
-          <w:rStyle w:val="Refdecomentario"/>
-          <w:i/>
-          <w:iCs/>
-          <w:sz w:val="24"/>
-          <w:szCs w:val="24"/>
-          <w:lang w:eastAsia="es-ES"/>
-        </w:rPr>
-        <w:commentReference w:id="5"/>
-      </w:r>
-    </w:p>
-    <w:p>
-      <w:pPr>
-        <w:jc w:val="both"/>
-        <w:rPr>
-          <w:lang w:eastAsia="es-ES"/>
-        </w:rPr>
-      </w:pPr>
-      <w:r>
-        <w:rPr>
-          <w:b/>
-          <w:bCs/>
-          <w:lang w:eastAsia="es-ES"/>
-        </w:rPr>
-        <w:t xml:space="preserve">MONJE 1: </w:t>
-      </w:r>
-      <w:r>
-        <w:rPr>
-          <w:lang w:eastAsia="es-ES"/>
-        </w:rPr>
-        <w:t>En el mes donde se encuentra el día más largo del año se ha de recoger esta fruta, mas no trates de comerla pues su sabor es algo desagradable.</w:t>
-      </w:r>
-    </w:p>
-    <w:p>
-      <w:pPr>
-        <w:jc w:val="both"/>
-        <w:rPr>
-          <w:lang w:eastAsia="es-ES"/>
-        </w:rPr>
-      </w:pPr>
-      <w:r>
-        <w:rPr>
-          <w:b/>
-          <w:bCs/>
-          <w:lang w:eastAsia="es-ES"/>
-        </w:rPr>
-        <w:t>MONJE 2:</w:t>
-      </w:r>
-      <w:r>
-        <w:rPr>
-          <w:lang w:eastAsia="es-ES"/>
-        </w:rPr>
-        <w:t xml:space="preserve"> Si ginja quieres conseguir, el agua en llamas se ha de utilizar. Pero no cualquier cantidad pues las guindas se han de ahogar, y una ramita de canela se ha de añadir.</w:t>
-      </w:r>
-    </w:p>
-    <w:p>
-      <w:pPr>
-        <w:jc w:val="both"/>
-        <w:rPr>
-          <w:lang w:eastAsia="es-ES"/>
-        </w:rPr>
-      </w:pPr>
-      <w:r>
-        <w:rPr>
-          <w:b/>
-          <w:bCs/>
-          <w:lang w:eastAsia="es-ES"/>
-        </w:rPr>
-        <w:t>MONJE 3:</w:t>
-      </w:r>
-      <w:r>
-        <w:rPr>
-          <w:lang w:eastAsia="es-ES"/>
-        </w:rPr>
-        <w:t xml:space="preserve"> Para su maceración se ha de esperar tantos días como tiene la Cuaresma para poder añadir aquello que endulza su sabor.</w:t>
-      </w:r>
-    </w:p>
-    <w:p>
-      <w:pPr>
-        <w:jc w:val="both"/>
-        <w:rPr>
-          <w:lang w:eastAsia="es-ES"/>
-        </w:rPr>
-      </w:pPr>
-      <w:r>
-        <w:rPr>
-          <w:b/>
-          <w:bCs/>
-          <w:lang w:eastAsia="es-ES"/>
-        </w:rPr>
-        <w:t>MONJE 4:</w:t>
-      </w:r>
-      <w:r>
-        <w:rPr>
-          <w:lang w:eastAsia="es-ES"/>
-        </w:rPr>
-        <w:t xml:space="preserve"> Para poder tomar dicho elixir hay que ser paciente, ya lo dijo Nuestro Señor, quien determinó el tiempo a esperar con los días que tardó en hacer la creación de todo lo que hoy conocemos.</w:t>
-      </w:r>
-    </w:p>
-    <w:p>
-      <w:pPr>
-        <w:jc w:val="both"/>
-        <w:rPr>
-          <w:i/>
-          <w:iCs/>
-          <w:lang w:eastAsia="es-ES"/>
-        </w:rPr>
-      </w:pPr>
-      <w:commentRangeStart w:id="6"/>
-      <w:r>
-        <w:rPr>
-          <w:i/>
-          <w:iCs/>
-          <w:lang w:eastAsia="es-ES"/>
-        </w:rPr>
-        <w:t>Puzle de rellenar los huecos con el Herrero</w:t>
-      </w:r>
-    </w:p>
-    <w:p>
-      <w:pPr>
-        <w:jc w:val="both"/>
-        <w:rPr>
-          <w:lang w:eastAsia="es-ES"/>
-        </w:rPr>
-      </w:pPr>
-      <w:r>
-        <w:rPr>
-          <w:b/>
-          <w:bCs/>
-          <w:lang w:eastAsia="es-ES"/>
-        </w:rPr>
-        <w:t>Herrero:</w:t>
-      </w:r>
-      <w:r>
-        <w:rPr>
-          <w:lang w:eastAsia="es-ES"/>
-        </w:rPr>
-        <w:t xml:space="preserve"> Con que solo se pueden recoger las guindas en ese mes… Me pregunto qué mes será…</w:t>
-      </w:r>
-    </w:p>
-    <w:p>
-      <w:pPr>
-        <w:jc w:val="both"/>
-        <w:rPr>
-          <w:i/>
-          <w:iCs/>
-          <w:lang w:eastAsia="es-ES"/>
-        </w:rPr>
-      </w:pPr>
-      <w:r>
-        <w:rPr>
-          <w:i/>
-          <w:iCs/>
-          <w:lang w:eastAsia="es-ES"/>
-        </w:rPr>
-        <w:t xml:space="preserve">Opciones: </w:t>
-      </w:r>
-      <w:r>
-        <w:rPr>
-          <w:i/>
-          <w:iCs/>
-          <w:u w:val="single"/>
-          <w:lang w:eastAsia="es-ES"/>
-        </w:rPr>
-        <w:t>Junio</w:t>
-      </w:r>
-      <w:r>
-        <w:rPr>
-          <w:i/>
-          <w:iCs/>
-          <w:lang w:eastAsia="es-ES"/>
-        </w:rPr>
-        <w:t>, Mayo, Julio, Abril</w:t>
-      </w:r>
-    </w:p>
-    <w:p>
-      <w:pPr>
-        <w:jc w:val="both"/>
-        <w:rPr>
-          <w:lang w:eastAsia="es-ES"/>
-        </w:rPr>
-      </w:pPr>
-      <w:r>
-        <w:rPr>
-          <w:b/>
-          <w:bCs/>
-          <w:lang w:eastAsia="es-ES"/>
-        </w:rPr>
-        <w:t xml:space="preserve">Herrero: </w:t>
-      </w:r>
-      <w:r>
-        <w:rPr>
-          <w:lang w:eastAsia="es-ES"/>
-        </w:rPr>
-        <w:t>No conozco yo dicho líquido, me pregunto de cuál hablarán.</w:t>
-      </w:r>
-    </w:p>
-    <w:p>
-      <w:pPr>
-        <w:jc w:val="both"/>
-        <w:rPr>
-          <w:i/>
-          <w:iCs/>
-          <w:lang w:eastAsia="es-ES"/>
-        </w:rPr>
-      </w:pPr>
-      <w:r>
-        <w:rPr>
-          <w:i/>
-          <w:iCs/>
-          <w:lang w:eastAsia="es-ES"/>
-        </w:rPr>
-        <w:t xml:space="preserve">Opciones: </w:t>
-      </w:r>
-      <w:r>
-        <w:rPr>
-          <w:i/>
-          <w:iCs/>
-          <w:u w:val="single"/>
-          <w:lang w:eastAsia="es-ES"/>
-        </w:rPr>
-        <w:t>Aguardiente</w:t>
-      </w:r>
-      <w:r>
-        <w:rPr>
-          <w:i/>
-          <w:iCs/>
-          <w:lang w:eastAsia="es-ES"/>
-        </w:rPr>
-        <w:t>, Vodka, Hidromiel, Vino</w:t>
-      </w:r>
-    </w:p>
-    <w:p>
-      <w:pPr>
-        <w:jc w:val="both"/>
-        <w:rPr>
-          <w:lang w:eastAsia="es-ES"/>
-        </w:rPr>
-      </w:pPr>
-      <w:r>
-        <w:rPr>
-          <w:b/>
-          <w:bCs/>
-          <w:lang w:eastAsia="es-ES"/>
-        </w:rPr>
-        <w:t>Herrero:</w:t>
-      </w:r>
-      <w:r>
-        <w:rPr>
-          <w:lang w:eastAsia="es-ES"/>
-        </w:rPr>
-        <w:t xml:space="preserve"> No sé de cuantos días me habla para endulzar la mezcla, nunca fui muy creyente, pero no se lo diga a su majestad que me destierra del reino.</w:t>
-      </w:r>
-    </w:p>
-    <w:p>
-      <w:pPr>
-        <w:jc w:val="both"/>
-        <w:rPr>
-          <w:i/>
-          <w:iCs/>
-          <w:lang w:eastAsia="es-ES"/>
-        </w:rPr>
-      </w:pPr>
-      <w:r>
-        <w:rPr>
-          <w:i/>
-          <w:iCs/>
-          <w:lang w:eastAsia="es-ES"/>
-        </w:rPr>
-        <w:t xml:space="preserve">Opciones: 33 días, 7 días, </w:t>
-      </w:r>
-      <w:r>
-        <w:rPr>
-          <w:i/>
-          <w:iCs/>
-          <w:u w:val="single"/>
-          <w:lang w:eastAsia="es-ES"/>
-        </w:rPr>
-        <w:t>40 días</w:t>
-      </w:r>
-      <w:r>
-        <w:rPr>
-          <w:i/>
-          <w:iCs/>
-          <w:lang w:eastAsia="es-ES"/>
-        </w:rPr>
-        <w:t>, 10 días</w:t>
-      </w:r>
-    </w:p>
-    <w:p>
-      <w:pPr>
-        <w:jc w:val="both"/>
-        <w:rPr>
-          <w:lang w:eastAsia="es-ES"/>
-        </w:rPr>
-      </w:pPr>
-      <w:r>
-        <w:rPr>
-          <w:b/>
-          <w:bCs/>
-          <w:lang w:eastAsia="es-ES"/>
-        </w:rPr>
-        <w:t>Herrero:</w:t>
-      </w:r>
-      <w:r>
-        <w:rPr>
-          <w:lang w:eastAsia="es-ES"/>
-        </w:rPr>
-        <w:t xml:space="preserve"> Ya te lo he dicho antes, nunca hice caso a las sagradas escrituras, no sé el tiempo del que requirió el Padre Todopoderoso para crear lo que hoy vemos.</w:t>
-      </w:r>
-    </w:p>
-    <w:p>
-      <w:pPr>
-        <w:jc w:val="both"/>
-        <w:rPr>
-          <w:i/>
-          <w:iCs/>
-          <w:lang w:eastAsia="es-ES"/>
-        </w:rPr>
-      </w:pPr>
-      <w:r>
-        <w:rPr>
-          <w:i/>
-          <w:iCs/>
-          <w:lang w:eastAsia="es-ES"/>
-        </w:rPr>
-        <w:t xml:space="preserve">Opciones: </w:t>
-      </w:r>
-      <w:r>
-        <w:rPr>
-          <w:i/>
-          <w:iCs/>
-          <w:u w:val="single"/>
-          <w:lang w:eastAsia="es-ES"/>
-        </w:rPr>
-        <w:t>7 días</w:t>
-      </w:r>
-      <w:r>
-        <w:rPr>
-          <w:i/>
-          <w:iCs/>
-          <w:lang w:eastAsia="es-ES"/>
-        </w:rPr>
-        <w:t>, semana y media, 8 días, 3 días</w:t>
-      </w:r>
-    </w:p>
-    <w:p>
-      <w:pPr>
-        <w:jc w:val="both"/>
-        <w:rPr>
-          <w:lang w:eastAsia="es-ES"/>
-        </w:rPr>
-      </w:pPr>
-      <w:r>
-        <w:rPr>
-          <w:b/>
-          <w:bCs/>
-          <w:lang w:eastAsia="es-ES"/>
-        </w:rPr>
-        <w:t xml:space="preserve">Herrero: </w:t>
-      </w:r>
-      <w:r>
-        <w:rPr>
-          <w:lang w:eastAsia="es-ES"/>
-        </w:rPr>
-        <w:t>Creo que ya tengo todo lo que necesito para poder replicar su mayor secreto, mientras tú andabas por ahí te hice el enganche, toma.</w:t>
-      </w:r>
-      <w:commentRangeEnd w:id="6"/>
+      <w:commentRangeEnd w:id="1"/>
       <w:r>
         <w:rPr>
           <w:rStyle w:val="Refdecomentario"/>
@@ -1663,6 +1233,250 @@
           <w:szCs w:val="24"/>
           <w:lang w:eastAsia="es-ES"/>
         </w:rPr>
+        <w:commentReference w:id="1"/>
+      </w:r>
+    </w:p>
+    <w:p>
+      <w:pPr>
+        <w:jc w:val="both"/>
+        <w:rPr>
+          <w:lang w:eastAsia="es-ES"/>
+        </w:rPr>
+      </w:pPr>
+    </w:p>
+    <w:p>
+      <w:pPr>
+        <w:jc w:val="both"/>
+        <w:rPr>
+          <w:i/>
+          <w:iCs/>
+          <w:lang w:eastAsia="es-ES"/>
+        </w:rPr>
+      </w:pPr>
+    </w:p>
+    <w:p>
+      <w:pPr>
+        <w:jc w:val="both"/>
+        <w:rPr>
+          <w:i/>
+          <w:iCs/>
+          <w:lang w:eastAsia="es-ES"/>
+        </w:rPr>
+      </w:pPr>
+      <w:r>
+        <w:rPr>
+          <w:i/>
+          <w:iCs/>
+          <w:lang w:eastAsia="es-ES"/>
+        </w:rPr>
+        <w:t>Conversación de desbloqueo</w:t>
+      </w:r>
+    </w:p>
+    <w:p>
+      <w:pPr>
+        <w:jc w:val="both"/>
+        <w:rPr>
+          <w:lang w:eastAsia="es-ES"/>
+        </w:rPr>
+      </w:pPr>
+      <w:r>
+        <w:rPr>
+          <w:b/>
+          <w:bCs/>
+          <w:lang w:eastAsia="es-ES"/>
+        </w:rPr>
+        <w:t>ALDEANO 1:</w:t>
+      </w:r>
+      <w:r>
+        <w:rPr>
+          <w:lang w:eastAsia="es-ES"/>
+        </w:rPr>
+        <w:t xml:space="preserve"> Pues yo he oído decir que a la princesa le gustan mucho los animales. </w:t>
+      </w:r>
+    </w:p>
+    <w:p>
+      <w:pPr>
+        <w:jc w:val="both"/>
+        <w:rPr>
+          <w:lang w:eastAsia="es-ES"/>
+        </w:rPr>
+      </w:pPr>
+      <w:r>
+        <w:rPr>
+          <w:b/>
+          <w:bCs/>
+          <w:lang w:eastAsia="es-ES"/>
+        </w:rPr>
+        <w:t xml:space="preserve">ALDEANO 2: </w:t>
+      </w:r>
+      <w:r>
+        <w:rPr>
+          <w:lang w:eastAsia="es-ES"/>
+        </w:rPr>
+        <w:t>No creo que un animal sea un regalo propicio por su casamiento, a fin de cuentas puede conseguir el animal que quiera en cualquier otro momento.</w:t>
+      </w:r>
+    </w:p>
+    <w:p>
+      <w:pPr>
+        <w:jc w:val="both"/>
+        <w:rPr>
+          <w:lang w:eastAsia="es-ES"/>
+        </w:rPr>
+      </w:pPr>
+      <w:r>
+        <w:rPr>
+          <w:b/>
+          <w:bCs/>
+          <w:lang w:eastAsia="es-ES"/>
+        </w:rPr>
+        <w:t>ALDEANO 3:</w:t>
+      </w:r>
+      <w:r>
+        <w:rPr>
+          <w:lang w:eastAsia="es-ES"/>
+        </w:rPr>
+        <w:t xml:space="preserve"> Ni animales, ni manjares ni otro tipo de víveres, las joyas es lo que más congratula a su majestad, si agradarla queréis más os vale buscar una joya sin igual.</w:t>
+      </w:r>
+    </w:p>
+    <w:p>
+      <w:pPr>
+        <w:jc w:val="both"/>
+        <w:rPr>
+          <w:lang w:eastAsia="es-ES"/>
+        </w:rPr>
+      </w:pPr>
+    </w:p>
+    <w:p>
+      <w:pPr>
+        <w:jc w:val="both"/>
+        <w:rPr>
+          <w:i/>
+          <w:iCs/>
+          <w:lang w:eastAsia="es-ES"/>
+        </w:rPr>
+      </w:pPr>
+      <w:r>
+        <w:rPr>
+          <w:i/>
+          <w:iCs/>
+          <w:lang w:eastAsia="es-ES"/>
+        </w:rPr>
+        <w:t>FRASES DESBLOQUEADAS</w:t>
+      </w:r>
+    </w:p>
+    <w:p>
+      <w:pPr>
+        <w:jc w:val="both"/>
+        <w:rPr>
+          <w:lang w:eastAsia="es-ES"/>
+        </w:rPr>
+      </w:pPr>
+      <w:r>
+        <w:rPr>
+          <w:b/>
+          <w:bCs/>
+          <w:lang w:eastAsia="es-ES"/>
+        </w:rPr>
+        <w:t>ARLEQUINO:</w:t>
+      </w:r>
+      <w:r>
+        <w:rPr>
+          <w:lang w:eastAsia="es-ES"/>
+        </w:rPr>
+        <w:t xml:space="preserve"> Con que joyas quiere su majestad, pues joyas tendrá. Si no sabes por dónde empezar, aquí te dejo un hilo para el dichoso collar.</w:t>
+      </w:r>
+    </w:p>
+    <w:p>
+      <w:pPr>
+        <w:jc w:val="both"/>
+        <w:rPr>
+          <w:lang w:eastAsia="es-ES"/>
+        </w:rPr>
+      </w:pPr>
+      <w:r>
+        <w:rPr>
+          <w:b/>
+          <w:bCs/>
+          <w:lang w:eastAsia="es-ES"/>
+        </w:rPr>
+        <w:lastRenderedPageBreak/>
+        <w:t>MERCADER:</w:t>
+      </w:r>
+      <w:r>
+        <w:rPr>
+          <w:lang w:eastAsia="es-ES"/>
+        </w:rPr>
+        <w:t xml:space="preserve"> Así que de joyas va la cosa. Poseo todo tipo de piedras preciosas de India así como perlas que yo mismo saqué del mismísimo mar. Mas esté seguro de que aquello que desea comprar pues luego la Infanta cargará su ira contra vos.</w:t>
+      </w:r>
+    </w:p>
+    <w:p>
+      <w:pPr>
+        <w:jc w:val="both"/>
+        <w:rPr>
+          <w:lang w:eastAsia="es-ES"/>
+        </w:rPr>
+      </w:pPr>
+      <w:r>
+        <w:rPr>
+          <w:b/>
+          <w:bCs/>
+          <w:lang w:eastAsia="es-ES"/>
+        </w:rPr>
+        <w:t>HERERRO:</w:t>
+      </w:r>
+      <w:r>
+        <w:rPr>
+          <w:lang w:eastAsia="es-ES"/>
+        </w:rPr>
+        <w:t xml:space="preserve"> Armas tal vez no sirvan en esta ocasión pero un enganche para dicha alhaja sí puedo proporcionarle. Si vuesa merced me hace el favor de descubrir el misterio del líquido granate que esconden los monjes de este convento con tanto recelo le daré aquello que le será de ayuda.</w:t>
+      </w:r>
+    </w:p>
+    <w:p>
+      <w:pPr>
+        <w:jc w:val="both"/>
+        <w:rPr>
+          <w:i/>
+          <w:iCs/>
+          <w:lang w:eastAsia="es-ES"/>
+        </w:rPr>
+      </w:pPr>
+    </w:p>
+    <w:p>
+      <w:pPr>
+        <w:jc w:val="both"/>
+        <w:rPr>
+          <w:i/>
+          <w:iCs/>
+          <w:lang w:eastAsia="es-ES"/>
+        </w:rPr>
+      </w:pPr>
+      <w:r>
+        <w:rPr>
+          <w:i/>
+          <w:iCs/>
+          <w:lang w:eastAsia="es-ES"/>
+        </w:rPr>
+        <w:t xml:space="preserve">En este momento los monjes desbloquean conversación/interacción, son 4 y cada uno dará algo de información acerca de la creación de la </w:t>
+      </w:r>
+      <w:commentRangeStart w:id="6"/>
+      <w:r>
+        <w:rPr>
+          <w:i/>
+          <w:iCs/>
+          <w:lang w:eastAsia="es-ES"/>
+        </w:rPr>
+        <w:t>ginja portuguesa</w:t>
+      </w:r>
+      <w:commentRangeEnd w:id="6"/>
+      <w:r>
+        <w:rPr>
+          <w:rStyle w:val="Refdecomentario"/>
+          <w:i/>
+          <w:iCs/>
+          <w:sz w:val="24"/>
+          <w:szCs w:val="24"/>
+          <w:lang w:eastAsia="es-ES"/>
+        </w:rPr>
         <w:commentReference w:id="6"/>
       </w:r>
     </w:p>
@@ -1670,6 +1484,374 @@
       <w:pPr>
         <w:jc w:val="both"/>
         <w:rPr>
+          <w:lang w:eastAsia="es-ES"/>
+        </w:rPr>
+      </w:pPr>
+      <w:r>
+        <w:rPr>
+          <w:b/>
+          <w:bCs/>
+          <w:lang w:eastAsia="es-ES"/>
+        </w:rPr>
+        <w:t xml:space="preserve">MONJE 1: </w:t>
+      </w:r>
+      <w:r>
+        <w:rPr>
+          <w:lang w:eastAsia="es-ES"/>
+        </w:rPr>
+        <w:t>En el mes donde se encuentra el día más largo del año se ha de recoger esta fruta, mas no trates de comerla pues su sabor es algo desagradable.</w:t>
+      </w:r>
+    </w:p>
+    <w:p>
+      <w:pPr>
+        <w:jc w:val="both"/>
+        <w:rPr>
+          <w:lang w:eastAsia="es-ES"/>
+        </w:rPr>
+      </w:pPr>
+      <w:r>
+        <w:rPr>
+          <w:b/>
+          <w:bCs/>
+          <w:lang w:eastAsia="es-ES"/>
+        </w:rPr>
+        <w:t>MONJE 2:</w:t>
+      </w:r>
+      <w:r>
+        <w:rPr>
+          <w:lang w:eastAsia="es-ES"/>
+        </w:rPr>
+        <w:t xml:space="preserve"> Si ginja quieres conseguir, el agua en llamas se ha de utilizar. Pero no cualquier cantidad pues las guindas se han de ahogar, y una ramita de canela se ha de añadir.</w:t>
+      </w:r>
+    </w:p>
+    <w:p>
+      <w:pPr>
+        <w:jc w:val="both"/>
+        <w:rPr>
+          <w:lang w:eastAsia="es-ES"/>
+        </w:rPr>
+      </w:pPr>
+      <w:r>
+        <w:rPr>
+          <w:b/>
+          <w:bCs/>
+          <w:lang w:eastAsia="es-ES"/>
+        </w:rPr>
+        <w:t>MONJE 3:</w:t>
+      </w:r>
+      <w:r>
+        <w:rPr>
+          <w:lang w:eastAsia="es-ES"/>
+        </w:rPr>
+        <w:t xml:space="preserve"> Para su maceración se ha de esperar tantos días como tiene la Cuaresma para poder añadir aquello que endulza su sabor.</w:t>
+      </w:r>
+    </w:p>
+    <w:p>
+      <w:pPr>
+        <w:jc w:val="both"/>
+        <w:rPr>
+          <w:lang w:eastAsia="es-ES"/>
+        </w:rPr>
+      </w:pPr>
+      <w:r>
+        <w:rPr>
+          <w:b/>
+          <w:bCs/>
+          <w:lang w:eastAsia="es-ES"/>
+        </w:rPr>
+        <w:t>MONJE 4:</w:t>
+      </w:r>
+      <w:r>
+        <w:rPr>
+          <w:lang w:eastAsia="es-ES"/>
+        </w:rPr>
+        <w:t xml:space="preserve"> Para poder tomar dicho elixir hay que ser paciente, ya lo dijo Nuestro Señor, quien determinó el tiempo a esperar con los días que tardó en hacer la creación de todo lo que hoy conocemos.</w:t>
+      </w:r>
+    </w:p>
+    <w:p>
+      <w:pPr>
+        <w:jc w:val="both"/>
+        <w:rPr>
+          <w:i/>
+          <w:iCs/>
+          <w:lang w:eastAsia="es-ES"/>
+        </w:rPr>
+      </w:pPr>
+      <w:commentRangeStart w:id="7"/>
+      <w:r>
+        <w:rPr>
+          <w:i/>
+          <w:iCs/>
+          <w:lang w:eastAsia="es-ES"/>
+        </w:rPr>
+        <w:t>Puzle de rellenar los huecos con el Herrero</w:t>
+      </w:r>
+    </w:p>
+    <w:p>
+      <w:pPr>
+        <w:jc w:val="both"/>
+        <w:rPr>
+          <w:lang w:eastAsia="es-ES"/>
+        </w:rPr>
+      </w:pPr>
+      <w:r>
+        <w:rPr>
+          <w:b/>
+          <w:bCs/>
+          <w:lang w:eastAsia="es-ES"/>
+        </w:rPr>
+        <w:t>Herrero:</w:t>
+      </w:r>
+      <w:r>
+        <w:rPr>
+          <w:lang w:eastAsia="es-ES"/>
+        </w:rPr>
+        <w:t xml:space="preserve"> Con que solo se pueden recoger las guindas en ese mes… Me pregunto qué mes será…</w:t>
+      </w:r>
+    </w:p>
+    <w:p>
+      <w:pPr>
+        <w:jc w:val="both"/>
+        <w:rPr>
+          <w:i/>
+          <w:iCs/>
+          <w:lang w:eastAsia="es-ES"/>
+        </w:rPr>
+      </w:pPr>
+      <w:r>
+        <w:rPr>
+          <w:i/>
+          <w:iCs/>
+          <w:lang w:eastAsia="es-ES"/>
+        </w:rPr>
+        <w:t xml:space="preserve">Opciones: </w:t>
+      </w:r>
+      <w:r>
+        <w:rPr>
+          <w:i/>
+          <w:iCs/>
+          <w:u w:val="single"/>
+          <w:lang w:eastAsia="es-ES"/>
+        </w:rPr>
+        <w:t>Junio</w:t>
+      </w:r>
+      <w:r>
+        <w:rPr>
+          <w:i/>
+          <w:iCs/>
+          <w:lang w:eastAsia="es-ES"/>
+        </w:rPr>
+        <w:t>, Mayo, Julio, Abril</w:t>
+      </w:r>
+    </w:p>
+    <w:p>
+      <w:pPr>
+        <w:jc w:val="both"/>
+        <w:rPr>
+          <w:lang w:eastAsia="es-ES"/>
+        </w:rPr>
+      </w:pPr>
+      <w:r>
+        <w:rPr>
+          <w:b/>
+          <w:bCs/>
+          <w:lang w:eastAsia="es-ES"/>
+        </w:rPr>
+        <w:t xml:space="preserve">Herrero: </w:t>
+      </w:r>
+      <w:r>
+        <w:rPr>
+          <w:lang w:eastAsia="es-ES"/>
+        </w:rPr>
+        <w:t>No conozco yo dicho líquido, me pregunto de cuál hablarán.</w:t>
+      </w:r>
+    </w:p>
+    <w:p>
+      <w:pPr>
+        <w:jc w:val="both"/>
+        <w:rPr>
+          <w:i/>
+          <w:iCs/>
+          <w:lang w:eastAsia="es-ES"/>
+        </w:rPr>
+      </w:pPr>
+      <w:r>
+        <w:rPr>
+          <w:i/>
+          <w:iCs/>
+          <w:lang w:eastAsia="es-ES"/>
+        </w:rPr>
+        <w:t xml:space="preserve">Opciones: </w:t>
+      </w:r>
+      <w:r>
+        <w:rPr>
+          <w:i/>
+          <w:iCs/>
+          <w:u w:val="single"/>
+          <w:lang w:eastAsia="es-ES"/>
+        </w:rPr>
+        <w:t>Aguardiente</w:t>
+      </w:r>
+      <w:r>
+        <w:rPr>
+          <w:i/>
+          <w:iCs/>
+          <w:lang w:eastAsia="es-ES"/>
+        </w:rPr>
+        <w:t>, Vodka, Hidromiel, Vino</w:t>
+      </w:r>
+    </w:p>
+    <w:p>
+      <w:pPr>
+        <w:jc w:val="both"/>
+        <w:rPr>
+          <w:lang w:eastAsia="es-ES"/>
+        </w:rPr>
+      </w:pPr>
+      <w:r>
+        <w:rPr>
+          <w:b/>
+          <w:bCs/>
+          <w:lang w:eastAsia="es-ES"/>
+        </w:rPr>
+        <w:t>Herrero:</w:t>
+      </w:r>
+      <w:r>
+        <w:rPr>
+          <w:lang w:eastAsia="es-ES"/>
+        </w:rPr>
+        <w:t xml:space="preserve"> No sé de cuantos días me habla para endulzar la mezcla, nunca fui muy creyente, pero no se lo diga a su majestad que me destierra del reino.</w:t>
+      </w:r>
+    </w:p>
+    <w:p>
+      <w:pPr>
+        <w:jc w:val="both"/>
+        <w:rPr>
+          <w:i/>
+          <w:iCs/>
+          <w:lang w:eastAsia="es-ES"/>
+        </w:rPr>
+      </w:pPr>
+      <w:r>
+        <w:rPr>
+          <w:i/>
+          <w:iCs/>
+          <w:lang w:eastAsia="es-ES"/>
+        </w:rPr>
+        <w:t xml:space="preserve">Opciones: 33 días, 7 días, </w:t>
+      </w:r>
+      <w:r>
+        <w:rPr>
+          <w:i/>
+          <w:iCs/>
+          <w:u w:val="single"/>
+          <w:lang w:eastAsia="es-ES"/>
+        </w:rPr>
+        <w:t>40 días</w:t>
+      </w:r>
+      <w:r>
+        <w:rPr>
+          <w:i/>
+          <w:iCs/>
+          <w:lang w:eastAsia="es-ES"/>
+        </w:rPr>
+        <w:t>, 10 días</w:t>
+      </w:r>
+    </w:p>
+    <w:p>
+      <w:pPr>
+        <w:jc w:val="both"/>
+        <w:rPr>
+          <w:lang w:eastAsia="es-ES"/>
+        </w:rPr>
+      </w:pPr>
+      <w:r>
+        <w:rPr>
+          <w:b/>
+          <w:bCs/>
+          <w:lang w:eastAsia="es-ES"/>
+        </w:rPr>
+        <w:t>Herrero:</w:t>
+      </w:r>
+      <w:r>
+        <w:rPr>
+          <w:lang w:eastAsia="es-ES"/>
+        </w:rPr>
+        <w:t xml:space="preserve"> Ya te lo he dicho antes, nunca hice caso a las sagradas escrituras, no sé el tiempo del que requirió el Padre Todopoderoso para crear lo que hoy vemos.</w:t>
+      </w:r>
+    </w:p>
+    <w:p>
+      <w:pPr>
+        <w:jc w:val="both"/>
+        <w:rPr>
+          <w:i/>
+          <w:iCs/>
+          <w:lang w:eastAsia="es-ES"/>
+        </w:rPr>
+      </w:pPr>
+      <w:r>
+        <w:rPr>
+          <w:i/>
+          <w:iCs/>
+          <w:lang w:eastAsia="es-ES"/>
+        </w:rPr>
+        <w:t xml:space="preserve">Opciones: </w:t>
+      </w:r>
+      <w:r>
+        <w:rPr>
+          <w:i/>
+          <w:iCs/>
+          <w:u w:val="single"/>
+          <w:lang w:eastAsia="es-ES"/>
+        </w:rPr>
+        <w:t>7 días</w:t>
+      </w:r>
+      <w:r>
+        <w:rPr>
+          <w:i/>
+          <w:iCs/>
+          <w:lang w:eastAsia="es-ES"/>
+        </w:rPr>
+        <w:t>, semana y media, 8 días, 3 días</w:t>
+      </w:r>
+    </w:p>
+    <w:p>
+      <w:pPr>
+        <w:jc w:val="both"/>
+        <w:rPr>
+          <w:lang w:eastAsia="es-ES"/>
+        </w:rPr>
+      </w:pPr>
+      <w:r>
+        <w:rPr>
+          <w:b/>
+          <w:bCs/>
+          <w:lang w:eastAsia="es-ES"/>
+        </w:rPr>
+        <w:lastRenderedPageBreak/>
+        <w:t xml:space="preserve">Herrero: </w:t>
+      </w:r>
+      <w:r>
+        <w:rPr>
+          <w:lang w:eastAsia="es-ES"/>
+        </w:rPr>
+        <w:t>Creo que ya tengo todo lo que necesito para poder replicar su mayor secreto, mientras tú andabas por ahí te hice el enganche, toma.</w:t>
+      </w:r>
+      <w:commentRangeEnd w:id="7"/>
+      <w:r>
+        <w:rPr>
+          <w:rStyle w:val="Refdecomentario"/>
+          <w:sz w:val="24"/>
+          <w:szCs w:val="24"/>
+          <w:lang w:eastAsia="es-ES"/>
+        </w:rPr>
+        <w:commentReference w:id="7"/>
+      </w:r>
+    </w:p>
+    <w:p>
+      <w:pPr>
+        <w:jc w:val="both"/>
+        <w:rPr>
           <w:i/>
           <w:iCs/>
           <w:lang w:eastAsia="es-ES"/>
@@ -1741,219 +1923,219 @@
           <w:bCs/>
           <w:lang w:eastAsia="es-ES"/>
         </w:rPr>
+        <w:t>ALDEANO 3:</w:t>
+      </w:r>
+      <w:r>
+        <w:rPr>
+          <w:lang w:eastAsia="es-ES"/>
+        </w:rPr>
+        <w:t xml:space="preserve"> Pues ahora que lo comentas viejo amigo, unas perlas a juego con su sonrisa ensalzarían su verdadera belleza.</w:t>
+      </w:r>
+    </w:p>
+    <w:p>
+      <w:pPr>
+        <w:jc w:val="both"/>
+        <w:rPr>
+          <w:lang w:eastAsia="es-ES"/>
+        </w:rPr>
+      </w:pPr>
+    </w:p>
+    <w:p>
+      <w:pPr>
+        <w:jc w:val="both"/>
+        <w:rPr>
+          <w:i/>
+          <w:iCs/>
+          <w:lang w:eastAsia="es-ES"/>
+        </w:rPr>
+      </w:pPr>
+      <w:r>
+        <w:rPr>
+          <w:i/>
+          <w:iCs/>
+          <w:lang w:eastAsia="es-ES"/>
+        </w:rPr>
+        <w:t>FRASE DESBLOQUEADA</w:t>
+      </w:r>
+    </w:p>
+    <w:p>
+      <w:pPr>
+        <w:jc w:val="both"/>
+        <w:rPr>
+          <w:lang w:eastAsia="es-ES"/>
+        </w:rPr>
+      </w:pPr>
+      <w:r>
+        <w:rPr>
+          <w:b/>
+          <w:bCs/>
+          <w:lang w:eastAsia="es-ES"/>
+        </w:rPr>
+        <w:t xml:space="preserve">MERCADER: </w:t>
+      </w:r>
+      <w:r>
+        <w:rPr>
+          <w:lang w:eastAsia="es-ES"/>
+        </w:rPr>
+        <w:t>Ya sabía yo que la de arriesgarme en el mar me iba a ser útil. Si mis perlas quieres, a cambio tendrás que conseguirme lana, se acerca el invierno y próximamente necesitaré cubrirme de sedosa lana si no quiero morir de frío.</w:t>
+      </w:r>
+    </w:p>
+    <w:p>
+      <w:pPr>
+        <w:jc w:val="both"/>
+        <w:rPr>
+          <w:lang w:eastAsia="es-ES"/>
+        </w:rPr>
+      </w:pPr>
+    </w:p>
+    <w:p>
+      <w:pPr>
+        <w:jc w:val="both"/>
+        <w:rPr>
+          <w:i/>
+          <w:iCs/>
+          <w:lang w:eastAsia="es-ES"/>
+        </w:rPr>
+      </w:pPr>
+      <w:r>
+        <w:rPr>
+          <w:i/>
+          <w:iCs/>
+          <w:lang w:eastAsia="es-ES"/>
+        </w:rPr>
+        <w:t>En este punto tendrá que encontrar las 3 ovejas escondidas por el convento y conseguir la lana que poseen</w:t>
+      </w:r>
+    </w:p>
+    <w:p>
+      <w:pPr>
+        <w:jc w:val="both"/>
+        <w:rPr>
+          <w:lang w:eastAsia="es-ES"/>
+        </w:rPr>
+      </w:pPr>
+    </w:p>
+    <w:p>
+      <w:pPr>
+        <w:jc w:val="both"/>
+        <w:rPr>
+          <w:b/>
+          <w:bCs/>
+          <w:lang w:eastAsia="es-ES"/>
+        </w:rPr>
+      </w:pPr>
+      <w:r>
+        <w:rPr>
+          <w:b/>
+          <w:bCs/>
+          <w:lang w:eastAsia="es-ES"/>
+        </w:rPr>
+        <w:t>CAPITULO 1</w:t>
+      </w:r>
+    </w:p>
+    <w:p>
+      <w:pPr>
+        <w:jc w:val="both"/>
+        <w:rPr>
+          <w:lang w:eastAsia="es-ES"/>
+        </w:rPr>
+      </w:pPr>
+      <w:r>
+        <w:rPr>
+          <w:b/>
+          <w:bCs/>
+          <w:lang w:eastAsia="es-ES"/>
+        </w:rPr>
+        <w:t>GINÉS:</w:t>
+      </w:r>
+      <w:r>
+        <w:rPr>
+          <w:lang w:eastAsia="es-ES"/>
+        </w:rPr>
+        <w:t xml:space="preserve"> Se pierde en la memoria por buena que esta fuera, una cerca tierra de la que les voy a hablar.</w:t>
+      </w:r>
+    </w:p>
+    <w:p>
+      <w:pPr>
+        <w:jc w:val="both"/>
+        <w:rPr>
+          <w:lang w:eastAsia="es-ES"/>
+        </w:rPr>
+      </w:pPr>
+      <w:r>
+        <w:rPr>
+          <w:lang w:eastAsia="es-ES"/>
+        </w:rPr>
+        <w:t>Ya de antigua habitaban así lo dicen sus piedras, donde hombres y mujeres decidieron enraizar.</w:t>
+      </w:r>
+    </w:p>
+    <w:p>
+      <w:pPr>
+        <w:jc w:val="both"/>
+        <w:rPr>
+          <w:lang w:eastAsia="es-ES"/>
+        </w:rPr>
+      </w:pPr>
+      <w:r>
+        <w:rPr>
+          <w:lang w:eastAsia="es-ES"/>
+        </w:rPr>
+        <w:t>Medina del Campo es su nombre, villa de ferias y acuerdos, donde el bullicio del mundo se reunía bajo sus techos.</w:t>
+      </w:r>
+    </w:p>
+    <w:p>
+      <w:pPr>
+        <w:jc w:val="both"/>
+        <w:rPr>
+          <w:lang w:eastAsia="es-ES"/>
+        </w:rPr>
+      </w:pPr>
+      <w:r>
+        <w:rPr>
+          <w:lang w:eastAsia="es-ES"/>
+        </w:rPr>
+        <w:t>Alzábase un noble palacio, de amplios patios y portales, donde Isabel y Fernando forjaban destinos reales.</w:t>
+      </w:r>
+    </w:p>
+    <w:p>
+      <w:pPr>
+        <w:jc w:val="both"/>
+        <w:rPr>
+          <w:lang w:eastAsia="es-ES"/>
+        </w:rPr>
+      </w:pPr>
+      <w:r>
+        <w:rPr>
+          <w:lang w:eastAsia="es-ES"/>
+        </w:rPr>
+        <w:t>Entre aquellos viejos muros, cuando el siglo agonizaba, una alianza con Portugal el reino entero esperaba.</w:t>
+      </w:r>
+    </w:p>
+    <w:p>
+      <w:pPr>
+        <w:jc w:val="both"/>
+        <w:rPr>
+          <w:lang w:eastAsia="es-ES"/>
+        </w:rPr>
+      </w:pPr>
+      <w:r>
+        <w:rPr>
+          <w:lang w:eastAsia="es-ES"/>
+        </w:rPr>
+        <w:t>Don Manuel fue el elegido, monarca de gran renombre, y la mano de la Infanta habría de unir dos nombres.</w:t>
+      </w:r>
+    </w:p>
+    <w:p>
+      <w:pPr>
+        <w:jc w:val="both"/>
+        <w:rPr>
+          <w:lang w:eastAsia="es-ES"/>
+        </w:rPr>
+      </w:pPr>
+      <w:r>
+        <w:rPr>
+          <w:lang w:eastAsia="es-ES"/>
+        </w:rPr>
         <w:lastRenderedPageBreak/>
-        <w:t>ALDEANO 3:</w:t>
-      </w:r>
-      <w:r>
-        <w:rPr>
-          <w:lang w:eastAsia="es-ES"/>
-        </w:rPr>
-        <w:t xml:space="preserve"> Pues ahora que lo comentas viejo amigo, unas perlas a juego con su sonrisa ensalzarían su verdadera belleza.</w:t>
-      </w:r>
-    </w:p>
-    <w:p>
-      <w:pPr>
-        <w:jc w:val="both"/>
-        <w:rPr>
-          <w:lang w:eastAsia="es-ES"/>
-        </w:rPr>
-      </w:pPr>
-    </w:p>
-    <w:p>
-      <w:pPr>
-        <w:jc w:val="both"/>
-        <w:rPr>
-          <w:i/>
-          <w:iCs/>
-          <w:lang w:eastAsia="es-ES"/>
-        </w:rPr>
-      </w:pPr>
-      <w:r>
-        <w:rPr>
-          <w:i/>
-          <w:iCs/>
-          <w:lang w:eastAsia="es-ES"/>
-        </w:rPr>
-        <w:t>FRASE DESBLOQUEADA</w:t>
-      </w:r>
-    </w:p>
-    <w:p>
-      <w:pPr>
-        <w:jc w:val="both"/>
-        <w:rPr>
-          <w:lang w:eastAsia="es-ES"/>
-        </w:rPr>
-      </w:pPr>
-      <w:r>
-        <w:rPr>
-          <w:b/>
-          <w:bCs/>
-          <w:lang w:eastAsia="es-ES"/>
-        </w:rPr>
-        <w:t xml:space="preserve">MERCADER: </w:t>
-      </w:r>
-      <w:r>
-        <w:rPr>
-          <w:lang w:eastAsia="es-ES"/>
-        </w:rPr>
-        <w:t>Ya sabía yo que la de arriesgarme en el mar me iba a ser útil. Si mis perlas quieres, a cambio tendrás que conseguirme lana, se acerca el invierno y próximamente necesitaré cubrirme de sedosa lana si no quiero morir de frío.</w:t>
-      </w:r>
-    </w:p>
-    <w:p>
-      <w:pPr>
-        <w:jc w:val="both"/>
-        <w:rPr>
-          <w:lang w:eastAsia="es-ES"/>
-        </w:rPr>
-      </w:pPr>
-    </w:p>
-    <w:p>
-      <w:pPr>
-        <w:jc w:val="both"/>
-        <w:rPr>
-          <w:i/>
-          <w:iCs/>
-          <w:lang w:eastAsia="es-ES"/>
-        </w:rPr>
-      </w:pPr>
-      <w:r>
-        <w:rPr>
-          <w:i/>
-          <w:iCs/>
-          <w:lang w:eastAsia="es-ES"/>
-        </w:rPr>
-        <w:t>En este punto tendrá que encontrar las 3 ovejas escondidas por el convento y conseguir la lana que poseen</w:t>
-      </w:r>
-    </w:p>
-    <w:p>
-      <w:pPr>
-        <w:jc w:val="both"/>
-        <w:rPr>
-          <w:lang w:eastAsia="es-ES"/>
-        </w:rPr>
-      </w:pPr>
-    </w:p>
-    <w:p>
-      <w:pPr>
-        <w:jc w:val="both"/>
-        <w:rPr>
-          <w:b/>
-          <w:bCs/>
-          <w:lang w:eastAsia="es-ES"/>
-        </w:rPr>
-      </w:pPr>
-      <w:r>
-        <w:rPr>
-          <w:b/>
-          <w:bCs/>
-          <w:lang w:eastAsia="es-ES"/>
-        </w:rPr>
-        <w:t>CAPITULO 1</w:t>
-      </w:r>
-    </w:p>
-    <w:p>
-      <w:pPr>
-        <w:jc w:val="both"/>
-        <w:rPr>
-          <w:lang w:eastAsia="es-ES"/>
-        </w:rPr>
-      </w:pPr>
-      <w:r>
-        <w:rPr>
-          <w:b/>
-          <w:bCs/>
-          <w:lang w:eastAsia="es-ES"/>
-        </w:rPr>
-        <w:t>GINÉS:</w:t>
-      </w:r>
-      <w:r>
-        <w:rPr>
-          <w:lang w:eastAsia="es-ES"/>
-        </w:rPr>
-        <w:t xml:space="preserve"> Se pierde en la memoria por buena que esta fuera, una cerca tierra de la que les voy a hablar.</w:t>
-      </w:r>
-    </w:p>
-    <w:p>
-      <w:pPr>
-        <w:jc w:val="both"/>
-        <w:rPr>
-          <w:lang w:eastAsia="es-ES"/>
-        </w:rPr>
-      </w:pPr>
-      <w:r>
-        <w:rPr>
-          <w:lang w:eastAsia="es-ES"/>
-        </w:rPr>
-        <w:t>Ya de antigua habitaban así lo dicen sus piedras, donde hombres y mujeres decidieron enraizar.</w:t>
-      </w:r>
-    </w:p>
-    <w:p>
-      <w:pPr>
-        <w:jc w:val="both"/>
-        <w:rPr>
-          <w:lang w:eastAsia="es-ES"/>
-        </w:rPr>
-      </w:pPr>
-      <w:r>
-        <w:rPr>
-          <w:lang w:eastAsia="es-ES"/>
-        </w:rPr>
-        <w:t>Medina del Campo es su nombre, villa de ferias y acuerdos, donde el bullicio del mundo se reunía bajo sus techos.</w:t>
-      </w:r>
-    </w:p>
-    <w:p>
-      <w:pPr>
-        <w:jc w:val="both"/>
-        <w:rPr>
-          <w:lang w:eastAsia="es-ES"/>
-        </w:rPr>
-      </w:pPr>
-      <w:r>
-        <w:rPr>
-          <w:lang w:eastAsia="es-ES"/>
-        </w:rPr>
-        <w:t>Alzábase un noble palacio, de amplios patios y portales, donde Isabel y Fernando forjaban destinos reales.</w:t>
-      </w:r>
-    </w:p>
-    <w:p>
-      <w:pPr>
-        <w:jc w:val="both"/>
-        <w:rPr>
-          <w:lang w:eastAsia="es-ES"/>
-        </w:rPr>
-      </w:pPr>
-      <w:r>
-        <w:rPr>
-          <w:lang w:eastAsia="es-ES"/>
-        </w:rPr>
-        <w:t>Entre aquellos viejos muros, cuando el siglo agonizaba, una alianza con Portugal el reino entero esperaba.</w:t>
-      </w:r>
-    </w:p>
-    <w:p>
-      <w:pPr>
-        <w:jc w:val="both"/>
-        <w:rPr>
-          <w:lang w:eastAsia="es-ES"/>
-        </w:rPr>
-      </w:pPr>
-      <w:r>
-        <w:rPr>
-          <w:lang w:eastAsia="es-ES"/>
-        </w:rPr>
-        <w:t>Don Manuel fue el elegido, monarca de gran renombre, y la mano de la Infanta habría de unir dos nombres.</w:t>
-      </w:r>
-    </w:p>
-    <w:p>
-      <w:pPr>
-        <w:jc w:val="both"/>
-        <w:rPr>
-          <w:lang w:eastAsia="es-ES"/>
-        </w:rPr>
-      </w:pPr>
-      <w:r>
-        <w:rPr>
-          <w:lang w:eastAsia="es-ES"/>
-        </w:rPr>
         <w:t>Y fue allí donde la historia, silenciosa y solemne, comenzó a tejer los hilos que aún el tiempo no desprende.</w:t>
       </w:r>
     </w:p>
@@ -2022,7 +2204,6 @@
           <w:b/>
           <w:bCs/>
         </w:rPr>
-        <w:lastRenderedPageBreak/>
         <w:t>BENJAMÍN:</w:t>
       </w:r>
       <w:r>
@@ -2078,7 +2259,7 @@
 
 <file path=word/comments.xml><?xml version="1.0" encoding="utf-8"?>
 <w:comments xmlns:wpc="http://schemas.microsoft.com/office/word/2010/wordprocessingCanvas" xmlns:cx="http://schemas.microsoft.com/office/drawing/2014/chartex" xmlns:cx1="http://schemas.microsoft.com/office/drawing/2015/9/8/chartex" xmlns:cx2="http://schemas.microsoft.com/office/drawing/2015/10/21/chartex" xmlns:cx3="http://schemas.microsoft.com/office/drawing/2016/5/9/chartex" xmlns:cx4="http://schemas.microsoft.com/office/drawing/2016/5/10/chartex" xmlns:cx5="http://schemas.microsoft.com/office/drawing/2016/5/11/chartex" xmlns:cx6="http://schemas.microsoft.com/office/drawing/2016/5/12/chartex" xmlns:cx7="http://schemas.microsoft.com/office/drawing/2016/5/13/chartex" xmlns:cx8="http://schemas.microsoft.com/office/drawing/2016/5/14/chartex" xmlns:mc="http://schemas.openxmlformats.org/markup-compatibility/2006" xmlns:aink="http://schemas.microsoft.com/office/drawing/2016/ink" xmlns:am3d="http://schemas.microsoft.com/office/drawing/2017/model3d" xmlns:o="urn:schemas-microsoft-com:office:office" xmlns:oel="http://schemas.microsoft.com/office/2019/extlst" xmlns:r="http://schemas.openxmlformats.org/officeDocument/2006/relationships" xmlns:m="http://schemas.openxmlformats.org/officeDocument/2006/math" xmlns:v="urn:schemas-microsoft-com:vml" xmlns:wp14="http://schemas.microsoft.com/office/word/2010/wordprocessingDrawing" xmlns:wp="http://schemas.openxmlformats.org/drawingml/2006/wordprocessingDrawing" xmlns:w10="urn:schemas-microsoft-com:office:word" xmlns:w="http://schemas.openxmlformats.org/wordprocessingml/2006/main" xmlns:w14="http://schemas.microsoft.com/office/word/2010/wordml" xmlns:w15="http://schemas.microsoft.com/office/word/2012/wordml" xmlns:w16cei="http://schemas.microsoft.com/office/word/2026/wordml/cei" xmlns:w16cex="http://schemas.microsoft.com/office/word/2018/wordml/cex" xmlns:w16cid="http://schemas.microsoft.com/office/word/2016/wordml/cid" xmlns:w16="http://schemas.microsoft.com/office/word/2018/wordml" xmlns:w16du="http://schemas.microsoft.com/office/word/2023/wordml/word16du" xmlns:w16sdtdh="http://schemas.microsoft.com/office/word/2020/wordml/sdtdatahash" xmlns:w16sdtfl="http://schemas.microsoft.com/office/word/2024/wordml/sdtformatlock" xmlns:w16se="http://schemas.microsoft.com/office/word/2015/wordml/symex" xmlns:wpg="http://schemas.microsoft.com/office/word/2010/wordprocessingGroup" xmlns:wpi="http://schemas.microsoft.com/office/word/2010/wordprocessingInk" xmlns:wne="http://schemas.microsoft.com/office/word/2006/wordml" xmlns:wps="http://schemas.microsoft.com/office/word/2010/wordprocessingShape" mc:Ignorable="w14 w15 w16se w16cid w16 w16cex w16sdtdh w16sdtfl w16du wp14">
-  <w:comment w:id="1" w:author="Laura Facenda Estrella" w:date="2026-05-31T21:36:00Z" w:initials="LF">
+  <w:comment w:id="2" w:author="Laura Facenda Estrella" w:date="2026-05-31T21:36:00Z" w:initials="LF">
     <w:p>
       <w:pPr>
         <w:pStyle w:val="Textocomentario"/>
@@ -2094,7 +2275,7 @@
       </w:r>
     </w:p>
   </w:comment>
-  <w:comment w:id="2" w:author="Laura Facenda Estrella" w:date="2026-06-03T10:56:00Z" w:initials="LF">
+  <w:comment w:id="3" w:author="Laura Facenda Estrella" w:date="2026-06-03T10:56:00Z" w:initials="LF">
     <w:p>
       <w:pPr>
         <w:pStyle w:val="Textocomentario"/>
@@ -2110,7 +2291,7 @@
       </w:r>
     </w:p>
   </w:comment>
-  <w:comment w:id="3" w:author="Laura Facenda Estrella" w:date="2026-05-31T22:07:00Z" w:initials="LF">
+  <w:comment w:id="4" w:author="Laura Facenda Estrella" w:date="2026-05-31T22:07:00Z" w:initials="LF">
     <w:p>
       <w:pPr>
         <w:pStyle w:val="Textocomentario"/>
@@ -2126,7 +2307,7 @@
       </w:r>
     </w:p>
   </w:comment>
-  <w:comment w:id="4" w:author="Laura Facenda Estrella" w:date="2026-07-14T17:20:00Z" w:initials="LF">
+  <w:comment w:id="5" w:author="Laura Facenda Estrella" w:date="2026-07-14T17:20:00Z" w:initials="LF">
     <w:p>
       <w:pPr>
         <w:pStyle w:val="Textocomentario"/>
@@ -2142,7 +2323,23 @@
       </w:r>
     </w:p>
   </w:comment>
-  <w:comment w:id="5" w:author="Laura Facenda Estrella" w:date="2026-07-31T11:56:00Z" w:initials="LF">
+  <w:comment w:id="1" w:author="Laura Facenda Estrella" w:date="2026-08-08T02:26:00Z" w:initials="LF">
+    <w:p>
+      <w:pPr>
+        <w:pStyle w:val="Textocomentario"/>
+      </w:pPr>
+      <w:r>
+        <w:rPr>
+          <w:rStyle w:val="Refdecomentario"/>
+        </w:rPr>
+        <w:annotationRef/>
+      </w:r>
+      <w:r>
+        <w:t>FASE 1</w:t>
+      </w:r>
+    </w:p>
+  </w:comment>
+  <w:comment w:id="6" w:author="Laura Facenda Estrella" w:date="2026-07-31T11:56:00Z" w:initials="LF">
     <w:p>
       <w:pPr>
         <w:pStyle w:val="Textocomentario"/>
@@ -2230,7 +2427,7 @@
       </w:r>
     </w:p>
   </w:comment>
-  <w:comment w:id="6" w:author="Laura Facenda Estrella" w:date="2026-08-02T01:55:00Z" w:initials="LF">
+  <w:comment w:id="7" w:author="Laura Facenda Estrella" w:date="2026-08-02T01:55:00Z" w:initials="LF">
     <w:p>
       <w:pPr>
         <w:pStyle w:val="Textocomentario"/>
@@ -2255,6 +2452,7 @@
   <w15:commentEx w15:paraId="3176FBD9" w15:done="0"/>
   <w15:commentEx w15:paraId="3CA86EA7" w15:done="0"/>
   <w15:commentEx w15:paraId="24A9C6B3" w15:paraIdParent="3CA86EA7" w15:done="0"/>
+  <w15:commentEx w15:paraId="23A1D98E" w15:done="0"/>
   <w15:commentEx w15:paraId="20388630" w15:done="0"/>
   <w15:commentEx w15:paraId="3380AC04" w15:done="0"/>
 </w15:commentsEx>
@@ -2266,6 +2464,7 @@
   <w16cex:commentExtensible w16cex:durableId="7F55FA52" w16cex:dateUtc="2026-06-03T08:56:00Z"/>
   <w16cex:commentExtensible w16cex:durableId="706A5F40" w16cex:dateUtc="2026-05-31T20:07:00Z"/>
   <w16cex:commentExtensible w16cex:durableId="77046365" w16cex:dateUtc="2026-07-14T15:20:00Z"/>
+  <w16cex:commentExtensible w16cex:durableId="3735DD74" w16cex:dateUtc="2026-08-08T00:26:00Z"/>
   <w16cex:commentExtensible w16cex:durableId="7A9E0BE7" w16cex:dateUtc="2026-07-31T09:56:00Z"/>
   <w16cex:commentExtensible w16cex:durableId="3652119D" w16cex:dateUtc="2026-08-01T23:55:00Z"/>
 </w16cex:commentsExtensible>
@@ -2277,6 +2476,7 @@
   <w16cid:commentId w16cid:paraId="3176FBD9" w16cid:durableId="7F55FA52"/>
   <w16cid:commentId w16cid:paraId="3CA86EA7" w16cid:durableId="706A5F40"/>
   <w16cid:commentId w16cid:paraId="24A9C6B3" w16cid:durableId="77046365"/>
+  <w16cid:commentId w16cid:paraId="23A1D98E" w16cid:durableId="3735DD74"/>
   <w16cid:commentId w16cid:paraId="20388630" w16cid:durableId="7A9E0BE7"/>
   <w16cid:commentId w16cid:paraId="3380AC04" w16cid:durableId="3652119D"/>
 </w16cid:commentsIds>
@@ -3257,6 +3457,34 @@
       <w:szCs w:val="20"/>
     </w:rPr>
   </w:style>
+  <w:style w:type="paragraph" w:styleId="Asuntodelcomentario">
+    <w:name w:val="annotation subject"/>
+    <w:basedOn w:val="Textocomentario"/>
+    <w:next w:val="Textocomentario"/>
+    <w:link w:val="AsuntodelcomentarioCar"/>
+    <w:uiPriority w:val="99"/>
+    <w:semiHidden/>
+    <w:unhideWhenUsed/>
+    <w:rsid w:val="005D1375"/>
+    <w:rPr>
+      <w:b/>
+      <w:bCs/>
+    </w:rPr>
+  </w:style>
+  <w:style w:type="character" w:customStyle="1" w:styleId="AsuntodelcomentarioCar">
+    <w:name w:val="Asunto del comentario Car"/>
+    <w:basedOn w:val="TextocomentarioCar"/>
+    <w:link w:val="Asuntodelcomentario"/>
+    <w:uiPriority w:val="99"/>
+    <w:semiHidden/>
+    <w:rsid w:val="005D1375"/>
+    <w:rPr>
+      <w:b/>
+      <w:bCs/>
+      <w:sz w:val="20"/>
+      <w:szCs w:val="20"/>
+    </w:rPr>
+  </w:style>
 </w:styles>
 </file>
 

</xml_diff>

<commit_message>
montar interfaces y parte de memoria
</commit_message>
<xml_diff>
--- a/GUION.docx
+++ b/GUION.docx
@@ -2301,10 +2301,6 @@
     <w:p>
       <w:pPr>
         <w:jc w:val="both"/>
-        <w:rPr>
-          <w:b/>
-          <w:bCs/>
-        </w:rPr>
       </w:pPr>
       <w:r>
         <w:rPr>
@@ -2313,6 +2309,169 @@
         </w:rPr>
         <w:t>ARLEQUINO</w:t>
       </w:r>
+      <w:r>
+        <w:rPr>
+          <w:b/>
+          <w:bCs/>
+        </w:rPr>
+        <w:t>:</w:t>
+      </w:r>
+      <w:r>
+        <w:t xml:space="preserve"> ¿Dónde estamos?</w:t>
+      </w:r>
+    </w:p>
+    <w:p>
+      <w:pPr>
+        <w:jc w:val="both"/>
+      </w:pPr>
+      <w:r>
+        <w:rPr>
+          <w:b/>
+          <w:bCs/>
+        </w:rPr>
+        <w:t>COLOMBINA:</w:t>
+      </w:r>
+      <w:r>
+        <w:t xml:space="preserve"> En algún lugar. Pregunta a estas gentes.</w:t>
+      </w:r>
+    </w:p>
+    <w:p>
+      <w:pPr>
+        <w:jc w:val="both"/>
+        <w:rPr>
+          <w:i/>
+          <w:iCs/>
+        </w:rPr>
+      </w:pPr>
+      <w:r>
+        <w:rPr>
+          <w:i/>
+          <w:iCs/>
+        </w:rPr>
+        <w:t>Dottore se acerca al bufón</w:t>
+      </w:r>
+    </w:p>
+    <w:p>
+      <w:pPr>
+        <w:jc w:val="both"/>
+      </w:pPr>
+      <w:r>
+        <w:rPr>
+          <w:b/>
+          <w:bCs/>
+        </w:rPr>
+        <w:t>DOTTORE:</w:t>
+      </w:r>
+      <w:r>
+        <w:rPr>
+          <w:b/>
+          <w:bCs/>
+          <w:i/>
+          <w:iCs/>
+        </w:rPr>
+        <w:t xml:space="preserve"> </w:t>
+      </w:r>
+      <w:r>
+        <w:t>¿Y dónde dices que estamos? ¿Y qué se supone que celebran?</w:t>
+      </w:r>
+    </w:p>
+    <w:p>
+      <w:pPr>
+        <w:jc w:val="both"/>
+      </w:pPr>
+      <w:r>
+        <w:rPr>
+          <w:b/>
+          <w:bCs/>
+        </w:rPr>
+        <w:t>BENJAMÍN:</w:t>
+      </w:r>
+      <w:r>
+        <w:t xml:space="preserve"> En Medina del Campo frente al Palacio Real de sus Majestades nos encontramos y respecto a la celebración… Pensé que ustedes sabrían algo, al fin y al cabo sois los que llegasteis pegando voces.</w:t>
+      </w:r>
+    </w:p>
+    <w:p>
+      <w:pPr>
+        <w:jc w:val="both"/>
+      </w:pPr>
+      <w:r>
+        <w:rPr>
+          <w:b/>
+          <w:bCs/>
+        </w:rPr>
+        <w:t>ARLEQUINO:</w:t>
+      </w:r>
+      <w:r>
+        <w:t xml:space="preserve"> ¡Benjamín! ¡Viejo pupilo! ¿Cómo has estado? ¿En qué líos te metes ahora?</w:t>
+      </w:r>
+    </w:p>
+    <w:p>
+      <w:pPr>
+        <w:jc w:val="both"/>
+      </w:pPr>
+      <w:r>
+        <w:rPr>
+          <w:b/>
+          <w:bCs/>
+        </w:rPr>
+        <w:t>BENJAMÍN:</w:t>
+      </w:r>
+      <w:r>
+        <w:t xml:space="preserve"> Mi maestro, cuánto tiempo sin verle, ya veo que ha estado muy ocupado. Pues verá, resulta que la Infanta quedó tan encandilada con el dichoso collar que sus padres me hicieron llamar a la corte para servirles.</w:t>
+      </w:r>
+    </w:p>
+    <w:p>
+      <w:pPr>
+        <w:jc w:val="both"/>
+      </w:pPr>
+      <w:r>
+        <w:rPr>
+          <w:b/>
+          <w:bCs/>
+        </w:rPr>
+        <w:t>COLOMBINA:</w:t>
+      </w:r>
+      <w:r>
+        <w:t xml:space="preserve"> ¿Y qué se supone que pasa? ¿No estarán esperando a los cómicos de Alburquerque?</w:t>
+      </w:r>
+    </w:p>
+    <w:p>
+      <w:pPr>
+        <w:jc w:val="both"/>
+      </w:pPr>
+      <w:r>
+        <w:rPr>
+          <w:b/>
+          <w:bCs/>
+        </w:rPr>
+        <w:t>BENJAMÍN:</w:t>
+      </w:r>
+      <w:r>
+        <w:t xml:space="preserve"> No sé de qué cómicos me habláis, mas lo que aquí ocurre es un sinfín de mensajeros que no hacen más que intercambiar mensajes con Córdoba y Portugal y ya no sé si hay boda, si hay entierro o si es al moro al que vamos a cristianar. </w:t>
+      </w:r>
+      <w:r>
+        <w:t>¿Y vosotros, qué hacéis aquí?</w:t>
+      </w:r>
+    </w:p>
+    <w:p>
+      <w:pPr>
+        <w:jc w:val="both"/>
+      </w:pPr>
+      <w:r>
+        <w:rPr>
+          <w:b/>
+          <w:bCs/>
+        </w:rPr>
+        <w:t>ARLEQUINO:</w:t>
+      </w:r>
+      <w:r>
+        <w:t xml:space="preserve"> Ha llegado a mis oídos, que en aqueste lugar, Medina del Campo, se están tratando ciertas capitulaciones, y que el rey portugués algo quiere obtener, mas será después de nuestra función que te ayudaremos en tu misión.</w:t>
+      </w:r>
+    </w:p>
+    <w:p>
+      <w:pPr>
+        <w:jc w:val="both"/>
+      </w:pPr>
     </w:p>
     <w:p>
       <w:pPr>

</xml_diff>

<commit_message>
musica cap 1, fin cap 1, comienzo 2
</commit_message>
<xml_diff>
--- a/GUION.docx
+++ b/GUION.docx
@@ -4653,6 +4653,7 @@
         <w:jc w:val="both"/>
       </w:pPr>
       <w:commentRangeStart w:id="20"/>
+      <w:commentRangeStart w:id="21"/>
       <w:r>
         <w:t xml:space="preserve">Falso converso </w:t>
       </w:r>
@@ -4671,6 +4672,15 @@
         </w:rPr>
         <w:commentReference w:id="20"/>
       </w:r>
+      <w:commentRangeEnd w:id="21"/>
+      <w:r>
+        <w:rPr>
+          <w:rStyle w:val="Refdecomentario"/>
+          <w:sz w:val="24"/>
+          <w:szCs w:val="24"/>
+        </w:rPr>
+        <w:commentReference w:id="21"/>
+      </w:r>
     </w:p>
     <w:p>
       <w:pPr>
@@ -4701,16 +4711,1842 @@
     </w:p>
     <w:p>
       <w:pPr>
+        <w:jc w:val="both"/>
+      </w:pPr>
+    </w:p>
+    <w:p>
+      <w:pPr>
+        <w:jc w:val="both"/>
+      </w:pPr>
+    </w:p>
+    <w:p>
+      <w:pPr>
+        <w:jc w:val="both"/>
+      </w:pPr>
+      <w:r>
+        <w:rPr>
+          <w:b/>
+          <w:bCs/>
+        </w:rPr>
+        <w:t>GINÉS:</w:t>
+      </w:r>
+      <w:r>
+        <w:rPr>
+          <w:b/>
+          <w:bCs/>
+        </w:rPr>
+        <w:t xml:space="preserve"> </w:t>
+      </w:r>
+      <w:r>
+        <w:t xml:space="preserve">Pero no se equivoquen, que había otro pueblo que habitaba desde antiguo y a su libre albedrío. </w:t>
+      </w:r>
+    </w:p>
+    <w:p>
+      <w:pPr>
+        <w:jc w:val="both"/>
+      </w:pPr>
+      <w:r>
+        <w:t>Guadalupe es el nombre de esta tierra lejana, entre montes escondida y por peregrinos frecuentada.</w:t>
+      </w:r>
+    </w:p>
+    <w:p>
+      <w:pPr>
+        <w:jc w:val="both"/>
+      </w:pPr>
+      <w:r>
+        <w:t>Ya están todos oyendo que el destino caprichoso a veces aprieta, pero no ahoga… aunque no a todos traten de igual modo.</w:t>
+      </w:r>
+    </w:p>
+    <w:p>
+      <w:pPr>
+        <w:jc w:val="both"/>
+      </w:pPr>
+      <w:r>
+        <w:t>Pues por villas y caminos una sombra se levantaba, y bajo el nombre de la fe la Inquisición vigilaba.</w:t>
+      </w:r>
+    </w:p>
+    <w:p>
+      <w:pPr>
+        <w:jc w:val="both"/>
+      </w:pPr>
+      <w:r>
+        <w:t>Preguntaba por costumbres, por palabras y miradas, y hasta el silencio más pequeño podía despertar sospechas calladas.</w:t>
+      </w:r>
+    </w:p>
+    <w:p>
+      <w:pPr>
+        <w:jc w:val="both"/>
+      </w:pPr>
+      <w:r>
+        <w:t>Mas nuestra historia prosigue, que otra empresa nos aguarda: en Guadalupe se preparan los pasos de una boda anunciada.</w:t>
+      </w:r>
+    </w:p>
+    <w:p>
+      <w:pPr>
+        <w:jc w:val="both"/>
+      </w:pPr>
+    </w:p>
+    <w:p>
+      <w:pPr>
+        <w:jc w:val="both"/>
+      </w:pPr>
+      <w:r>
+        <w:rPr>
+          <w:i/>
+          <w:iCs/>
+        </w:rPr>
+        <w:t>Fundido a negro</w:t>
+      </w:r>
+    </w:p>
+    <w:p>
+      <w:pPr>
+        <w:jc w:val="both"/>
+      </w:pPr>
+      <w:r>
+        <w:rPr>
+          <w:i/>
+          <w:iCs/>
+        </w:rPr>
+        <w:t>Bufón caminando</w:t>
+      </w:r>
+    </w:p>
+    <w:p>
+      <w:pPr>
+        <w:jc w:val="both"/>
+      </w:pPr>
+      <w:r>
+        <w:rPr>
+          <w:b/>
+          <w:bCs/>
+        </w:rPr>
+        <w:lastRenderedPageBreak/>
+        <w:t>BUFÓN:</w:t>
+      </w:r>
+      <w:r>
+        <w:t xml:space="preserve"> Que trajín el que me traigo, que si voy y que si </w:t>
+      </w:r>
+      <w:r>
+        <w:t>vuelvo</w:t>
+      </w:r>
+      <w:r>
+        <w:t xml:space="preserve">, que ya no saben los pies si flotan, o van andando. Y esto es el colmo señores, pues estos de la realeza que sólo mandan y ordenan, mi labor no es revisar si esto está bien o mal, o si con cintas, o especias me tengo que hacer. Y </w:t>
+      </w:r>
+      <w:r>
+        <w:t xml:space="preserve">por </w:t>
+      </w:r>
+      <w:r>
+        <w:t>si no fuera poco hasta la música tengo que revisar. Que para eso tienen criados y yo soy bufón real.</w:t>
+      </w:r>
+    </w:p>
+    <w:p>
+      <w:pPr>
+        <w:jc w:val="both"/>
+        <w:rPr>
+          <w:i/>
+          <w:iCs/>
+        </w:rPr>
+      </w:pPr>
+      <w:r>
+        <w:rPr>
+          <w:i/>
+          <w:iCs/>
+        </w:rPr>
+        <w:t>Camina hasta la horca</w:t>
+      </w:r>
+    </w:p>
+    <w:p>
+      <w:pPr>
+        <w:jc w:val="both"/>
+      </w:pPr>
+      <w:r>
+        <w:rPr>
+          <w:b/>
+          <w:bCs/>
+        </w:rPr>
+        <w:t>BUFÓN:</w:t>
+      </w:r>
+      <w:r>
+        <w:t xml:space="preserve"> ¡Dejad mercados, cántaros y cotilleos para después! ¡Traigo noticias de boda! La infanta Isabel y el rey Manuel de Portugal han de casarse.</w:t>
+      </w:r>
+    </w:p>
+    <w:p>
+      <w:pPr>
+        <w:jc w:val="both"/>
+      </w:pPr>
+      <w:r>
+        <w:rPr>
+          <w:b/>
+          <w:bCs/>
+        </w:rPr>
+        <w:t xml:space="preserve">INQUISIDOR: </w:t>
+      </w:r>
+      <w:r>
+        <w:t>Pero, ¿qué haces bobo? ¿No estás viendo que una ejecución vamos a realizar?</w:t>
+      </w:r>
+    </w:p>
+    <w:p>
+      <w:pPr>
+        <w:jc w:val="both"/>
+      </w:pPr>
+      <w:r>
+        <w:rPr>
+          <w:b/>
+          <w:bCs/>
+        </w:rPr>
+        <w:t>BUFÓN:</w:t>
+      </w:r>
+      <w:r>
+        <w:t xml:space="preserve"> ¿</w:t>
+      </w:r>
+      <w:r>
+        <w:t>Y por eso es</w:t>
+      </w:r>
+      <w:r>
+        <w:t xml:space="preserve"> este barullo? Gritos, llantos y pedradas. ¿A qué viene esta algarada? ¿Qué hacen esas humildes personas allí colgadas?</w:t>
+      </w:r>
+    </w:p>
+    <w:p>
+      <w:pPr>
+        <w:jc w:val="both"/>
+      </w:pPr>
+      <w:r>
+        <w:rPr>
+          <w:b/>
+          <w:bCs/>
+        </w:rPr>
+        <w:t>INQUISIDOR:</w:t>
+      </w:r>
+      <w:r>
+        <w:t xml:space="preserve"> Humildes dice, se trata de tres reos con distintos cargos, cada cual peor que el anterior y por ello merecen morir.</w:t>
+      </w:r>
+    </w:p>
+    <w:p>
+      <w:pPr>
+        <w:jc w:val="both"/>
+      </w:pPr>
+      <w:r>
+        <w:t>Al primero lo cazaron robando, el muy bribón, una bolsa llena de monedas y joyas de su amo.</w:t>
+      </w:r>
+    </w:p>
+    <w:p>
+      <w:pPr>
+        <w:jc w:val="both"/>
+      </w:pPr>
+      <w:r>
+        <w:t>La segunda por bruja debió de haber ardido hace meses. La hechicería corre por sus venas y se atrevió a usar al gato de un vecino en uno de sus rituales.</w:t>
+      </w:r>
+    </w:p>
+    <w:p>
+      <w:pPr>
+        <w:jc w:val="both"/>
+      </w:pPr>
+      <w:r>
+        <w:t>El último es el peor de todos, finge abrazar</w:t>
+      </w:r>
+      <w:r>
+        <w:t xml:space="preserve"> la fe </w:t>
+      </w:r>
+      <w:r>
+        <w:t>cristiana,</w:t>
+      </w:r>
+      <w:r>
+        <w:t xml:space="preserve"> pero se le vio cambiando </w:t>
+      </w:r>
+      <w:r>
+        <w:t xml:space="preserve">sus sábanas </w:t>
+      </w:r>
+      <w:r>
+        <w:t>y aseándose el pasado viernes sin razón alguna por lo que sigue rezando al dios judío.</w:t>
+      </w:r>
+    </w:p>
+    <w:p>
+      <w:pPr>
+        <w:jc w:val="both"/>
+      </w:pPr>
+      <w:r>
+        <w:t>Como puede ver de inocente no tienen nada y han de morir al final del día.</w:t>
+      </w:r>
+    </w:p>
+    <w:p>
+      <w:pPr>
+        <w:jc w:val="both"/>
+      </w:pPr>
+      <w:r>
+        <w:rPr>
+          <w:b/>
+          <w:bCs/>
+        </w:rPr>
+        <w:t>BUFÓN:</w:t>
+      </w:r>
+      <w:r>
+        <w:t xml:space="preserve"> Pero ¿no hay forma de salvarles? ¿Y si demuestro su inocencia?</w:t>
+      </w:r>
+    </w:p>
+    <w:p>
+      <w:pPr>
+        <w:jc w:val="both"/>
+      </w:pPr>
+      <w:r>
+        <w:rPr>
+          <w:b/>
+          <w:bCs/>
+        </w:rPr>
+        <w:t>INQUISIDOR:</w:t>
+      </w:r>
+      <w:r>
+        <w:t xml:space="preserve"> De ser capaz de ello prometo soltarles, pero necesito pruebas de su inocencia.</w:t>
+      </w:r>
+    </w:p>
+    <w:p>
+      <w:pPr>
+        <w:jc w:val="both"/>
+        <w:rPr>
+          <w:i/>
+          <w:iCs/>
+        </w:rPr>
+      </w:pPr>
+      <w:r>
+        <w:rPr>
+          <w:i/>
+          <w:iCs/>
+        </w:rPr>
+        <w:t xml:space="preserve">Cambio de fase a Investigate </w:t>
+      </w:r>
+      <w:r>
+        <w:rPr>
+          <w:i/>
+          <w:iCs/>
+        </w:rPr>
+        <w:sym w:font="Wingdings" w:char="F0E0"/>
+      </w:r>
+      <w:r>
+        <w:rPr>
+          <w:i/>
+          <w:iCs/>
+        </w:rPr>
+        <w:t xml:space="preserve"> se desbloquean los diálogos con cada uno de los presos</w:t>
+      </w:r>
+    </w:p>
+    <w:p>
+      <w:pPr>
+        <w:jc w:val="both"/>
+      </w:pPr>
+      <w:r>
+        <w:rPr>
+          <w:b/>
+          <w:bCs/>
+        </w:rPr>
+        <w:t>LADRÓN:</w:t>
+      </w:r>
+      <w:r>
+        <w:t xml:space="preserve"> Señor, de la bolsa no fui yo, la pondrían en algún lugar y me acusan a mí, pero juro por mi vida que no he sido yo quien lo hizo.</w:t>
+      </w:r>
+      <w:r>
+        <w:t xml:space="preserve"> Pregunte al pueblo, a los niños, nunca robé nada, siempre fui un siervo honrado.</w:t>
+      </w:r>
+    </w:p>
+    <w:p>
+      <w:pPr>
+        <w:jc w:val="both"/>
+      </w:pPr>
+      <w:r>
+        <w:rPr>
+          <w:b/>
+          <w:bCs/>
+        </w:rPr>
+        <w:t>BRUJA:</w:t>
+      </w:r>
+      <w:r>
+        <w:t xml:space="preserve"> Me acusan de ser bruja, pero se equivocan. Tan solo buscaba los ingredientes de un viejo remedio para sanar a mi hijo que está enfermo de tos. Del gato qué voy a saber yo, si todo el barrio sabe lo mucho que le gusta esconderse, andará en el lugar menos esperado. ¡Por Dios, no quiero morir!</w:t>
+      </w:r>
+    </w:p>
+    <w:p>
+      <w:pPr>
+        <w:jc w:val="both"/>
+      </w:pPr>
+      <w:r>
+        <w:rPr>
+          <w:b/>
+          <w:bCs/>
+        </w:rPr>
+        <w:lastRenderedPageBreak/>
+        <w:t>JUDÍO:</w:t>
+      </w:r>
+      <w:r>
+        <w:t xml:space="preserve"> </w:t>
+      </w:r>
+      <w:r>
+        <w:t>Benjamín, viejo amigo. Como bien sabrás y</w:t>
+      </w:r>
+      <w:r>
+        <w:t xml:space="preserve">o no tengo salvación, </w:t>
+      </w:r>
+      <w:r>
+        <w:t xml:space="preserve">pues </w:t>
+      </w:r>
+      <w:r>
+        <w:t>realmente soy judío. Solo soy un pobre zapatero aficionado a la música que trabaja para sacar adelante a su familia. No hago daño a nadie. Mas si consiguieras salvarme de la soga le prometo que le compensaré con lo que necesite</w:t>
+      </w:r>
+      <w:r>
+        <w:t>s, sabes que siempre te ayudé cuando lo necesitaste</w:t>
+      </w:r>
+      <w:r>
+        <w:t>.</w:t>
+      </w:r>
+      <w:r>
+        <w:t xml:space="preserve"> Quizás si hablas con nuestros captores consigues algo…</w:t>
+      </w:r>
+    </w:p>
+    <w:p>
+      <w:pPr>
+        <w:jc w:val="both"/>
+        <w:rPr>
+          <w:i/>
+          <w:iCs/>
+        </w:rPr>
+      </w:pPr>
+      <w:r>
+        <w:rPr>
+          <w:i/>
+          <w:iCs/>
+        </w:rPr>
+        <w:t>Se desbloquea el espionaje de la gente</w:t>
+      </w:r>
+    </w:p>
+    <w:p>
+      <w:pPr>
+        <w:jc w:val="both"/>
+        <w:rPr>
+          <w:i/>
+          <w:iCs/>
+        </w:rPr>
+      </w:pPr>
+      <w:r>
+        <w:rPr>
+          <w:i/>
+          <w:iCs/>
+        </w:rPr>
+        <w:t>ESPIONAJE NIÑOS</w:t>
+      </w:r>
+    </w:p>
+    <w:p>
+      <w:pPr>
+        <w:jc w:val="both"/>
+        <w:rPr>
+          <w:i/>
+          <w:iCs/>
+        </w:rPr>
+      </w:pPr>
+      <w:r>
+        <w:rPr>
+          <w:i/>
+          <w:iCs/>
+        </w:rPr>
+        <w:t>Grupo QUÉ PASÓ</w:t>
+      </w:r>
+    </w:p>
+    <w:p>
+      <w:pPr>
+        <w:jc w:val="both"/>
+      </w:pPr>
+      <w:r>
+        <w:rPr>
+          <w:b/>
+          <w:bCs/>
+        </w:rPr>
+        <w:t xml:space="preserve">NIÑO 1: </w:t>
+      </w:r>
+      <w:r>
+        <w:t>¿Pero de dónde has sacado esa piedra tan brillante? ¿Se lo has robado a tu madre?</w:t>
+      </w:r>
+    </w:p>
+    <w:p>
+      <w:pPr>
+        <w:jc w:val="both"/>
+      </w:pPr>
+      <w:r>
+        <w:rPr>
+          <w:b/>
+          <w:bCs/>
+        </w:rPr>
+        <w:t>NIÑO 2:</w:t>
+      </w:r>
+      <w:r>
+        <w:t xml:space="preserve"> No, no. Hago eso y mi madre me castiga por siempre.</w:t>
+      </w:r>
+    </w:p>
+    <w:p>
+      <w:pPr>
+        <w:jc w:val="both"/>
+      </w:pPr>
+      <w:r>
+        <w:rPr>
+          <w:b/>
+          <w:bCs/>
+        </w:rPr>
+        <w:t>NIÑO 3:</w:t>
+      </w:r>
+      <w:r>
+        <w:t xml:space="preserve"> La consiguió el otro día. Un amigo suyo trajo una bolsa llena de monedas y otras cosas brillantes.</w:t>
+      </w:r>
+    </w:p>
+    <w:p>
+      <w:pPr>
+        <w:jc w:val="both"/>
+        <w:rPr>
+          <w:b/>
+          <w:bCs/>
+        </w:rPr>
+      </w:pPr>
+      <w:r>
+        <w:rPr>
+          <w:i/>
+          <w:iCs/>
+        </w:rPr>
+        <w:t>Grupo DÓNDE ESTÁ</w:t>
+      </w:r>
+    </w:p>
+    <w:p>
+      <w:pPr>
+        <w:jc w:val="both"/>
+      </w:pPr>
+      <w:r>
+        <w:rPr>
+          <w:b/>
+          <w:bCs/>
+        </w:rPr>
+        <w:t>NIÑO 1:</w:t>
+      </w:r>
+      <w:r>
+        <w:t xml:space="preserve"> ¿Te has enterado? Un amigo mío de la iglesia está repartiendo piedras brillantes, parece que tienen mucho valor.</w:t>
+      </w:r>
+    </w:p>
+    <w:p>
+      <w:pPr>
+        <w:jc w:val="both"/>
+      </w:pPr>
+      <w:r>
+        <w:rPr>
+          <w:b/>
+          <w:bCs/>
+        </w:rPr>
+        <w:t>NIÑO 2:</w:t>
+      </w:r>
+      <w:r>
+        <w:t xml:space="preserve"> ¿Pero eso dónde?</w:t>
+      </w:r>
+    </w:p>
+    <w:p>
+      <w:pPr>
+        <w:jc w:val="both"/>
+      </w:pPr>
+      <w:r>
+        <w:rPr>
+          <w:b/>
+          <w:bCs/>
+        </w:rPr>
+        <w:t>NIÑO 3:</w:t>
+      </w:r>
+      <w:r>
+        <w:t xml:space="preserve"> Allí, al lado de la fuente, </w:t>
+      </w:r>
+      <w:r>
+        <w:t>Pero date prisa, porque puede irse en cualquier momento.</w:t>
+      </w:r>
+    </w:p>
+    <w:p>
+      <w:pPr>
+        <w:jc w:val="both"/>
+      </w:pPr>
+      <w:r>
+        <w:t>Grupo QUIÉN ES</w:t>
+      </w:r>
+    </w:p>
+    <w:p>
+      <w:pPr>
+        <w:jc w:val="both"/>
+      </w:pPr>
+      <w:r>
+        <w:rPr>
+          <w:b/>
+          <w:bCs/>
+        </w:rPr>
+        <w:t>NIÑO 1:</w:t>
+      </w:r>
+      <w:r>
+        <w:t xml:space="preserve"> Pero, y ese amigo tuyo, ¿quién es? ¿Lo conozco?</w:t>
+      </w:r>
+    </w:p>
+    <w:p>
+      <w:pPr>
+        <w:jc w:val="both"/>
+      </w:pPr>
+      <w:r>
+        <w:rPr>
+          <w:b/>
+          <w:bCs/>
+        </w:rPr>
+        <w:t>NIÑO 2:</w:t>
+      </w:r>
+      <w:r>
+        <w:t xml:space="preserve"> Es hijo de un señor con mucho dinero, pero no lo aparenta, va vestido como el resto.</w:t>
+      </w:r>
+    </w:p>
+    <w:p>
+      <w:pPr>
+        <w:jc w:val="both"/>
+      </w:pPr>
+      <w:r>
+        <w:rPr>
+          <w:b/>
+          <w:bCs/>
+        </w:rPr>
+        <w:t>NIÑA 3:</w:t>
+      </w:r>
+      <w:r>
+        <w:t xml:space="preserve"> Sí bueno, yo nunca había visto un pelo tan rubio hasta conocerle.</w:t>
+      </w:r>
+    </w:p>
+    <w:p>
+      <w:pPr>
+        <w:jc w:val="both"/>
+      </w:pPr>
+      <w:r>
+        <w:rPr>
+          <w:b/>
+          <w:bCs/>
+        </w:rPr>
+        <w:t>NIÑA 4:</w:t>
+      </w:r>
+      <w:r>
+        <w:t xml:space="preserve"> Uy y sus ojos son del color del cielo.</w:t>
+      </w:r>
+    </w:p>
+    <w:p>
+      <w:pPr>
+        <w:jc w:val="both"/>
+      </w:pPr>
+      <w:r>
+        <w:rPr>
+          <w:b/>
+          <w:bCs/>
+        </w:rPr>
+        <w:t xml:space="preserve">NIÑO 2: </w:t>
+      </w:r>
+      <w:r>
+        <w:t xml:space="preserve">Ya, ya. No sé por qué le gusta la ropa verde, se </w:t>
+      </w:r>
+      <w:r>
+        <w:t>creerá</w:t>
+      </w:r>
+      <w:r>
+        <w:t xml:space="preserve"> césped o algo.</w:t>
+      </w:r>
+    </w:p>
+    <w:p>
+      <w:pPr>
+        <w:jc w:val="both"/>
+      </w:pPr>
+      <w:r>
+        <w:rPr>
+          <w:b/>
+          <w:bCs/>
+        </w:rPr>
+        <w:t>NIÑO 1:</w:t>
+      </w:r>
+      <w:r>
+        <w:t xml:space="preserve"> Pero no te metas con él, es un color muy bonito.</w:t>
+      </w:r>
+    </w:p>
+    <w:p>
+      <w:pPr>
+        <w:jc w:val="both"/>
+      </w:pPr>
+    </w:p>
+    <w:p>
+      <w:pPr>
+        <w:jc w:val="both"/>
+        <w:rPr>
+          <w:i/>
+          <w:iCs/>
+        </w:rPr>
+      </w:pPr>
+      <w:r>
+        <w:rPr>
+          <w:i/>
+          <w:iCs/>
+        </w:rPr>
+        <w:t>GRUPO DE ADULTOS</w:t>
+      </w:r>
+    </w:p>
+    <w:p>
+      <w:pPr>
+        <w:jc w:val="both"/>
+      </w:pPr>
+      <w:r>
+        <w:rPr>
+          <w:b/>
+          <w:bCs/>
+        </w:rPr>
+        <w:t>PUEBLO 1:</w:t>
+      </w:r>
+      <w:r>
+        <w:t xml:space="preserve"> Nunca hubiera esperado eso de él, siempre fue un buen hombre.</w:t>
+      </w:r>
+    </w:p>
+    <w:p>
+      <w:pPr>
+        <w:jc w:val="both"/>
+      </w:pPr>
+      <w:r>
+        <w:rPr>
+          <w:b/>
+          <w:bCs/>
+        </w:rPr>
+        <w:lastRenderedPageBreak/>
+        <w:t>PUEBLO 2:</w:t>
+      </w:r>
+      <w:r>
+        <w:t xml:space="preserve"> Yo tampoco, estuvo trabajando para mí y nunca tuve un problema con él, y mira que estaba en peores condiciones antes.</w:t>
+      </w:r>
+    </w:p>
+    <w:p>
+      <w:pPr>
+        <w:jc w:val="both"/>
+      </w:pPr>
+      <w:r>
+        <w:rPr>
+          <w:b/>
+          <w:bCs/>
+        </w:rPr>
+        <w:t>PUEBLO 3:</w:t>
+      </w:r>
+      <w:r>
+        <w:t xml:space="preserve"> Pues yo no creo que haya sido él, creo que ha sido una cosa de niños y él estaba en el lugar equivocado en el momento equivocado.</w:t>
+      </w:r>
+    </w:p>
+    <w:p>
+      <w:pPr>
+        <w:jc w:val="both"/>
+      </w:pPr>
+    </w:p>
+    <w:p>
+      <w:pPr>
+        <w:jc w:val="both"/>
+        <w:rPr>
+          <w:i/>
+          <w:iCs/>
+        </w:rPr>
+      </w:pPr>
+      <w:r>
+        <w:rPr>
+          <w:i/>
+          <w:iCs/>
+        </w:rPr>
+        <w:t>GRUPO DE NIÑOS EN EL QUE ESTÁ EL NIÑO “LADRÓN”</w:t>
+      </w:r>
+    </w:p>
+    <w:p>
+      <w:pPr>
+        <w:jc w:val="both"/>
+      </w:pPr>
+      <w:r>
+        <w:rPr>
+          <w:b/>
+          <w:bCs/>
+        </w:rPr>
+        <w:t>BUFÓN:</w:t>
+      </w:r>
+      <w:r>
+        <w:t xml:space="preserve"> Vaya, ¿qué tenéis ahí?</w:t>
+      </w:r>
+    </w:p>
+    <w:p>
+      <w:pPr>
+        <w:jc w:val="both"/>
+      </w:pPr>
+      <w:r>
+        <w:rPr>
+          <w:b/>
+          <w:bCs/>
+        </w:rPr>
+        <w:t>NIÑA:</w:t>
+      </w:r>
+      <w:r>
+        <w:t xml:space="preserve"> ¡Nuestros tesoros!</w:t>
+      </w:r>
+    </w:p>
+    <w:p>
+      <w:pPr>
+        <w:jc w:val="both"/>
+      </w:pPr>
+      <w:r>
+        <w:rPr>
+          <w:b/>
+          <w:bCs/>
+        </w:rPr>
+        <w:t>BUFÓN:</w:t>
+      </w:r>
+      <w:r>
+        <w:t xml:space="preserve"> ¿Tesoros? Esas monedas y piedras no parecen precisamente juguetes.</w:t>
+      </w:r>
+    </w:p>
+    <w:p>
+      <w:pPr>
+        <w:jc w:val="both"/>
+      </w:pPr>
+      <w:r>
+        <w:rPr>
+          <w:b/>
+          <w:bCs/>
+        </w:rPr>
+        <w:t>NIÑO:</w:t>
+      </w:r>
+      <w:r>
+        <w:t xml:space="preserve"> ¡Pero brillan!</w:t>
+      </w:r>
+    </w:p>
+    <w:p>
+      <w:pPr>
+        <w:jc w:val="both"/>
+      </w:pPr>
+      <w:r>
+        <w:rPr>
+          <w:b/>
+          <w:bCs/>
+        </w:rPr>
+        <w:t>BUFÓN:</w:t>
+      </w:r>
+      <w:r>
+        <w:t xml:space="preserve"> Y casualmente ha desaparecido una bolsa llena de cosas que brillan…</w:t>
+      </w:r>
+    </w:p>
+    <w:p>
+      <w:pPr>
+        <w:jc w:val="both"/>
+      </w:pPr>
+      <w:r>
+        <w:rPr>
+          <w:b/>
+          <w:bCs/>
+        </w:rPr>
+        <w:t>NIÑA:</w:t>
+      </w:r>
+      <w:r>
+        <w:t xml:space="preserve"> Nosotros no hemos robado nada.</w:t>
+      </w:r>
+    </w:p>
+    <w:p>
+      <w:pPr>
+        <w:jc w:val="both"/>
+      </w:pPr>
+      <w:r>
+        <w:rPr>
+          <w:b/>
+          <w:bCs/>
+        </w:rPr>
+        <w:t xml:space="preserve">BUFÓN: </w:t>
+      </w:r>
+      <w:r>
+        <w:t>Eso espero. A ver, contadme de dónde habéis sacado todo esto.</w:t>
+      </w:r>
+    </w:p>
+    <w:p>
+      <w:pPr>
+        <w:jc w:val="both"/>
+      </w:pPr>
+    </w:p>
+    <w:p>
+      <w:pPr>
+        <w:jc w:val="both"/>
+      </w:pPr>
+      <w:r>
+        <w:rPr>
+          <w:b/>
+          <w:bCs/>
+        </w:rPr>
+        <w:t>BUFÓN:</w:t>
+      </w:r>
+      <w:r>
+        <w:t xml:space="preserve"> Bonita moneda. ¿De dónde ha salido?</w:t>
+      </w:r>
+    </w:p>
+    <w:p>
+      <w:pPr>
+        <w:jc w:val="both"/>
+      </w:pPr>
+      <w:r>
+        <w:rPr>
+          <w:b/>
+          <w:bCs/>
+        </w:rPr>
+        <w:t>NIÑA:</w:t>
+      </w:r>
+      <w:r>
+        <w:t xml:space="preserve"> Me la dieron para jugar.</w:t>
+      </w:r>
+    </w:p>
+    <w:p>
+      <w:pPr>
+        <w:jc w:val="both"/>
+      </w:pPr>
+      <w:r>
+        <w:rPr>
+          <w:b/>
+          <w:bCs/>
+        </w:rPr>
+        <w:t>BUFÓN:</w:t>
+      </w:r>
+      <w:r>
+        <w:t xml:space="preserve"> Entonces no fuiste tú quien encontró la bolsa.</w:t>
+      </w:r>
+    </w:p>
+    <w:p>
+      <w:pPr>
+        <w:jc w:val="both"/>
+      </w:pPr>
+      <w:r>
+        <w:rPr>
+          <w:b/>
+          <w:bCs/>
+        </w:rPr>
+        <w:t>NIÑA:</w:t>
+      </w:r>
+      <w:r>
+        <w:t xml:space="preserve"> ¿Qué bolsa?</w:t>
+      </w:r>
+    </w:p>
+    <w:p>
+      <w:pPr>
+        <w:jc w:val="both"/>
+      </w:pPr>
+    </w:p>
+    <w:p>
+      <w:pPr>
+        <w:jc w:val="both"/>
+      </w:pPr>
+      <w:r>
+        <w:rPr>
+          <w:b/>
+          <w:bCs/>
+        </w:rPr>
+        <w:t>BUFÓN:</w:t>
+      </w:r>
+      <w:r>
+        <w:t xml:space="preserve"> ¿También tú tienes parte del tesoro?</w:t>
+      </w:r>
+    </w:p>
+    <w:p>
+      <w:pPr>
+        <w:jc w:val="both"/>
+      </w:pPr>
+      <w:r>
+        <w:rPr>
+          <w:b/>
+          <w:bCs/>
+        </w:rPr>
+        <w:t>NIÑO:</w:t>
+      </w:r>
+      <w:r>
+        <w:t xml:space="preserve"> ¡Solo esta piedra! Me la regalaron.</w:t>
+      </w:r>
+    </w:p>
+    <w:p>
+      <w:pPr>
+        <w:jc w:val="both"/>
+      </w:pPr>
+      <w:r>
+        <w:rPr>
+          <w:b/>
+          <w:bCs/>
+        </w:rPr>
+        <w:t>BUFÓN:</w:t>
+      </w:r>
+      <w:r>
+        <w:t xml:space="preserve"> ¿Quién?</w:t>
+      </w:r>
+    </w:p>
+    <w:p>
+      <w:pPr>
+        <w:jc w:val="both"/>
+      </w:pPr>
+      <w:r>
+        <w:rPr>
+          <w:b/>
+          <w:bCs/>
+        </w:rPr>
+        <w:t>NIÑO:</w:t>
+      </w:r>
+      <w:r>
+        <w:t xml:space="preserve"> Prometí que no lo diría.</w:t>
+      </w:r>
+    </w:p>
+    <w:p>
+      <w:pPr>
+        <w:jc w:val="both"/>
+      </w:pPr>
+    </w:p>
+    <w:p>
+      <w:pPr>
+        <w:jc w:val="both"/>
+      </w:pPr>
+      <w:r>
+        <w:rPr>
+          <w:b/>
+          <w:bCs/>
+        </w:rPr>
+        <w:t>BUFÓN:</w:t>
+      </w:r>
+      <w:r>
+        <w:t xml:space="preserve"> Déjame adivinar. A ti también te lo dieron.</w:t>
+      </w:r>
+    </w:p>
+    <w:p>
+      <w:pPr>
+        <w:jc w:val="both"/>
+      </w:pPr>
+      <w:r>
+        <w:rPr>
+          <w:b/>
+          <w:bCs/>
+        </w:rPr>
+        <w:t>NIÑA:</w:t>
+      </w:r>
+      <w:r>
+        <w:t xml:space="preserve"> Sí. ¡Pero yo elegí la más bonita!</w:t>
+      </w:r>
+    </w:p>
+    <w:p>
+      <w:pPr>
+        <w:jc w:val="both"/>
+      </w:pPr>
+      <w:r>
+        <w:rPr>
+          <w:b/>
+          <w:bCs/>
+        </w:rPr>
+        <w:t>BUFÓN:</w:t>
+      </w:r>
+      <w:r>
+        <w:t xml:space="preserve"> ¿Había más?</w:t>
+      </w:r>
+    </w:p>
+    <w:p>
+      <w:pPr>
+        <w:jc w:val="both"/>
+      </w:pPr>
+      <w:r>
+        <w:rPr>
+          <w:b/>
+          <w:bCs/>
+        </w:rPr>
+        <w:t>NIÑA:</w:t>
+      </w:r>
+      <w:r>
+        <w:t xml:space="preserve"> Un montón, dentro de una bolsa.</w:t>
+      </w:r>
+    </w:p>
+    <w:p>
+      <w:pPr>
+        <w:jc w:val="both"/>
+      </w:pPr>
+    </w:p>
+    <w:p>
+      <w:pPr>
+        <w:jc w:val="both"/>
+        <w:rPr>
+          <w:i/>
+          <w:iCs/>
+        </w:rPr>
+      </w:pPr>
+      <w:r>
+        <w:rPr>
+          <w:i/>
+          <w:iCs/>
+        </w:rPr>
+        <w:lastRenderedPageBreak/>
+        <w:t>CULPABLE</w:t>
+      </w:r>
+    </w:p>
+    <w:p>
+      <w:pPr>
+        <w:jc w:val="both"/>
+      </w:pPr>
+      <w:r>
+        <w:rPr>
+          <w:b/>
+          <w:bCs/>
+        </w:rPr>
+        <w:t>BUFÓN:</w:t>
+      </w:r>
+      <w:r>
+        <w:t xml:space="preserve"> Hola, pequeño. ¿Tú también tienes uno de esos tesoros?</w:t>
+      </w:r>
+    </w:p>
+    <w:p>
+      <w:pPr>
+        <w:jc w:val="both"/>
+      </w:pPr>
+      <w:r>
+        <w:rPr>
+          <w:b/>
+          <w:bCs/>
+        </w:rPr>
+        <w:t>NIÑO:</w:t>
+      </w:r>
+      <w:r>
+        <w:t xml:space="preserve"> Yo… no.</w:t>
+      </w:r>
+    </w:p>
+    <w:p>
+      <w:pPr>
+        <w:jc w:val="both"/>
+      </w:pPr>
+      <w:r>
+        <w:rPr>
+          <w:b/>
+          <w:bCs/>
+        </w:rPr>
+        <w:t>BUFÓN:</w:t>
+      </w:r>
+      <w:r>
+        <w:t xml:space="preserve"> Qué raro. Parece que todos tus amigos tienen alguno.</w:t>
+      </w:r>
+    </w:p>
+    <w:p>
+      <w:pPr>
+        <w:jc w:val="both"/>
+      </w:pPr>
+      <w:r>
+        <w:rPr>
+          <w:b/>
+          <w:bCs/>
+        </w:rPr>
+        <w:t>NIÑO:</w:t>
+      </w:r>
+      <w:r>
+        <w:t xml:space="preserve"> Pues pregúntales a ellos.</w:t>
+      </w:r>
+    </w:p>
+    <w:p>
+      <w:pPr>
+        <w:jc w:val="both"/>
+      </w:pPr>
+      <w:r>
+        <w:rPr>
+          <w:b/>
+          <w:bCs/>
+        </w:rPr>
+        <w:t>BUFÓN:</w:t>
+      </w:r>
+      <w:r>
+        <w:t xml:space="preserve"> Ya veo que hablando no voy a sacarte mucho…</w:t>
+      </w:r>
+    </w:p>
+    <w:p>
+      <w:pPr>
+        <w:jc w:val="both"/>
+      </w:pPr>
+      <w:r>
+        <w:rPr>
+          <w:b/>
+          <w:bCs/>
+        </w:rPr>
+        <w:t>NIÑO:</w:t>
+      </w:r>
+      <w:r>
+        <w:t xml:space="preserve"> Porque no tengo nada que contar…</w:t>
+      </w:r>
+    </w:p>
+    <w:p>
+      <w:pPr>
+        <w:jc w:val="both"/>
+      </w:pPr>
+      <w:r>
+        <w:rPr>
+          <w:b/>
+          <w:bCs/>
+        </w:rPr>
+        <w:t xml:space="preserve">BUFÓN: </w:t>
+      </w:r>
+      <w:r>
+        <w:t>Mmm… Quizá haya otra forma de ganarme tu confianza.</w:t>
+      </w:r>
+    </w:p>
+    <w:p>
+      <w:pPr>
+        <w:jc w:val="both"/>
+      </w:pPr>
+    </w:p>
+    <w:p>
+      <w:pPr>
+        <w:jc w:val="both"/>
+        <w:rPr>
+          <w:i/>
+          <w:iCs/>
+        </w:rPr>
+      </w:pPr>
+      <w:r>
+        <w:rPr>
+          <w:i/>
+          <w:iCs/>
+        </w:rPr>
+        <w:t>FRASE DE ENGATUS</w:t>
+      </w:r>
+      <w:r>
+        <w:rPr>
+          <w:i/>
+          <w:iCs/>
+        </w:rPr>
+        <w:t>Á</w:t>
+      </w:r>
+    </w:p>
+    <w:p>
+      <w:pPr>
+        <w:jc w:val="both"/>
+      </w:pPr>
+      <w:r>
+        <w:rPr>
+          <w:b/>
+          <w:bCs/>
+        </w:rPr>
+        <w:t>BUFÓN:</w:t>
+      </w:r>
+      <w:r>
+        <w:t xml:space="preserve"> ¿Y ahora? ¿Sabes algo?</w:t>
+      </w:r>
+    </w:p>
+    <w:p>
+      <w:pPr>
+        <w:jc w:val="both"/>
+      </w:pPr>
+      <w:r>
+        <w:rPr>
+          <w:b/>
+          <w:bCs/>
+        </w:rPr>
+        <w:t>NIÑO:</w:t>
+      </w:r>
+      <w:r>
+        <w:t xml:space="preserve"> Lo confieso, fui yo, cogí esa bolsa pero porque pensé que era un nuevo juguete para mí.</w:t>
+      </w:r>
+    </w:p>
+    <w:p>
+      <w:pPr>
+        <w:jc w:val="both"/>
+      </w:pPr>
+      <w:r>
+        <w:rPr>
+          <w:b/>
+          <w:bCs/>
+        </w:rPr>
+        <w:t>BUFÓN:</w:t>
+      </w:r>
+      <w:r>
+        <w:t xml:space="preserve"> Pues esta pequeña travesura ha puesto en peligro la vida de vuestro criado.</w:t>
+      </w:r>
+    </w:p>
+    <w:p>
+      <w:pPr>
+        <w:jc w:val="both"/>
+      </w:pPr>
+      <w:r>
+        <w:rPr>
+          <w:b/>
+          <w:bCs/>
+        </w:rPr>
+        <w:t>NIÑO:</w:t>
+      </w:r>
+      <w:r>
+        <w:t xml:space="preserve"> ¿Qué tengo que hacer para salvarle?</w:t>
+      </w:r>
+    </w:p>
+    <w:p>
+      <w:pPr>
+        <w:jc w:val="both"/>
+      </w:pPr>
+      <w:r>
+        <w:rPr>
+          <w:b/>
+          <w:bCs/>
+        </w:rPr>
+        <w:t>BUFÓN:</w:t>
+      </w:r>
+      <w:r>
+        <w:t xml:space="preserve"> Dame lo que queda de esa bolsa y me encargaré de que lo liberen.</w:t>
+      </w:r>
+    </w:p>
+    <w:p>
+      <w:pPr>
+        <w:jc w:val="both"/>
+      </w:pPr>
+      <w:r>
+        <w:rPr>
+          <w:b/>
+          <w:bCs/>
+        </w:rPr>
+        <w:t>NIÑO:</w:t>
+      </w:r>
+      <w:r>
+        <w:t xml:space="preserve"> Toma.</w:t>
+      </w:r>
+    </w:p>
+    <w:p>
+      <w:pPr>
+        <w:jc w:val="both"/>
+      </w:pPr>
+    </w:p>
+    <w:p>
+      <w:pPr>
+        <w:jc w:val="both"/>
+        <w:rPr>
+          <w:i/>
+          <w:iCs/>
+        </w:rPr>
+      </w:pPr>
+      <w:r>
+        <w:rPr>
+          <w:i/>
+          <w:iCs/>
+        </w:rPr>
+        <w:t>GATA</w:t>
+      </w:r>
+    </w:p>
+    <w:p>
+      <w:pPr>
+        <w:jc w:val="both"/>
+      </w:pPr>
+      <w:r>
+        <w:rPr>
+          <w:b/>
+          <w:bCs/>
+        </w:rPr>
+        <w:t>BUFÓN:</w:t>
+      </w:r>
+      <w:r>
+        <w:t xml:space="preserve"> Creo que veo algo…</w:t>
+      </w:r>
+    </w:p>
+    <w:p>
+      <w:pPr>
+        <w:jc w:val="both"/>
+      </w:pPr>
+      <w:r>
+        <w:t>¡Oh no! Se me ha escapado.</w:t>
+      </w:r>
+      <w:r>
+        <w:t xml:space="preserve"> ¿A dónde habrá ido?</w:t>
+      </w:r>
+    </w:p>
+    <w:p>
+      <w:pPr>
+        <w:jc w:val="both"/>
+      </w:pPr>
+    </w:p>
+    <w:p>
+      <w:pPr>
+        <w:jc w:val="both"/>
+      </w:pPr>
+      <w:r>
+        <w:rPr>
+          <w:b/>
+          <w:bCs/>
+        </w:rPr>
+        <w:t>BUFÓN:</w:t>
+      </w:r>
+      <w:r>
+        <w:t xml:space="preserve"> ¿Puede ser que no esté solo?</w:t>
+      </w:r>
+    </w:p>
+    <w:p>
+      <w:pPr>
+        <w:jc w:val="both"/>
+      </w:pPr>
+      <w:r>
+        <w:t>Pardiez, se me volvió a escapar.</w:t>
+      </w:r>
+      <w:r>
+        <w:t xml:space="preserve"> ¿Dónde estará esta vez?</w:t>
+      </w:r>
+    </w:p>
+    <w:p>
+      <w:pPr>
+        <w:jc w:val="both"/>
+      </w:pPr>
+    </w:p>
+    <w:p>
+      <w:pPr>
+        <w:jc w:val="both"/>
+      </w:pPr>
+      <w:r>
+        <w:rPr>
+          <w:b/>
+          <w:bCs/>
+        </w:rPr>
+        <w:t>BUFÓN:</w:t>
+      </w:r>
+      <w:r>
+        <w:t xml:space="preserve"> Las otras veces no tuve mucha suerte, esta vez tendré que convencerle de que se quede quieto.</w:t>
+      </w:r>
+    </w:p>
+    <w:p>
+      <w:pPr>
+        <w:jc w:val="both"/>
+      </w:pPr>
+    </w:p>
+    <w:p>
+      <w:pPr>
+        <w:jc w:val="both"/>
+        <w:rPr>
+          <w:i/>
+          <w:iCs/>
+        </w:rPr>
+      </w:pPr>
+      <w:r>
+        <w:rPr>
+          <w:i/>
+          <w:iCs/>
+        </w:rPr>
+        <w:t>Conseguir engatusar</w:t>
+      </w:r>
+    </w:p>
+    <w:p>
+      <w:pPr>
+        <w:jc w:val="both"/>
+      </w:pPr>
+      <w:r>
+        <w:rPr>
+          <w:b/>
+          <w:bCs/>
+        </w:rPr>
+        <w:lastRenderedPageBreak/>
+        <w:t>BUFÓN:</w:t>
+      </w:r>
+      <w:r>
+        <w:t xml:space="preserve"> ¡Anda! ¡Pero si es una gata! Estaba buscando un sitio donde tener a sus crías.</w:t>
+      </w:r>
+    </w:p>
+    <w:p>
+      <w:pPr>
+        <w:jc w:val="both"/>
+        <w:rPr>
+          <w:i/>
+          <w:iCs/>
+        </w:rPr>
+      </w:pPr>
+      <w:r>
+        <w:rPr>
+          <w:i/>
+          <w:iCs/>
+        </w:rPr>
+        <w:t>Añadir a inventario</w:t>
+      </w:r>
+    </w:p>
+    <w:p>
+      <w:pPr>
+        <w:jc w:val="both"/>
+        <w:rPr>
+          <w:i/>
+          <w:iCs/>
+        </w:rPr>
+      </w:pPr>
+    </w:p>
+    <w:p>
+      <w:pPr>
+        <w:jc w:val="both"/>
+        <w:rPr>
+          <w:i/>
+          <w:iCs/>
+        </w:rPr>
+      </w:pPr>
+      <w:r>
+        <w:rPr>
+          <w:i/>
+          <w:iCs/>
+        </w:rPr>
+        <w:t>JUDÍO</w:t>
+      </w:r>
+    </w:p>
+    <w:p>
+      <w:pPr>
+        <w:jc w:val="both"/>
+        <w:rPr>
+          <w:i/>
+          <w:iCs/>
+        </w:rPr>
+      </w:pPr>
+      <w:r>
+        <w:rPr>
+          <w:i/>
+          <w:iCs/>
+        </w:rPr>
+        <w:t>Cosas junto al inquisidor</w:t>
+      </w:r>
+    </w:p>
+    <w:p>
+      <w:pPr>
+        <w:jc w:val="both"/>
+      </w:pPr>
+      <w:r>
+        <w:rPr>
+          <w:b/>
+          <w:bCs/>
+        </w:rPr>
+        <w:t>BUFÓN:</w:t>
+      </w:r>
+      <w:r>
+        <w:t xml:space="preserve"> Ese hombre es amigo mío e inocente de todo lo que le acusan. Déjele marchar.</w:t>
+      </w:r>
+    </w:p>
+    <w:p>
+      <w:pPr>
+        <w:jc w:val="both"/>
+      </w:pPr>
+      <w:r>
+        <w:rPr>
+          <w:b/>
+          <w:bCs/>
+        </w:rPr>
+        <w:t>INQUISIDOR:</w:t>
+      </w:r>
+      <w:r>
+        <w:t xml:space="preserve"> Ni hablar. Hay una acusación contra él.</w:t>
+      </w:r>
+    </w:p>
+    <w:p>
+      <w:pPr>
+        <w:jc w:val="both"/>
+      </w:pPr>
+      <w:r>
+        <w:rPr>
+          <w:b/>
+          <w:bCs/>
+        </w:rPr>
+        <w:t>BUFÓN:</w:t>
+      </w:r>
+      <w:r>
+        <w:t xml:space="preserve"> ¿Y sus cosas?</w:t>
+      </w:r>
+    </w:p>
+    <w:p>
+      <w:pPr>
+        <w:jc w:val="both"/>
+      </w:pPr>
+      <w:r>
+        <w:rPr>
+          <w:b/>
+          <w:bCs/>
+        </w:rPr>
+        <w:t>INQUISIDOR:</w:t>
+      </w:r>
+      <w:r>
+        <w:t xml:space="preserve"> Requisadas. Hasta que se decida qué hacer con él</w:t>
+      </w:r>
+    </w:p>
+    <w:p>
+      <w:pPr>
+        <w:jc w:val="both"/>
+        <w:rPr>
+          <w:i/>
+          <w:iCs/>
+        </w:rPr>
+      </w:pPr>
+      <w:r>
+        <w:rPr>
+          <w:i/>
+          <w:iCs/>
+        </w:rPr>
+        <w:t xml:space="preserve">Puesto del zapatero </w:t>
+      </w:r>
+      <w:r>
+        <w:rPr>
+          <w:i/>
+          <w:iCs/>
+        </w:rPr>
+        <w:sym w:font="Wingdings" w:char="F0E0"/>
+      </w:r>
+      <w:r>
+        <w:rPr>
+          <w:i/>
+          <w:iCs/>
+        </w:rPr>
+        <w:t xml:space="preserve"> Interactuar</w:t>
+      </w:r>
+    </w:p>
+    <w:p>
+      <w:pPr>
+        <w:jc w:val="both"/>
+      </w:pPr>
+      <w:r>
+        <w:rPr>
+          <w:b/>
+          <w:bCs/>
+        </w:rPr>
+        <w:t xml:space="preserve">BUFÓN: </w:t>
+      </w:r>
+      <w:r>
+        <w:t>Tintes, betunes, pigmentos… El oficio de zapatero deja manchas difíciles de esconder</w:t>
+      </w:r>
+    </w:p>
+    <w:p>
+      <w:pPr>
+        <w:jc w:val="both"/>
+        <w:rPr>
+          <w:i/>
+          <w:iCs/>
+        </w:rPr>
+      </w:pPr>
+      <w:r>
+        <w:rPr>
+          <w:i/>
+          <w:iCs/>
+        </w:rPr>
+        <w:t>Sábanas limpias</w:t>
+      </w:r>
+    </w:p>
+    <w:p>
+      <w:pPr>
+        <w:jc w:val="both"/>
+      </w:pPr>
+      <w:r>
+        <w:rPr>
+          <w:b/>
+          <w:bCs/>
+        </w:rPr>
+        <w:t>BUFÓN:</w:t>
+      </w:r>
+      <w:r>
+        <w:t xml:space="preserve"> Unas sábanas, justo lo que mencionaban en la acusación… Quizás me venga bien cogerla</w:t>
+      </w:r>
+    </w:p>
+    <w:p>
+      <w:pPr>
+        <w:jc w:val="both"/>
+        <w:rPr>
+          <w:i/>
+          <w:iCs/>
+        </w:rPr>
+      </w:pPr>
+      <w:r>
+        <w:rPr>
+          <w:i/>
+          <w:iCs/>
+        </w:rPr>
+        <w:t>Engatusar al soldado</w:t>
+      </w:r>
+    </w:p>
+    <w:p>
+      <w:pPr>
+        <w:jc w:val="both"/>
+      </w:pPr>
+      <w:r>
+        <w:rPr>
+          <w:b/>
+          <w:bCs/>
+        </w:rPr>
+        <w:t>BUFÓN:</w:t>
+      </w:r>
+      <w:r>
+        <w:t xml:space="preserve"> Tinte de zapatero… Y todavía mancha. Interesante</w:t>
+      </w:r>
+    </w:p>
+    <w:p>
+      <w:pPr>
+        <w:jc w:val="both"/>
+        <w:rPr>
+          <w:i/>
+          <w:iCs/>
+        </w:rPr>
+      </w:pPr>
+      <w:r>
+        <w:rPr>
+          <w:i/>
+          <w:iCs/>
+        </w:rPr>
+        <w:t xml:space="preserve">Al conseguir las dos cosas </w:t>
+      </w:r>
+      <w:r>
+        <w:rPr>
+          <w:i/>
+          <w:iCs/>
+        </w:rPr>
+        <w:sym w:font="Wingdings" w:char="F0E0"/>
+      </w:r>
+      <w:r>
+        <w:rPr>
+          <w:i/>
+          <w:iCs/>
+        </w:rPr>
+        <w:t xml:space="preserve"> pop up</w:t>
+      </w:r>
+    </w:p>
+    <w:p>
+      <w:pPr>
+        <w:jc w:val="both"/>
+      </w:pPr>
+      <w:r>
+        <w:rPr>
+          <w:b/>
+          <w:bCs/>
+        </w:rPr>
+        <w:t>BUFÓN:</w:t>
+      </w:r>
+      <w:r>
+        <w:t xml:space="preserve"> Oh no, he manchado</w:t>
+      </w:r>
+      <w:r>
+        <w:t xml:space="preserve"> las sábanas con el tinte, aunque claro, estando así… Cualquiera las hubiera cambiado, independientemente del día.</w:t>
+      </w:r>
+    </w:p>
+    <w:p>
+      <w:pPr>
+        <w:jc w:val="both"/>
+      </w:pPr>
+    </w:p>
+    <w:p>
+      <w:pPr>
+        <w:jc w:val="both"/>
+        <w:rPr>
+          <w:i/>
+          <w:iCs/>
+        </w:rPr>
+      </w:pPr>
+      <w:r>
+        <w:rPr>
+          <w:i/>
+          <w:iCs/>
+        </w:rPr>
+        <w:t>CUANDO TIENE TODAS LAS PRUEBAS</w:t>
+      </w:r>
+    </w:p>
+    <w:p>
+      <w:r>
+        <w:rPr>
+          <w:b/>
+          <w:bCs/>
+        </w:rPr>
+        <w:t>BUFÓN:</w:t>
+      </w:r>
+      <w:r>
+        <w:t xml:space="preserve"> Libera a los 3. Tengo todas las pruebas que necesitas.</w:t>
+      </w:r>
+    </w:p>
+    <w:p>
+      <w:r>
+        <w:t>No hubo robo alguno por parte del criado, sino más bien una pequeña travesura infantil, aquí tenéis lo que queda de la bolsa.</w:t>
+      </w:r>
+    </w:p>
+    <w:p>
+      <w:r>
+        <w:t>El gato, o mejor dicho gata, nunca fue usada en ningún hechizo, estaba buscando un sitio donde dar a luz.</w:t>
+      </w:r>
+    </w:p>
+    <w:p>
+      <w:r>
+        <w:lastRenderedPageBreak/>
+        <w:t>Y mi viejo amigo, ¿pero no le habéis visto? Es zapatero, aquí mismo tengo una sábana suya manchada de tinte, creo que cualquiera de ustedes la cambiaría independientemente del día si tuvieran que dormir en algo así de manchado.</w:t>
+      </w:r>
+    </w:p>
+    <w:p>
+      <w:r>
+        <w:rPr>
+          <w:b/>
+          <w:bCs/>
+        </w:rPr>
+        <w:t>INQUISIDOR:</w:t>
+      </w:r>
+      <w:r>
+        <w:t xml:space="preserve"> Vaya, tenéis razón, así que me veo en la obligación de liberarlos de muy mala gana.</w:t>
+      </w:r>
+    </w:p>
+    <w:p>
+      <w:r>
+        <w:rPr>
+          <w:b/>
+          <w:bCs/>
+        </w:rPr>
+        <w:t>LADRÓN:</w:t>
+      </w:r>
+      <w:r>
+        <w:t xml:space="preserve"> Gracias por lo que has hecho, toma</w:t>
+      </w:r>
+      <w:r>
+        <w:t xml:space="preserve"> unas cintas, quizás te sirvan de algo.</w:t>
+      </w:r>
+    </w:p>
+    <w:p>
+      <w:r>
+        <w:rPr>
+          <w:b/>
+          <w:bCs/>
+        </w:rPr>
+        <w:t>BRUJA:</w:t>
+      </w:r>
+      <w:r>
+        <w:t xml:space="preserve"> Que Dios te pague lo que has hecho, poco puedo hacer pero toma unas especias que recogí en el campo.</w:t>
+      </w:r>
+    </w:p>
+    <w:p>
+      <w:r>
+        <w:rPr>
+          <w:b/>
+          <w:bCs/>
+        </w:rPr>
+        <w:t>ZAPATERO:</w:t>
+      </w:r>
+      <w:r>
+        <w:t xml:space="preserve"> Benjamín, viejo amigo, muchas gracias por lo que has hecho. No sé si hubiera algo que pudiera hacer por ti para compensártelo.</w:t>
+      </w:r>
+    </w:p>
+    <w:p>
+      <w:r>
+        <w:rPr>
+          <w:b/>
+          <w:bCs/>
+        </w:rPr>
+        <w:t>BUFÓN:</w:t>
+      </w:r>
+      <w:r>
+        <w:t xml:space="preserve"> ¿Por casualidad no tendrás algo de música que darme? Tengo una boda que montar y no consigo encontrar nada acorde a la ocasión-</w:t>
+      </w:r>
+    </w:p>
+    <w:p>
+      <w:r>
+        <w:rPr>
+          <w:b/>
+          <w:bCs/>
+        </w:rPr>
+        <w:t>ZAPATERO:</w:t>
+      </w:r>
+      <w:r>
+        <w:t xml:space="preserve"> Es tu día de suerte, toma este cancionero que conseguí el otro día en la taberna, es lo menos que puedo hacer por ti.</w:t>
+      </w:r>
+    </w:p>
+    <w:p/>
+    <w:p>
+      <w:r>
+        <w:rPr>
+          <w:b/>
+          <w:bCs/>
+        </w:rPr>
+        <w:t>BUFÓN:</w:t>
+      </w:r>
+      <w:r>
+        <w:t xml:space="preserve"> Creo que ya tengo lo que necesitaba, va siendo hora de apropincuarme al lugar si todo quiero preparar.</w:t>
+      </w:r>
+    </w:p>
+    <w:p>
+      <w:pPr>
         <w:pStyle w:val="Ttulo1"/>
       </w:pPr>
-      <w:bookmarkStart w:id="21" w:name="_Toc237768445"/>
+      <w:bookmarkStart w:id="22" w:name="_Toc237768445"/>
       <w:r>
         <w:t>Capítulo 3 – Valencia de Alcántara</w:t>
       </w:r>
       <w:r>
         <w:t xml:space="preserve"> – Rocamador Castillo Fortaleza</w:t>
       </w:r>
-      <w:bookmarkEnd w:id="21"/>
+      <w:bookmarkEnd w:id="22"/>
     </w:p>
     <w:p>
       <w:pPr>
@@ -4741,6 +6577,7 @@
         <w:jc w:val="both"/>
       </w:pPr>
       <w:r>
+        <w:lastRenderedPageBreak/>
         <w:t>Al volver de haber entregado la carta y hablado con el heraldo le dice que está todo pero falta el músico, encontrar al músico espiando gente y hablando con npcs, estaba dormido dentro de un barril.</w:t>
       </w:r>
     </w:p>
@@ -4763,10 +6600,1387 @@
         <w:jc w:val="center"/>
       </w:pPr>
       <w:r>
+        <w:t>FIN</w:t>
+      </w:r>
+    </w:p>
+    <w:p>
+      <w:r>
+        <w:t>MEMORIA</w:t>
+      </w:r>
+    </w:p>
+    <w:p>
+      <w:pPr>
+        <w:spacing w:after="180"/>
+        <w:jc w:val="both"/>
+        <w:rPr>
+          <w:rFonts w:ascii="Times New Roman" w:hAnsi="Times New Roman" w:cs="Times New Roman"/>
+        </w:rPr>
+      </w:pPr>
+      <w:r>
+        <w:rPr>
+          <w:rFonts w:ascii="Times New Roman" w:hAnsi="Times New Roman" w:cs="Times New Roman"/>
+        </w:rPr>
+        <w:t>En el año representado en el tutorial, los elementos arquitectónicos existentes eran la ermita gótica construida en 1412, junto con la ampliación realizada durante la primera mitad del siglo XV, las dependencias conventuales de los jerónimos, instalados allí desde 1458, espacios necesarios para llevar la vida monástica, si bien la distribución exacta de 1490 no aparece en las fuentes, y una hospedería o pousada real asociada a toda la arquitectura. Además de esto, estaba la propia zona de culto relacionada con la antigua devoción a Nossa Senhora do Espinheiro.</w:t>
+      </w:r>
+    </w:p>
+    <w:p>
+      <w:pPr>
+        <w:keepNext/>
+        <w:spacing w:after="180"/>
+        <w:jc w:val="center"/>
+        <w:rPr>
+          <w:rFonts w:ascii="Times New Roman" w:hAnsi="Times New Roman" w:cs="Times New Roman"/>
+        </w:rPr>
+      </w:pPr>
+      <w:r>
+        <w:rPr>
+          <w:rFonts w:ascii="Times New Roman" w:hAnsi="Times New Roman" w:cs="Times New Roman"/>
+          <w:noProof/>
+        </w:rPr>
+        <w:drawing>
+          <wp:inline distT="0" distB="0" distL="0" distR="0" wp14:anchorId="001CA5F6" wp14:editId="661788BC">
+            <wp:extent cx="3291840" cy="2195205"/>
+            <wp:effectExtent l="0" t="0" r="3810" b="0"/>
+            <wp:docPr id="1235177983" name="Imagen 1"/>
+            <wp:cNvGraphicFramePr>
+              <a:graphicFrameLocks xmlns:a="http://schemas.openxmlformats.org/drawingml/2006/main" noChangeAspect="1"/>
+            </wp:cNvGraphicFramePr>
+            <a:graphic xmlns:a="http://schemas.openxmlformats.org/drawingml/2006/main">
+              <a:graphicData uri="http://schemas.openxmlformats.org/drawingml/2006/picture">
+                <pic:pic xmlns:pic="http://schemas.openxmlformats.org/drawingml/2006/picture">
+                  <pic:nvPicPr>
+                    <pic:cNvPr id="0" name="Picture 1"/>
+                    <pic:cNvPicPr>
+                      <a:picLocks noChangeAspect="1" noChangeArrowheads="1"/>
+                    </pic:cNvPicPr>
+                  </pic:nvPicPr>
+                  <pic:blipFill>
+                    <a:blip r:embed="rId10" cstate="print">
+                      <a:extLst>
+                        <a:ext uri="{28A0092B-C50C-407E-A947-70E740481C1C}">
+                          <a14:useLocalDpi xmlns:a14="http://schemas.microsoft.com/office/drawing/2010/main" val="0"/>
+                        </a:ext>
+                      </a:extLst>
+                    </a:blip>
+                    <a:srcRect/>
+                    <a:stretch>
+                      <a:fillRect/>
+                    </a:stretch>
+                  </pic:blipFill>
+                  <pic:spPr bwMode="auto">
+                    <a:xfrm>
+                      <a:off x="0" y="0"/>
+                      <a:ext cx="3300428" cy="2200932"/>
+                    </a:xfrm>
+                    <a:prstGeom prst="rect">
+                      <a:avLst/>
+                    </a:prstGeom>
+                    <a:noFill/>
+                    <a:ln>
+                      <a:noFill/>
+                    </a:ln>
+                  </pic:spPr>
+                </pic:pic>
+              </a:graphicData>
+            </a:graphic>
+          </wp:inline>
+        </w:drawing>
+      </w:r>
+    </w:p>
+    <w:p>
+      <w:pPr>
+        <w:pStyle w:val="Descripcin"/>
+        <w:spacing w:after="180"/>
+        <w:jc w:val="center"/>
+        <w:rPr>
+          <w:rFonts w:ascii="Times New Roman" w:hAnsi="Times New Roman" w:cs="Times New Roman"/>
+        </w:rPr>
+      </w:pPr>
+      <w:r>
+        <w:rPr>
+          <w:rFonts w:ascii="Times New Roman" w:hAnsi="Times New Roman" w:cs="Times New Roman"/>
+        </w:rPr>
+        <w:t xml:space="preserve">Figura </w:t>
+      </w:r>
+      <w:r>
+        <w:rPr>
+          <w:rFonts w:ascii="Times New Roman" w:hAnsi="Times New Roman" w:cs="Times New Roman"/>
+        </w:rPr>
+        <w:fldChar w:fldCharType="begin"/>
+      </w:r>
+      <w:r>
+        <w:rPr>
+          <w:rFonts w:ascii="Times New Roman" w:hAnsi="Times New Roman" w:cs="Times New Roman"/>
+        </w:rPr>
+        <w:instrText xml:space="preserve"> SEQ Figura \* ARABIC </w:instrText>
+      </w:r>
+      <w:r>
+        <w:rPr>
+          <w:rFonts w:ascii="Times New Roman" w:hAnsi="Times New Roman" w:cs="Times New Roman"/>
+        </w:rPr>
+        <w:fldChar w:fldCharType="separate"/>
+      </w:r>
+      <w:r>
+        <w:rPr>
+          <w:rFonts w:ascii="Times New Roman" w:hAnsi="Times New Roman" w:cs="Times New Roman"/>
+          <w:noProof/>
+        </w:rPr>
+        <w:t>6</w:t>
+      </w:r>
+      <w:r>
+        <w:rPr>
+          <w:rFonts w:ascii="Times New Roman" w:hAnsi="Times New Roman" w:cs="Times New Roman"/>
+          <w:noProof/>
+        </w:rPr>
+        <w:fldChar w:fldCharType="end"/>
+      </w:r>
+      <w:r>
+        <w:rPr>
+          <w:rFonts w:ascii="Times New Roman" w:hAnsi="Times New Roman" w:cs="Times New Roman"/>
+        </w:rPr>
+        <w:t>. Recreación hecha con Inteligencia Artificial de cómo era el Convento en 1490</w:t>
+      </w:r>
+    </w:p>
+    <w:p>
+      <w:pPr>
+        <w:spacing w:after="180"/>
+        <w:jc w:val="both"/>
+        <w:rPr>
+          <w:rFonts w:ascii="Times New Roman" w:hAnsi="Times New Roman" w:cs="Times New Roman"/>
+        </w:rPr>
+      </w:pPr>
+      <w:r>
+        <w:rPr>
+          <w:rFonts w:ascii="Times New Roman" w:hAnsi="Times New Roman" w:cs="Times New Roman"/>
+        </w:rPr>
+        <w:tab/>
+        <w:t>Para la construcción del escenario se ha representado principalmente el volumen exterior del conjunto conventual, incluyendo la iglesia y las dependencias conventuales organizadas en torno a esta, así como los muros que delimitan el recinto y los espacios interiores a estos necesarios para el desarrollo del tutorial. La reconstrucción se ha centrado en la volumetría y disposición general del conjunto, puesto que la escasa documentación disponible no permite determinar con cierto grado de precisión los elementos arquitectónicos existentes en 1490.</w:t>
+      </w:r>
+    </w:p>
+    <w:p>
+      <w:pPr>
+        <w:keepNext/>
+        <w:spacing w:after="180"/>
+        <w:jc w:val="both"/>
+        <w:rPr>
+          <w:rFonts w:ascii="Times New Roman" w:hAnsi="Times New Roman" w:cs="Times New Roman"/>
+        </w:rPr>
+      </w:pPr>
+      <w:r>
+        <w:rPr>
+          <w:rFonts w:ascii="Times New Roman" w:hAnsi="Times New Roman" w:cs="Times New Roman"/>
+          <w:noProof/>
+          <w:lang w:eastAsia="es-ES"/>
+        </w:rPr>
         <w:lastRenderedPageBreak/>
-        <w:t>FIN</w:t>
-      </w:r>
-    </w:p>
+        <w:drawing>
+          <wp:inline distT="0" distB="0" distL="0" distR="0" wp14:anchorId="2FE5813F" wp14:editId="129C13CC">
+            <wp:extent cx="5400040" cy="2174875"/>
+            <wp:effectExtent l="0" t="0" r="0" b="0"/>
+            <wp:docPr id="712327342" name="Imagen 1"/>
+            <wp:cNvGraphicFramePr>
+              <a:graphicFrameLocks xmlns:a="http://schemas.openxmlformats.org/drawingml/2006/main" noChangeAspect="1"/>
+            </wp:cNvGraphicFramePr>
+            <a:graphic xmlns:a="http://schemas.openxmlformats.org/drawingml/2006/main">
+              <a:graphicData uri="http://schemas.openxmlformats.org/drawingml/2006/picture">
+                <pic:pic xmlns:pic="http://schemas.openxmlformats.org/drawingml/2006/picture">
+                  <pic:nvPicPr>
+                    <pic:cNvPr id="257672121" name=""/>
+                    <pic:cNvPicPr/>
+                  </pic:nvPicPr>
+                  <pic:blipFill>
+                    <a:blip r:embed="rId11"/>
+                    <a:stretch>
+                      <a:fillRect/>
+                    </a:stretch>
+                  </pic:blipFill>
+                  <pic:spPr>
+                    <a:xfrm>
+                      <a:off x="0" y="0"/>
+                      <a:ext cx="5400040" cy="2174875"/>
+                    </a:xfrm>
+                    <a:prstGeom prst="rect">
+                      <a:avLst/>
+                    </a:prstGeom>
+                  </pic:spPr>
+                </pic:pic>
+              </a:graphicData>
+            </a:graphic>
+          </wp:inline>
+        </w:drawing>
+      </w:r>
+    </w:p>
+    <w:p>
+      <w:pPr>
+        <w:pStyle w:val="Descripcin"/>
+        <w:spacing w:after="180"/>
+        <w:jc w:val="center"/>
+        <w:rPr>
+          <w:rFonts w:ascii="Times New Roman" w:hAnsi="Times New Roman" w:cs="Times New Roman"/>
+        </w:rPr>
+      </w:pPr>
+      <w:r>
+        <w:rPr>
+          <w:rFonts w:ascii="Times New Roman" w:hAnsi="Times New Roman" w:cs="Times New Roman"/>
+        </w:rPr>
+        <w:t xml:space="preserve">Figura </w:t>
+      </w:r>
+      <w:r>
+        <w:rPr>
+          <w:rFonts w:ascii="Times New Roman" w:hAnsi="Times New Roman" w:cs="Times New Roman"/>
+        </w:rPr>
+        <w:fldChar w:fldCharType="begin"/>
+      </w:r>
+      <w:r>
+        <w:rPr>
+          <w:rFonts w:ascii="Times New Roman" w:hAnsi="Times New Roman" w:cs="Times New Roman"/>
+        </w:rPr>
+        <w:instrText xml:space="preserve"> SEQ Figura \* ARABIC </w:instrText>
+      </w:r>
+      <w:r>
+        <w:rPr>
+          <w:rFonts w:ascii="Times New Roman" w:hAnsi="Times New Roman" w:cs="Times New Roman"/>
+        </w:rPr>
+        <w:fldChar w:fldCharType="separate"/>
+      </w:r>
+      <w:r>
+        <w:rPr>
+          <w:rFonts w:ascii="Times New Roman" w:hAnsi="Times New Roman" w:cs="Times New Roman"/>
+          <w:noProof/>
+        </w:rPr>
+        <w:t>7</w:t>
+      </w:r>
+      <w:r>
+        <w:rPr>
+          <w:rFonts w:ascii="Times New Roman" w:hAnsi="Times New Roman" w:cs="Times New Roman"/>
+          <w:noProof/>
+        </w:rPr>
+        <w:fldChar w:fldCharType="end"/>
+      </w:r>
+      <w:r>
+        <w:rPr>
+          <w:rFonts w:ascii="Times New Roman" w:hAnsi="Times New Roman" w:cs="Times New Roman"/>
+        </w:rPr>
+        <w:t>. Escenario modelado</w:t>
+      </w:r>
+    </w:p>
+    <w:p>
+      <w:pPr>
+        <w:spacing w:after="180"/>
+        <w:jc w:val="both"/>
+        <w:rPr>
+          <w:rFonts w:ascii="Times New Roman" w:hAnsi="Times New Roman" w:cs="Times New Roman"/>
+        </w:rPr>
+      </w:pPr>
+      <w:r>
+        <w:rPr>
+          <w:rFonts w:ascii="Times New Roman" w:hAnsi="Times New Roman" w:cs="Times New Roman"/>
+        </w:rPr>
+        <w:t>Su utilización permite situar al jugador en un espacio directamente relacionado con la monarquía castellana y utilizar el patrimonio histórico como parte del desarrollo narrativo del proyecto.</w:t>
+      </w:r>
+    </w:p>
+    <w:p>
+      <w:pPr>
+        <w:spacing w:after="180"/>
+        <w:jc w:val="both"/>
+        <w:rPr>
+          <w:rFonts w:ascii="Times New Roman" w:hAnsi="Times New Roman" w:cs="Times New Roman"/>
+        </w:rPr>
+      </w:pPr>
+      <w:r>
+        <w:rPr>
+          <w:rFonts w:ascii="Times New Roman" w:hAnsi="Times New Roman" w:cs="Times New Roman"/>
+        </w:rPr>
+        <w:tab/>
+        <w:t xml:space="preserve">En el año representado en el videojuego, el Palacio Real de Medina del ampo constituía ya un amplio conjunto residencial desarrollado progresivamente durante los siglos XIV y XV. Entre los elementos arquitectónicos cuya existencia puede documentarse con anterioridad a 1497 se encontraban las distintas casas y dependencias que conformaban la residencia real, una torre, corrales y una huerta [mención de 1468]. Además de esto, el palacio había experimentado una importante ampliación y transformación entre finales del siglo XIV y comienzos del XV, promovida por Fernando de Antequera, de la que se conservan restos de yeserías y otros elementos decorativos. El conjunto continuó siendo utilizado como residencia de la monarquía durante el reinado de los Reyes Católicos, si bien la distribución y configuración exacta de todas sus dependencias en 1497 no puede determinarse con precisión a partir de las fuentes conservadas.  </w:t>
+      </w:r>
+    </w:p>
+    <w:p>
+      <w:pPr>
+        <w:keepNext/>
+        <w:spacing w:after="180"/>
+        <w:jc w:val="center"/>
+        <w:rPr>
+          <w:rFonts w:ascii="Times New Roman" w:hAnsi="Times New Roman" w:cs="Times New Roman"/>
+        </w:rPr>
+      </w:pPr>
+      <w:r>
+        <w:rPr>
+          <w:rFonts w:ascii="Times New Roman" w:hAnsi="Times New Roman" w:cs="Times New Roman"/>
+          <w:noProof/>
+        </w:rPr>
+        <w:drawing>
+          <wp:inline distT="0" distB="0" distL="0" distR="0" wp14:anchorId="3C56B46E" wp14:editId="6554BCA5">
+            <wp:extent cx="3178629" cy="2492375"/>
+            <wp:effectExtent l="0" t="0" r="3175" b="3175"/>
+            <wp:docPr id="1838864746" name="Imagen 1"/>
+            <wp:cNvGraphicFramePr>
+              <a:graphicFrameLocks xmlns:a="http://schemas.openxmlformats.org/drawingml/2006/main" noChangeAspect="1"/>
+            </wp:cNvGraphicFramePr>
+            <a:graphic xmlns:a="http://schemas.openxmlformats.org/drawingml/2006/main">
+              <a:graphicData uri="http://schemas.openxmlformats.org/drawingml/2006/picture">
+                <pic:pic xmlns:pic="http://schemas.openxmlformats.org/drawingml/2006/picture">
+                  <pic:nvPicPr>
+                    <pic:cNvPr id="0" name="Picture 1"/>
+                    <pic:cNvPicPr>
+                      <a:picLocks noChangeAspect="1" noChangeArrowheads="1"/>
+                    </pic:cNvPicPr>
+                  </pic:nvPicPr>
+                  <pic:blipFill rotWithShape="1">
+                    <a:blip r:embed="rId12" cstate="print">
+                      <a:extLst>
+                        <a:ext uri="{28A0092B-C50C-407E-A947-70E740481C1C}">
+                          <a14:useLocalDpi xmlns:a14="http://schemas.microsoft.com/office/drawing/2010/main" val="0"/>
+                        </a:ext>
+                      </a:extLst>
+                    </a:blip>
+                    <a:srcRect r="20291"/>
+                    <a:stretch>
+                      <a:fillRect/>
+                    </a:stretch>
+                  </pic:blipFill>
+                  <pic:spPr bwMode="auto">
+                    <a:xfrm>
+                      <a:off x="0" y="0"/>
+                      <a:ext cx="3192952" cy="2503606"/>
+                    </a:xfrm>
+                    <a:prstGeom prst="rect">
+                      <a:avLst/>
+                    </a:prstGeom>
+                    <a:noFill/>
+                    <a:ln>
+                      <a:noFill/>
+                    </a:ln>
+                    <a:extLst>
+                      <a:ext uri="{53640926-AAD7-44D8-BBD7-CCE9431645EC}">
+                        <a14:shadowObscured xmlns:a14="http://schemas.microsoft.com/office/drawing/2010/main"/>
+                      </a:ext>
+                    </a:extLst>
+                  </pic:spPr>
+                </pic:pic>
+              </a:graphicData>
+            </a:graphic>
+          </wp:inline>
+        </w:drawing>
+      </w:r>
+    </w:p>
+    <w:p>
+      <w:pPr>
+        <w:pStyle w:val="Descripcin"/>
+        <w:spacing w:after="180"/>
+        <w:jc w:val="center"/>
+        <w:rPr>
+          <w:rFonts w:ascii="Times New Roman" w:hAnsi="Times New Roman" w:cs="Times New Roman"/>
+        </w:rPr>
+      </w:pPr>
+      <w:r>
+        <w:rPr>
+          <w:rFonts w:ascii="Times New Roman" w:hAnsi="Times New Roman" w:cs="Times New Roman"/>
+        </w:rPr>
+        <w:t xml:space="preserve">Figura </w:t>
+      </w:r>
+      <w:r>
+        <w:rPr>
+          <w:rFonts w:ascii="Times New Roman" w:hAnsi="Times New Roman" w:cs="Times New Roman"/>
+        </w:rPr>
+        <w:fldChar w:fldCharType="begin"/>
+      </w:r>
+      <w:r>
+        <w:rPr>
+          <w:rFonts w:ascii="Times New Roman" w:hAnsi="Times New Roman" w:cs="Times New Roman"/>
+        </w:rPr>
+        <w:instrText xml:space="preserve"> SEQ Figura \* ARABIC </w:instrText>
+      </w:r>
+      <w:r>
+        <w:rPr>
+          <w:rFonts w:ascii="Times New Roman" w:hAnsi="Times New Roman" w:cs="Times New Roman"/>
+        </w:rPr>
+        <w:fldChar w:fldCharType="separate"/>
+      </w:r>
+      <w:r>
+        <w:rPr>
+          <w:rFonts w:ascii="Times New Roman" w:hAnsi="Times New Roman" w:cs="Times New Roman"/>
+          <w:noProof/>
+        </w:rPr>
+        <w:t>8</w:t>
+      </w:r>
+      <w:r>
+        <w:rPr>
+          <w:rFonts w:ascii="Times New Roman" w:hAnsi="Times New Roman" w:cs="Times New Roman"/>
+          <w:noProof/>
+        </w:rPr>
+        <w:fldChar w:fldCharType="end"/>
+      </w:r>
+      <w:r>
+        <w:rPr>
+          <w:rFonts w:ascii="Times New Roman" w:hAnsi="Times New Roman" w:cs="Times New Roman"/>
+        </w:rPr>
+        <w:t>. Plano del conjunto</w:t>
+      </w:r>
+    </w:p>
+    <w:p>
+      <w:pPr>
+        <w:keepNext/>
+        <w:spacing w:after="180"/>
+        <w:jc w:val="center"/>
+        <w:rPr>
+          <w:rFonts w:ascii="Times New Roman" w:hAnsi="Times New Roman" w:cs="Times New Roman"/>
+        </w:rPr>
+      </w:pPr>
+      <w:r>
+        <w:rPr>
+          <w:rFonts w:ascii="Times New Roman" w:hAnsi="Times New Roman" w:cs="Times New Roman"/>
+          <w:noProof/>
+        </w:rPr>
+        <w:lastRenderedPageBreak/>
+        <w:drawing>
+          <wp:inline distT="0" distB="0" distL="0" distR="0" wp14:anchorId="7ED5FA3A" wp14:editId="71ED7FAC">
+            <wp:extent cx="3213462" cy="2142308"/>
+            <wp:effectExtent l="0" t="0" r="6350" b="0"/>
+            <wp:docPr id="679739391" name="Imagen 3"/>
+            <wp:cNvGraphicFramePr>
+              <a:graphicFrameLocks xmlns:a="http://schemas.openxmlformats.org/drawingml/2006/main" noChangeAspect="1"/>
+            </wp:cNvGraphicFramePr>
+            <a:graphic xmlns:a="http://schemas.openxmlformats.org/drawingml/2006/main">
+              <a:graphicData uri="http://schemas.openxmlformats.org/drawingml/2006/picture">
+                <pic:pic xmlns:pic="http://schemas.openxmlformats.org/drawingml/2006/picture">
+                  <pic:nvPicPr>
+                    <pic:cNvPr id="0" name="Picture 5"/>
+                    <pic:cNvPicPr>
+                      <a:picLocks noChangeAspect="1" noChangeArrowheads="1"/>
+                    </pic:cNvPicPr>
+                  </pic:nvPicPr>
+                  <pic:blipFill>
+                    <a:blip r:embed="rId13" cstate="print">
+                      <a:extLst>
+                        <a:ext uri="{28A0092B-C50C-407E-A947-70E740481C1C}">
+                          <a14:useLocalDpi xmlns:a14="http://schemas.microsoft.com/office/drawing/2010/main" val="0"/>
+                        </a:ext>
+                      </a:extLst>
+                    </a:blip>
+                    <a:srcRect/>
+                    <a:stretch>
+                      <a:fillRect/>
+                    </a:stretch>
+                  </pic:blipFill>
+                  <pic:spPr bwMode="auto">
+                    <a:xfrm>
+                      <a:off x="0" y="0"/>
+                      <a:ext cx="3221654" cy="2147769"/>
+                    </a:xfrm>
+                    <a:prstGeom prst="rect">
+                      <a:avLst/>
+                    </a:prstGeom>
+                    <a:noFill/>
+                    <a:ln>
+                      <a:noFill/>
+                    </a:ln>
+                  </pic:spPr>
+                </pic:pic>
+              </a:graphicData>
+            </a:graphic>
+          </wp:inline>
+        </w:drawing>
+      </w:r>
+    </w:p>
+    <w:p>
+      <w:pPr>
+        <w:pStyle w:val="Descripcin"/>
+        <w:spacing w:after="180"/>
+        <w:jc w:val="center"/>
+        <w:rPr>
+          <w:rFonts w:ascii="Times New Roman" w:hAnsi="Times New Roman" w:cs="Times New Roman"/>
+        </w:rPr>
+      </w:pPr>
+      <w:r>
+        <w:rPr>
+          <w:rFonts w:ascii="Times New Roman" w:hAnsi="Times New Roman" w:cs="Times New Roman"/>
+        </w:rPr>
+        <w:t xml:space="preserve">Figura </w:t>
+      </w:r>
+      <w:r>
+        <w:rPr>
+          <w:rFonts w:ascii="Times New Roman" w:hAnsi="Times New Roman" w:cs="Times New Roman"/>
+        </w:rPr>
+        <w:fldChar w:fldCharType="begin"/>
+      </w:r>
+      <w:r>
+        <w:rPr>
+          <w:rFonts w:ascii="Times New Roman" w:hAnsi="Times New Roman" w:cs="Times New Roman"/>
+        </w:rPr>
+        <w:instrText xml:space="preserve"> SEQ Figura \* ARABIC </w:instrText>
+      </w:r>
+      <w:r>
+        <w:rPr>
+          <w:rFonts w:ascii="Times New Roman" w:hAnsi="Times New Roman" w:cs="Times New Roman"/>
+        </w:rPr>
+        <w:fldChar w:fldCharType="separate"/>
+      </w:r>
+      <w:r>
+        <w:rPr>
+          <w:rFonts w:ascii="Times New Roman" w:hAnsi="Times New Roman" w:cs="Times New Roman"/>
+          <w:noProof/>
+        </w:rPr>
+        <w:t>9</w:t>
+      </w:r>
+      <w:r>
+        <w:rPr>
+          <w:rFonts w:ascii="Times New Roman" w:hAnsi="Times New Roman" w:cs="Times New Roman"/>
+          <w:noProof/>
+        </w:rPr>
+        <w:fldChar w:fldCharType="end"/>
+      </w:r>
+      <w:r>
+        <w:rPr>
+          <w:rFonts w:ascii="Times New Roman" w:hAnsi="Times New Roman" w:cs="Times New Roman"/>
+        </w:rPr>
+        <w:t>. Recreación hecha con Inteligencia Artificial de cómo era en 1497</w:t>
+      </w:r>
+    </w:p>
+    <w:p>
+      <w:pPr>
+        <w:spacing w:after="180"/>
+        <w:jc w:val="both"/>
+        <w:rPr>
+          <w:rFonts w:ascii="Times New Roman" w:hAnsi="Times New Roman" w:cs="Times New Roman"/>
+        </w:rPr>
+      </w:pPr>
+      <w:r>
+        <w:rPr>
+          <w:rFonts w:ascii="Times New Roman" w:hAnsi="Times New Roman" w:cs="Times New Roman"/>
+        </w:rPr>
+        <w:tab/>
+        <w:t>A la hora de construir el escenario, se ha representado principalmente la Plaza Mayor de Medina del Campo, junto con los muros y la fachada correspondientes al volumen exterior del conjunto palaciego. Asimismo, se ha incluido una de las dependencias interiores del palacio, empleada dentro del desarrollo narrativo como estancia en la que se encuentran los Reyes Católicos.</w:t>
+      </w:r>
+    </w:p>
+    <w:p>
+      <w:pPr>
+        <w:spacing w:after="180"/>
+        <w:jc w:val="center"/>
+        <w:rPr>
+          <w:rFonts w:ascii="Times New Roman" w:hAnsi="Times New Roman" w:cs="Times New Roman"/>
+        </w:rPr>
+      </w:pPr>
+      <w:r>
+        <w:rPr>
+          <w:rFonts w:ascii="Times New Roman" w:hAnsi="Times New Roman" w:cs="Times New Roman"/>
+        </w:rPr>
+        <w:t>[Foto del modelado]</w:t>
+      </w:r>
+    </w:p>
+    <w:p>
+      <w:pPr>
+        <w:spacing w:after="180"/>
+        <w:jc w:val="both"/>
+        <w:rPr>
+          <w:rFonts w:ascii="Times New Roman" w:hAnsi="Times New Roman" w:cs="Times New Roman"/>
+        </w:rPr>
+      </w:pPr>
+      <w:r>
+        <w:rPr>
+          <w:rFonts w:ascii="Times New Roman" w:hAnsi="Times New Roman" w:cs="Times New Roman"/>
+        </w:rPr>
+        <w:t>Dentro del videojuego, esta localización se emplea como escenario para representar el contexto religioso y social de la época, ya que permite situar al jugador en uno de los enclaves religiosos más relevantes de la Castilla de finales del siglo XV y además mostrar la crueldad con la que llegaba a actuar la Inquisición.</w:t>
+      </w:r>
+    </w:p>
+    <w:p>
+      <w:pPr>
+        <w:spacing w:after="180"/>
+        <w:jc w:val="both"/>
+        <w:rPr>
+          <w:rFonts w:ascii="Times New Roman" w:hAnsi="Times New Roman" w:cs="Times New Roman"/>
+        </w:rPr>
+      </w:pPr>
+      <w:r>
+        <w:rPr>
+          <w:rFonts w:ascii="Times New Roman" w:hAnsi="Times New Roman" w:cs="Times New Roman"/>
+        </w:rPr>
+        <w:tab/>
+        <w:t xml:space="preserve">En 1497, el complejo arquitectónico presentaba ya buena parte de los elementos que configuraban el conjunto monástico medieval. Entre ellos se encontraba la iglesia de estilo gótico-mudéjar, desarrollada principalmente durante los siglos XIV y XV, el claustro mudéjar, construido entre finales del siglo XIV y comienzos del sigo XV, y las diferentes dependencias conventuales organizadas en torno a este, destinadas a las actividades religiosas y a la vida cotidiana de la comunidad jerónima. El recinto contaba asimismo con estructuras defensivas, torres y murallas que otorgaban al conjunto su característica apariencia fortificada. </w:t>
+      </w:r>
+    </w:p>
+    <w:p>
+      <w:pPr>
+        <w:keepNext/>
+        <w:spacing w:after="180"/>
+        <w:jc w:val="center"/>
+        <w:rPr>
+          <w:rFonts w:ascii="Times New Roman" w:hAnsi="Times New Roman" w:cs="Times New Roman"/>
+        </w:rPr>
+      </w:pPr>
+      <w:r>
+        <w:rPr>
+          <w:rFonts w:ascii="Times New Roman" w:hAnsi="Times New Roman" w:cs="Times New Roman"/>
+          <w:noProof/>
+        </w:rPr>
+        <w:lastRenderedPageBreak/>
+        <w:drawing>
+          <wp:inline distT="0" distB="0" distL="0" distR="0" wp14:anchorId="7582AD42" wp14:editId="313DC280">
+            <wp:extent cx="3979577" cy="2037521"/>
+            <wp:effectExtent l="0" t="0" r="1905" b="1270"/>
+            <wp:docPr id="1218566567" name="Imagen 1"/>
+            <wp:cNvGraphicFramePr>
+              <a:graphicFrameLocks xmlns:a="http://schemas.openxmlformats.org/drawingml/2006/main" noChangeAspect="1"/>
+            </wp:cNvGraphicFramePr>
+            <a:graphic xmlns:a="http://schemas.openxmlformats.org/drawingml/2006/main">
+              <a:graphicData uri="http://schemas.openxmlformats.org/drawingml/2006/picture">
+                <pic:pic xmlns:pic="http://schemas.openxmlformats.org/drawingml/2006/picture">
+                  <pic:nvPicPr>
+                    <pic:cNvPr id="0" name="Picture 1"/>
+                    <pic:cNvPicPr>
+                      <a:picLocks noChangeAspect="1" noChangeArrowheads="1"/>
+                    </pic:cNvPicPr>
+                  </pic:nvPicPr>
+                  <pic:blipFill>
+                    <a:blip r:embed="rId14">
+                      <a:extLst>
+                        <a:ext uri="{28A0092B-C50C-407E-A947-70E740481C1C}">
+                          <a14:useLocalDpi xmlns:a14="http://schemas.microsoft.com/office/drawing/2010/main" val="0"/>
+                        </a:ext>
+                      </a:extLst>
+                    </a:blip>
+                    <a:srcRect/>
+                    <a:stretch>
+                      <a:fillRect/>
+                    </a:stretch>
+                  </pic:blipFill>
+                  <pic:spPr bwMode="auto">
+                    <a:xfrm>
+                      <a:off x="0" y="0"/>
+                      <a:ext cx="3984459" cy="2040021"/>
+                    </a:xfrm>
+                    <a:prstGeom prst="rect">
+                      <a:avLst/>
+                    </a:prstGeom>
+                    <a:noFill/>
+                    <a:ln>
+                      <a:noFill/>
+                    </a:ln>
+                  </pic:spPr>
+                </pic:pic>
+              </a:graphicData>
+            </a:graphic>
+          </wp:inline>
+        </w:drawing>
+      </w:r>
+    </w:p>
+    <w:p>
+      <w:pPr>
+        <w:pStyle w:val="Descripcin"/>
+        <w:spacing w:after="180"/>
+        <w:jc w:val="center"/>
+        <w:rPr>
+          <w:rFonts w:ascii="Times New Roman" w:hAnsi="Times New Roman" w:cs="Times New Roman"/>
+        </w:rPr>
+      </w:pPr>
+      <w:r>
+        <w:rPr>
+          <w:rFonts w:ascii="Times New Roman" w:hAnsi="Times New Roman" w:cs="Times New Roman"/>
+        </w:rPr>
+        <w:t xml:space="preserve">Figura </w:t>
+      </w:r>
+      <w:r>
+        <w:rPr>
+          <w:rFonts w:ascii="Times New Roman" w:hAnsi="Times New Roman" w:cs="Times New Roman"/>
+        </w:rPr>
+        <w:fldChar w:fldCharType="begin"/>
+      </w:r>
+      <w:r>
+        <w:rPr>
+          <w:rFonts w:ascii="Times New Roman" w:hAnsi="Times New Roman" w:cs="Times New Roman"/>
+        </w:rPr>
+        <w:instrText xml:space="preserve"> SEQ Figura \* ARABIC </w:instrText>
+      </w:r>
+      <w:r>
+        <w:rPr>
+          <w:rFonts w:ascii="Times New Roman" w:hAnsi="Times New Roman" w:cs="Times New Roman"/>
+        </w:rPr>
+        <w:fldChar w:fldCharType="separate"/>
+      </w:r>
+      <w:r>
+        <w:rPr>
+          <w:rFonts w:ascii="Times New Roman" w:hAnsi="Times New Roman" w:cs="Times New Roman"/>
+          <w:noProof/>
+        </w:rPr>
+        <w:t>10</w:t>
+      </w:r>
+      <w:r>
+        <w:rPr>
+          <w:rFonts w:ascii="Times New Roman" w:hAnsi="Times New Roman" w:cs="Times New Roman"/>
+          <w:noProof/>
+        </w:rPr>
+        <w:fldChar w:fldCharType="end"/>
+      </w:r>
+      <w:r>
+        <w:rPr>
+          <w:rFonts w:ascii="Times New Roman" w:hAnsi="Times New Roman" w:cs="Times New Roman"/>
+        </w:rPr>
+        <w:t>. Plano del conjunto</w:t>
+      </w:r>
+    </w:p>
+    <w:p>
+      <w:pPr>
+        <w:keepNext/>
+        <w:spacing w:after="180"/>
+        <w:jc w:val="center"/>
+        <w:rPr>
+          <w:rFonts w:ascii="Times New Roman" w:hAnsi="Times New Roman" w:cs="Times New Roman"/>
+        </w:rPr>
+      </w:pPr>
+      <w:r>
+        <w:rPr>
+          <w:rFonts w:ascii="Times New Roman" w:hAnsi="Times New Roman" w:cs="Times New Roman"/>
+          <w:noProof/>
+        </w:rPr>
+        <w:drawing>
+          <wp:inline distT="0" distB="0" distL="0" distR="0" wp14:anchorId="295B765A" wp14:editId="34D829F8">
+            <wp:extent cx="3793626" cy="2529827"/>
+            <wp:effectExtent l="0" t="0" r="0" b="4445"/>
+            <wp:docPr id="743908878" name="Imagen 2"/>
+            <wp:cNvGraphicFramePr>
+              <a:graphicFrameLocks xmlns:a="http://schemas.openxmlformats.org/drawingml/2006/main" noChangeAspect="1"/>
+            </wp:cNvGraphicFramePr>
+            <a:graphic xmlns:a="http://schemas.openxmlformats.org/drawingml/2006/main">
+              <a:graphicData uri="http://schemas.openxmlformats.org/drawingml/2006/picture">
+                <pic:pic xmlns:pic="http://schemas.openxmlformats.org/drawingml/2006/picture">
+                  <pic:nvPicPr>
+                    <pic:cNvPr id="0" name="Picture 3"/>
+                    <pic:cNvPicPr>
+                      <a:picLocks noChangeAspect="1" noChangeArrowheads="1"/>
+                    </pic:cNvPicPr>
+                  </pic:nvPicPr>
+                  <pic:blipFill>
+                    <a:blip r:embed="rId15" cstate="print">
+                      <a:extLst>
+                        <a:ext uri="{28A0092B-C50C-407E-A947-70E740481C1C}">
+                          <a14:useLocalDpi xmlns:a14="http://schemas.microsoft.com/office/drawing/2010/main" val="0"/>
+                        </a:ext>
+                      </a:extLst>
+                    </a:blip>
+                    <a:srcRect/>
+                    <a:stretch>
+                      <a:fillRect/>
+                    </a:stretch>
+                  </pic:blipFill>
+                  <pic:spPr bwMode="auto">
+                    <a:xfrm>
+                      <a:off x="0" y="0"/>
+                      <a:ext cx="3795429" cy="2531029"/>
+                    </a:xfrm>
+                    <a:prstGeom prst="rect">
+                      <a:avLst/>
+                    </a:prstGeom>
+                    <a:noFill/>
+                    <a:ln>
+                      <a:noFill/>
+                    </a:ln>
+                  </pic:spPr>
+                </pic:pic>
+              </a:graphicData>
+            </a:graphic>
+          </wp:inline>
+        </w:drawing>
+      </w:r>
+    </w:p>
+    <w:p>
+      <w:pPr>
+        <w:pStyle w:val="Descripcin"/>
+        <w:spacing w:after="180"/>
+        <w:jc w:val="center"/>
+        <w:rPr>
+          <w:rFonts w:ascii="Times New Roman" w:hAnsi="Times New Roman" w:cs="Times New Roman"/>
+        </w:rPr>
+      </w:pPr>
+      <w:r>
+        <w:rPr>
+          <w:rFonts w:ascii="Times New Roman" w:hAnsi="Times New Roman" w:cs="Times New Roman"/>
+        </w:rPr>
+        <w:t xml:space="preserve">Figura </w:t>
+      </w:r>
+      <w:r>
+        <w:rPr>
+          <w:rFonts w:ascii="Times New Roman" w:hAnsi="Times New Roman" w:cs="Times New Roman"/>
+        </w:rPr>
+        <w:fldChar w:fldCharType="begin"/>
+      </w:r>
+      <w:r>
+        <w:rPr>
+          <w:rFonts w:ascii="Times New Roman" w:hAnsi="Times New Roman" w:cs="Times New Roman"/>
+        </w:rPr>
+        <w:instrText xml:space="preserve"> SEQ Figura \* ARABIC </w:instrText>
+      </w:r>
+      <w:r>
+        <w:rPr>
+          <w:rFonts w:ascii="Times New Roman" w:hAnsi="Times New Roman" w:cs="Times New Roman"/>
+        </w:rPr>
+        <w:fldChar w:fldCharType="separate"/>
+      </w:r>
+      <w:r>
+        <w:rPr>
+          <w:rFonts w:ascii="Times New Roman" w:hAnsi="Times New Roman" w:cs="Times New Roman"/>
+          <w:noProof/>
+        </w:rPr>
+        <w:t>11</w:t>
+      </w:r>
+      <w:r>
+        <w:rPr>
+          <w:rFonts w:ascii="Times New Roman" w:hAnsi="Times New Roman" w:cs="Times New Roman"/>
+          <w:noProof/>
+        </w:rPr>
+        <w:fldChar w:fldCharType="end"/>
+      </w:r>
+      <w:r>
+        <w:rPr>
+          <w:rFonts w:ascii="Times New Roman" w:hAnsi="Times New Roman" w:cs="Times New Roman"/>
+        </w:rPr>
+        <w:t xml:space="preserve">. Recreación hecha con Inteligencia Artificial </w:t>
+      </w:r>
+    </w:p>
+    <w:p>
+      <w:pPr>
+        <w:spacing w:after="180"/>
+        <w:jc w:val="both"/>
+        <w:rPr>
+          <w:rFonts w:ascii="Times New Roman" w:hAnsi="Times New Roman" w:cs="Times New Roman"/>
+        </w:rPr>
+      </w:pPr>
+      <w:r>
+        <w:rPr>
+          <w:rFonts w:ascii="Times New Roman" w:hAnsi="Times New Roman" w:cs="Times New Roman"/>
+        </w:rPr>
+        <w:tab/>
+        <w:t>A la hora de construir el escenario y modelar el Real Monasterio de Santa María de Guadalupe, se ha representado principalmente la fachada y el espacio exterior situado frente a esta, así como algunos de los elementos más característicos del conjunto monumental. En el interior se han incluido el Claustro de los Milagros y su templete central, empleados como espacios transitables durante el desarrollo del capítulo. La reconstrucción se ha centrado en aquellos elementos arquitectónicos necesarios para contextualizar históricamente la localización y facilitar el desarrollo de la narrativa y las mecánicas del videojuego, sin reproducir la totalidad de las dependencias que conformaban el conjunto monástico.</w:t>
+      </w:r>
+    </w:p>
+    <w:p>
+      <w:pPr>
+        <w:spacing w:after="180"/>
+        <w:jc w:val="center"/>
+        <w:rPr>
+          <w:rFonts w:ascii="Times New Roman" w:hAnsi="Times New Roman" w:cs="Times New Roman"/>
+        </w:rPr>
+      </w:pPr>
+      <w:r>
+        <w:rPr>
+          <w:rFonts w:ascii="Times New Roman" w:hAnsi="Times New Roman" w:cs="Times New Roman"/>
+        </w:rPr>
+        <w:t>[Foto del modelado]</w:t>
+      </w:r>
+    </w:p>
+    <w:p>
+      <w:pPr>
+        <w:spacing w:after="180"/>
+        <w:ind w:firstLine="708"/>
+        <w:jc w:val="both"/>
+        <w:rPr>
+          <w:rFonts w:ascii="Times New Roman" w:hAnsi="Times New Roman" w:cs="Times New Roman"/>
+        </w:rPr>
+      </w:pPr>
+      <w:r>
+        <w:rPr>
+          <w:rFonts w:ascii="Times New Roman" w:hAnsi="Times New Roman" w:cs="Times New Roman"/>
+        </w:rPr>
+        <w:t>Dentro del videojuego, el castillo y su entorno se emplean como parte del escenario correspondiente al capítulo final, permitiendo representar el frenesí del pueblo al alojar tal evento, la preparación que conlleva y contextualizar el acontecimiento que culmina la narrativa. De esta forma, la fortaleza contribuye a reflejar tanto el carácter fronterizo del pueblo como la relevancia histórica que adquirió la localidad en el marco de las relaciones entre las monarquías castellana y portuguesa.</w:t>
+      </w:r>
+    </w:p>
+    <w:p>
+      <w:pPr>
+        <w:keepNext/>
+        <w:spacing w:after="180"/>
+        <w:ind w:firstLine="708"/>
+        <w:jc w:val="both"/>
+        <w:rPr>
+          <w:rFonts w:ascii="Times New Roman" w:hAnsi="Times New Roman" w:cs="Times New Roman"/>
+        </w:rPr>
+      </w:pPr>
+      <w:r>
+        <w:rPr>
+          <w:rFonts w:ascii="Times New Roman" w:hAnsi="Times New Roman" w:cs="Times New Roman"/>
+        </w:rPr>
+        <w:lastRenderedPageBreak/>
+        <w:t>En 1497, el Castillo-Fortaleza de Valencia de Alcántara conservaba todavía una configuración medieval. La documentación conservada permite constatar la existencia de la fortaleza desde los siglos anteriores, presentando un recinto defensivo que continuó siendo utilizado y mantenido durante el siglo XV. Contaba con 5 torres que defendían el perímetro, si bien solo se conoce el nombre de dos de ellas, la del Tesoro y la del Homenaje, la cual sigue en pie hoy en día.</w:t>
+      </w:r>
+    </w:p>
+    <w:p>
+      <w:pPr>
+        <w:keepNext/>
+        <w:spacing w:after="180"/>
+        <w:ind w:firstLine="708"/>
+        <w:jc w:val="center"/>
+        <w:rPr>
+          <w:rFonts w:ascii="Times New Roman" w:hAnsi="Times New Roman" w:cs="Times New Roman"/>
+        </w:rPr>
+      </w:pPr>
+      <w:r>
+        <w:rPr>
+          <w:rFonts w:ascii="Times New Roman" w:hAnsi="Times New Roman" w:cs="Times New Roman"/>
+          <w:noProof/>
+        </w:rPr>
+        <w:drawing>
+          <wp:inline distT="0" distB="0" distL="0" distR="0" wp14:anchorId="2659DA76" wp14:editId="601EAE44">
+            <wp:extent cx="3227844" cy="3143250"/>
+            <wp:effectExtent l="0" t="0" r="0" b="0"/>
+            <wp:docPr id="199490778" name="Imagen 1"/>
+            <wp:cNvGraphicFramePr>
+              <a:graphicFrameLocks xmlns:a="http://schemas.openxmlformats.org/drawingml/2006/main" noChangeAspect="1"/>
+            </wp:cNvGraphicFramePr>
+            <a:graphic xmlns:a="http://schemas.openxmlformats.org/drawingml/2006/main">
+              <a:graphicData uri="http://schemas.openxmlformats.org/drawingml/2006/picture">
+                <pic:pic xmlns:pic="http://schemas.openxmlformats.org/drawingml/2006/picture">
+                  <pic:nvPicPr>
+                    <pic:cNvPr id="0" name="Picture 1"/>
+                    <pic:cNvPicPr>
+                      <a:picLocks noChangeAspect="1" noChangeArrowheads="1"/>
+                    </pic:cNvPicPr>
+                  </pic:nvPicPr>
+                  <pic:blipFill rotWithShape="1">
+                    <a:blip r:embed="rId16" cstate="print">
+                      <a:extLst>
+                        <a:ext uri="{28A0092B-C50C-407E-A947-70E740481C1C}">
+                          <a14:useLocalDpi xmlns:a14="http://schemas.microsoft.com/office/drawing/2010/main" val="0"/>
+                        </a:ext>
+                      </a:extLst>
+                    </a:blip>
+                    <a:srcRect l="61436" t="39498" r="14116" b="29571"/>
+                    <a:stretch>
+                      <a:fillRect/>
+                    </a:stretch>
+                  </pic:blipFill>
+                  <pic:spPr bwMode="auto">
+                    <a:xfrm>
+                      <a:off x="0" y="0"/>
+                      <a:ext cx="3238611" cy="3153735"/>
+                    </a:xfrm>
+                    <a:prstGeom prst="rect">
+                      <a:avLst/>
+                    </a:prstGeom>
+                    <a:noFill/>
+                    <a:ln>
+                      <a:noFill/>
+                    </a:ln>
+                    <a:extLst>
+                      <a:ext uri="{53640926-AAD7-44D8-BBD7-CCE9431645EC}">
+                        <a14:shadowObscured xmlns:a14="http://schemas.microsoft.com/office/drawing/2010/main"/>
+                      </a:ext>
+                    </a:extLst>
+                  </pic:spPr>
+                </pic:pic>
+              </a:graphicData>
+            </a:graphic>
+          </wp:inline>
+        </w:drawing>
+      </w:r>
+    </w:p>
+    <w:p>
+      <w:pPr>
+        <w:pStyle w:val="Descripcin"/>
+        <w:spacing w:after="180"/>
+        <w:jc w:val="center"/>
+        <w:rPr>
+          <w:rFonts w:ascii="Times New Roman" w:hAnsi="Times New Roman" w:cs="Times New Roman"/>
+        </w:rPr>
+      </w:pPr>
+      <w:r>
+        <w:rPr>
+          <w:rFonts w:ascii="Times New Roman" w:hAnsi="Times New Roman" w:cs="Times New Roman"/>
+        </w:rPr>
+        <w:t xml:space="preserve">Figura </w:t>
+      </w:r>
+      <w:r>
+        <w:rPr>
+          <w:rFonts w:ascii="Times New Roman" w:hAnsi="Times New Roman" w:cs="Times New Roman"/>
+        </w:rPr>
+        <w:fldChar w:fldCharType="begin"/>
+      </w:r>
+      <w:r>
+        <w:rPr>
+          <w:rFonts w:ascii="Times New Roman" w:hAnsi="Times New Roman" w:cs="Times New Roman"/>
+        </w:rPr>
+        <w:instrText xml:space="preserve"> SEQ Figura \* ARABIC </w:instrText>
+      </w:r>
+      <w:r>
+        <w:rPr>
+          <w:rFonts w:ascii="Times New Roman" w:hAnsi="Times New Roman" w:cs="Times New Roman"/>
+        </w:rPr>
+        <w:fldChar w:fldCharType="separate"/>
+      </w:r>
+      <w:r>
+        <w:rPr>
+          <w:rFonts w:ascii="Times New Roman" w:hAnsi="Times New Roman" w:cs="Times New Roman"/>
+          <w:noProof/>
+        </w:rPr>
+        <w:t>12</w:t>
+      </w:r>
+      <w:r>
+        <w:rPr>
+          <w:rFonts w:ascii="Times New Roman" w:hAnsi="Times New Roman" w:cs="Times New Roman"/>
+          <w:noProof/>
+        </w:rPr>
+        <w:fldChar w:fldCharType="end"/>
+      </w:r>
+      <w:r>
+        <w:rPr>
+          <w:rFonts w:ascii="Times New Roman" w:hAnsi="Times New Roman" w:cs="Times New Roman"/>
+        </w:rPr>
+        <w:t>. Plano de la distribución del Castillo-Fortaleza</w:t>
+      </w:r>
+    </w:p>
+    <w:p>
+      <w:pPr>
+        <w:keepNext/>
+        <w:spacing w:after="180"/>
+        <w:jc w:val="center"/>
+        <w:rPr>
+          <w:rFonts w:ascii="Times New Roman" w:hAnsi="Times New Roman" w:cs="Times New Roman"/>
+        </w:rPr>
+      </w:pPr>
+      <w:r>
+        <w:rPr>
+          <w:rFonts w:ascii="Times New Roman" w:hAnsi="Times New Roman" w:cs="Times New Roman"/>
+          <w:noProof/>
+        </w:rPr>
+        <w:drawing>
+          <wp:inline distT="0" distB="0" distL="0" distR="0" wp14:anchorId="141058E6" wp14:editId="522F1C23">
+            <wp:extent cx="3543508" cy="2362200"/>
+            <wp:effectExtent l="0" t="0" r="0" b="0"/>
+            <wp:docPr id="175438866" name="Imagen 8"/>
+            <wp:cNvGraphicFramePr>
+              <a:graphicFrameLocks xmlns:a="http://schemas.openxmlformats.org/drawingml/2006/main" noChangeAspect="1"/>
+            </wp:cNvGraphicFramePr>
+            <a:graphic xmlns:a="http://schemas.openxmlformats.org/drawingml/2006/main">
+              <a:graphicData uri="http://schemas.openxmlformats.org/drawingml/2006/picture">
+                <pic:pic xmlns:pic="http://schemas.openxmlformats.org/drawingml/2006/picture">
+                  <pic:nvPicPr>
+                    <pic:cNvPr id="0" name="Picture 2"/>
+                    <pic:cNvPicPr>
+                      <a:picLocks noChangeAspect="1" noChangeArrowheads="1"/>
+                    </pic:cNvPicPr>
+                  </pic:nvPicPr>
+                  <pic:blipFill>
+                    <a:blip r:embed="rId17" cstate="print">
+                      <a:extLst>
+                        <a:ext uri="{28A0092B-C50C-407E-A947-70E740481C1C}">
+                          <a14:useLocalDpi xmlns:a14="http://schemas.microsoft.com/office/drawing/2010/main" val="0"/>
+                        </a:ext>
+                      </a:extLst>
+                    </a:blip>
+                    <a:srcRect/>
+                    <a:stretch>
+                      <a:fillRect/>
+                    </a:stretch>
+                  </pic:blipFill>
+                  <pic:spPr bwMode="auto">
+                    <a:xfrm>
+                      <a:off x="0" y="0"/>
+                      <a:ext cx="3544655" cy="2362965"/>
+                    </a:xfrm>
+                    <a:prstGeom prst="rect">
+                      <a:avLst/>
+                    </a:prstGeom>
+                    <a:noFill/>
+                    <a:ln>
+                      <a:noFill/>
+                    </a:ln>
+                  </pic:spPr>
+                </pic:pic>
+              </a:graphicData>
+            </a:graphic>
+          </wp:inline>
+        </w:drawing>
+      </w:r>
+    </w:p>
+    <w:p>
+      <w:pPr>
+        <w:pStyle w:val="Descripcin"/>
+        <w:spacing w:after="180"/>
+        <w:jc w:val="center"/>
+        <w:rPr>
+          <w:rFonts w:ascii="Times New Roman" w:hAnsi="Times New Roman" w:cs="Times New Roman"/>
+        </w:rPr>
+      </w:pPr>
+      <w:r>
+        <w:rPr>
+          <w:rFonts w:ascii="Times New Roman" w:hAnsi="Times New Roman" w:cs="Times New Roman"/>
+        </w:rPr>
+        <w:t xml:space="preserve">Figura </w:t>
+      </w:r>
+      <w:r>
+        <w:rPr>
+          <w:rFonts w:ascii="Times New Roman" w:hAnsi="Times New Roman" w:cs="Times New Roman"/>
+        </w:rPr>
+        <w:fldChar w:fldCharType="begin"/>
+      </w:r>
+      <w:r>
+        <w:rPr>
+          <w:rFonts w:ascii="Times New Roman" w:hAnsi="Times New Roman" w:cs="Times New Roman"/>
+        </w:rPr>
+        <w:instrText xml:space="preserve"> SEQ Figura \* ARABIC </w:instrText>
+      </w:r>
+      <w:r>
+        <w:rPr>
+          <w:rFonts w:ascii="Times New Roman" w:hAnsi="Times New Roman" w:cs="Times New Roman"/>
+        </w:rPr>
+        <w:fldChar w:fldCharType="separate"/>
+      </w:r>
+      <w:r>
+        <w:rPr>
+          <w:rFonts w:ascii="Times New Roman" w:hAnsi="Times New Roman" w:cs="Times New Roman"/>
+          <w:noProof/>
+        </w:rPr>
+        <w:t>13</w:t>
+      </w:r>
+      <w:r>
+        <w:rPr>
+          <w:rFonts w:ascii="Times New Roman" w:hAnsi="Times New Roman" w:cs="Times New Roman"/>
+          <w:noProof/>
+        </w:rPr>
+        <w:fldChar w:fldCharType="end"/>
+      </w:r>
+      <w:r>
+        <w:rPr>
+          <w:rFonts w:ascii="Times New Roman" w:hAnsi="Times New Roman" w:cs="Times New Roman"/>
+        </w:rPr>
+        <w:t>. Recreación hecha con Inteligencia Artificial</w:t>
+      </w:r>
+    </w:p>
+    <w:p>
+      <w:pPr>
+        <w:spacing w:after="180"/>
+        <w:jc w:val="both"/>
+        <w:rPr>
+          <w:rFonts w:ascii="Times New Roman" w:hAnsi="Times New Roman" w:cs="Times New Roman"/>
+        </w:rPr>
+      </w:pPr>
+      <w:r>
+        <w:rPr>
+          <w:rFonts w:ascii="Times New Roman" w:hAnsi="Times New Roman" w:cs="Times New Roman"/>
+        </w:rPr>
+        <w:tab/>
+        <w:t>A la hora de modelar el escenario, se ha representado principalmente el recinto amurallado del Castillo-Fortaleza de Valencia de Alcántara, junto con los diferentes elementos defensivos que conforman el conjunto. Asimismo, se ha incluido el interior de algunas de sus dependencias, empleadas como espacios transitables durante el desarrollo del capítulo, así como la conexión del recinto con la iglesia de Nuestra Señora de Rocamador, también representada en el videojuego y que se explicará a continuación.</w:t>
+      </w:r>
+    </w:p>
+    <w:p>
+      <w:pPr>
+        <w:spacing w:after="180"/>
+        <w:jc w:val="center"/>
+        <w:rPr>
+          <w:rFonts w:ascii="Times New Roman" w:hAnsi="Times New Roman" w:cs="Times New Roman"/>
+        </w:rPr>
+      </w:pPr>
+      <w:r>
+        <w:rPr>
+          <w:rFonts w:ascii="Times New Roman" w:hAnsi="Times New Roman" w:cs="Times New Roman"/>
+        </w:rPr>
+        <w:lastRenderedPageBreak/>
+        <w:t>[Foto del modelado]</w:t>
+      </w:r>
+    </w:p>
+    <w:p>
+      <w:pPr>
+        <w:spacing w:after="180"/>
+        <w:jc w:val="both"/>
+        <w:rPr>
+          <w:rFonts w:ascii="Times New Roman" w:hAnsi="Times New Roman" w:cs="Times New Roman"/>
+        </w:rPr>
+      </w:pPr>
+      <w:r>
+        <w:rPr>
+          <w:rFonts w:ascii="Times New Roman" w:hAnsi="Times New Roman" w:cs="Times New Roman"/>
+        </w:rPr>
+        <w:t>Por este motivo, la iglesia adquiere una especial importancia dentro de la narrativa, al convertirse en uno de los espacios principales para representar la culminación de las negociaciones matrimoniales desarrolladas durante los capítulos anteriores y la unión entre las monarquías castellana y portuguesa.</w:t>
+      </w:r>
+    </w:p>
+    <w:p>
+      <w:pPr>
+        <w:spacing w:after="180"/>
+        <w:jc w:val="both"/>
+        <w:rPr>
+          <w:rFonts w:ascii="Times New Roman" w:hAnsi="Times New Roman" w:cs="Times New Roman"/>
+        </w:rPr>
+      </w:pPr>
+      <w:r>
+        <w:rPr>
+          <w:rFonts w:ascii="Times New Roman" w:hAnsi="Times New Roman" w:cs="Times New Roman"/>
+        </w:rPr>
+        <w:tab/>
+        <w:t xml:space="preserve">Ya en 1497 existía en este emplazamiento una iglesia de origen medieval, anterior al que se puede observar actualmente. Lo poco que se conoce de dicha iglesia es gracias a las fuentes documentales que hablan sobre la construcción actual y en las que se menciona la existencia de una iglesia anterior de medianas proporciones, con 40 pies de ancho, con orientación este-oste, posiblemente de tres naves y en la actualidad los restos conforman la actual sacristía. </w:t>
+      </w:r>
+    </w:p>
+    <w:p>
+      <w:pPr>
+        <w:keepNext/>
+        <w:spacing w:after="180"/>
+        <w:jc w:val="center"/>
+        <w:rPr>
+          <w:rFonts w:ascii="Times New Roman" w:hAnsi="Times New Roman" w:cs="Times New Roman"/>
+        </w:rPr>
+      </w:pPr>
+      <w:r>
+        <w:rPr>
+          <w:rFonts w:ascii="Times New Roman" w:hAnsi="Times New Roman" w:cs="Times New Roman"/>
+          <w:noProof/>
+        </w:rPr>
+        <w:drawing>
+          <wp:inline distT="0" distB="0" distL="0" distR="0" wp14:anchorId="59FCEDA2" wp14:editId="57355902">
+            <wp:extent cx="3276600" cy="2184400"/>
+            <wp:effectExtent l="0" t="0" r="0" b="6350"/>
+            <wp:docPr id="994855566" name="Imagen 10"/>
+            <wp:cNvGraphicFramePr>
+              <a:graphicFrameLocks xmlns:a="http://schemas.openxmlformats.org/drawingml/2006/main" noChangeAspect="1"/>
+            </wp:cNvGraphicFramePr>
+            <a:graphic xmlns:a="http://schemas.openxmlformats.org/drawingml/2006/main">
+              <a:graphicData uri="http://schemas.openxmlformats.org/drawingml/2006/picture">
+                <pic:pic xmlns:pic="http://schemas.openxmlformats.org/drawingml/2006/picture">
+                  <pic:nvPicPr>
+                    <pic:cNvPr id="0" name="Picture 6"/>
+                    <pic:cNvPicPr>
+                      <a:picLocks noChangeAspect="1" noChangeArrowheads="1"/>
+                    </pic:cNvPicPr>
+                  </pic:nvPicPr>
+                  <pic:blipFill>
+                    <a:blip r:embed="rId18" cstate="print">
+                      <a:extLst>
+                        <a:ext uri="{28A0092B-C50C-407E-A947-70E740481C1C}">
+                          <a14:useLocalDpi xmlns:a14="http://schemas.microsoft.com/office/drawing/2010/main" val="0"/>
+                        </a:ext>
+                      </a:extLst>
+                    </a:blip>
+                    <a:srcRect/>
+                    <a:stretch>
+                      <a:fillRect/>
+                    </a:stretch>
+                  </pic:blipFill>
+                  <pic:spPr bwMode="auto">
+                    <a:xfrm>
+                      <a:off x="0" y="0"/>
+                      <a:ext cx="3276903" cy="2184602"/>
+                    </a:xfrm>
+                    <a:prstGeom prst="rect">
+                      <a:avLst/>
+                    </a:prstGeom>
+                    <a:noFill/>
+                    <a:ln>
+                      <a:noFill/>
+                    </a:ln>
+                  </pic:spPr>
+                </pic:pic>
+              </a:graphicData>
+            </a:graphic>
+          </wp:inline>
+        </w:drawing>
+      </w:r>
+    </w:p>
+    <w:p>
+      <w:pPr>
+        <w:pStyle w:val="Descripcin"/>
+        <w:spacing w:after="180"/>
+        <w:jc w:val="center"/>
+        <w:rPr>
+          <w:rFonts w:ascii="Times New Roman" w:hAnsi="Times New Roman" w:cs="Times New Roman"/>
+        </w:rPr>
+      </w:pPr>
+      <w:r>
+        <w:rPr>
+          <w:rFonts w:ascii="Times New Roman" w:hAnsi="Times New Roman" w:cs="Times New Roman"/>
+        </w:rPr>
+        <w:t xml:space="preserve">Figura </w:t>
+      </w:r>
+      <w:r>
+        <w:rPr>
+          <w:rFonts w:ascii="Times New Roman" w:hAnsi="Times New Roman" w:cs="Times New Roman"/>
+        </w:rPr>
+        <w:fldChar w:fldCharType="begin"/>
+      </w:r>
+      <w:r>
+        <w:rPr>
+          <w:rFonts w:ascii="Times New Roman" w:hAnsi="Times New Roman" w:cs="Times New Roman"/>
+        </w:rPr>
+        <w:instrText xml:space="preserve"> SEQ Figura \* ARABIC </w:instrText>
+      </w:r>
+      <w:r>
+        <w:rPr>
+          <w:rFonts w:ascii="Times New Roman" w:hAnsi="Times New Roman" w:cs="Times New Roman"/>
+        </w:rPr>
+        <w:fldChar w:fldCharType="separate"/>
+      </w:r>
+      <w:r>
+        <w:rPr>
+          <w:rFonts w:ascii="Times New Roman" w:hAnsi="Times New Roman" w:cs="Times New Roman"/>
+          <w:noProof/>
+        </w:rPr>
+        <w:t>14</w:t>
+      </w:r>
+      <w:r>
+        <w:rPr>
+          <w:rFonts w:ascii="Times New Roman" w:hAnsi="Times New Roman" w:cs="Times New Roman"/>
+          <w:noProof/>
+        </w:rPr>
+        <w:fldChar w:fldCharType="end"/>
+      </w:r>
+      <w:r>
+        <w:rPr>
+          <w:rFonts w:ascii="Times New Roman" w:hAnsi="Times New Roman" w:cs="Times New Roman"/>
+        </w:rPr>
+        <w:t>. Recreación hecha con inteligencia artificial</w:t>
+      </w:r>
+    </w:p>
+    <w:p>
+      <w:pPr>
+        <w:spacing w:after="180"/>
+        <w:jc w:val="both"/>
+        <w:rPr>
+          <w:rFonts w:ascii="Times New Roman" w:hAnsi="Times New Roman" w:cs="Times New Roman"/>
+        </w:rPr>
+      </w:pPr>
+      <w:r>
+        <w:rPr>
+          <w:rFonts w:ascii="Times New Roman" w:hAnsi="Times New Roman" w:cs="Times New Roman"/>
+        </w:rPr>
+        <w:tab/>
+      </w:r>
+      <w:commentRangeStart w:id="23"/>
+      <w:r>
+        <w:rPr>
+          <w:rFonts w:ascii="Times New Roman" w:hAnsi="Times New Roman" w:cs="Times New Roman"/>
+        </w:rPr>
+        <w:t xml:space="preserve">A la hora de construir el escenario, se ha representado la iglesia de Nuestra Señora de Rocamador como uno de los principales espacios del capítulo final, incluyendo tanto su volumen exterior como el espacio interior destinado a representar los acontecimientos relacionados con la celebración del matrimonio. </w:t>
+      </w:r>
+      <w:commentRangeEnd w:id="23"/>
+      <w:r>
+        <w:rPr>
+          <w:rStyle w:val="Refdecomentario"/>
+          <w:rFonts w:ascii="Times New Roman" w:hAnsi="Times New Roman" w:cs="Times New Roman"/>
+          <w:sz w:val="24"/>
+          <w:szCs w:val="24"/>
+        </w:rPr>
+        <w:commentReference w:id="23"/>
+      </w:r>
+    </w:p>
+    <w:p>
+      <w:pPr>
+        <w:spacing w:after="180"/>
+        <w:jc w:val="center"/>
+        <w:rPr>
+          <w:rFonts w:ascii="Times New Roman" w:hAnsi="Times New Roman" w:cs="Times New Roman"/>
+        </w:rPr>
+      </w:pPr>
+      <w:r>
+        <w:rPr>
+          <w:rFonts w:ascii="Times New Roman" w:hAnsi="Times New Roman" w:cs="Times New Roman"/>
+        </w:rPr>
+        <w:t>[Foto del modelado]</w:t>
+      </w:r>
+    </w:p>
+    <w:p>
+      <w:pPr>
+        <w:spacing w:after="180"/>
+        <w:jc w:val="center"/>
+        <w:rPr>
+          <w:rFonts w:ascii="Times New Roman" w:hAnsi="Times New Roman" w:cs="Times New Roman"/>
+        </w:rPr>
+      </w:pPr>
+    </w:p>
+    <w:p/>
     <w:sectPr>
       <w:pgSz w:w="11906" w:h="16838"/>
       <w:pgMar w:top="1417" w:right="1701" w:bottom="1417" w:left="1701" w:header="708" w:footer="708" w:gutter="0"/>
@@ -5088,6 +8302,38 @@
       </w:r>
       <w:r>
         <w:t>Hablar de los bautismos de los Indios</w:t>
+      </w:r>
+    </w:p>
+  </w:comment>
+  <w:comment w:id="21" w:author="Laura Facenda Estrella" w:date="2026-08-27T21:08:00Z" w:initials="LF">
+    <w:p>
+      <w:pPr>
+        <w:pStyle w:val="Textocomentario"/>
+      </w:pPr>
+      <w:r>
+        <w:rPr>
+          <w:rStyle w:val="Refdecomentario"/>
+        </w:rPr>
+        <w:annotationRef/>
+      </w:r>
+      <w:r>
+        <w:t>Nao nao nao</w:t>
+      </w:r>
+    </w:p>
+  </w:comment>
+  <w:comment w:id="23" w:author="Laura Facenda Estrella" w:date="2026-08-19T14:25:00Z" w:initials="LF">
+    <w:p>
+      <w:pPr>
+        <w:pStyle w:val="Textocomentario"/>
+      </w:pPr>
+      <w:r>
+        <w:rPr>
+          <w:rStyle w:val="Refdecomentario"/>
+        </w:rPr>
+        <w:annotationRef/>
+      </w:r>
+      <w:r>
+        <w:t>Revisar</w:t>
       </w:r>
     </w:p>
   </w:comment>
@@ -5111,6 +8357,8 @@
   <w15:commentEx w15:paraId="776D7E5C" w15:done="0"/>
   <w15:commentEx w15:paraId="1EDB3855" w15:done="0"/>
   <w15:commentEx w15:paraId="72931AD7" w15:done="0"/>
+  <w15:commentEx w15:paraId="0F32CD28" w15:paraIdParent="72931AD7" w15:done="0"/>
+  <w15:commentEx w15:paraId="34A496EA" w15:done="0"/>
 </w15:commentsEx>
 </file>
 
@@ -5131,6 +8379,8 @@
   <w16cex:commentExtensible w16cex:durableId="7D6A5F9C" w16cex:dateUtc="2026-08-12T14:58:00Z"/>
   <w16cex:commentExtensible w16cex:durableId="787C9763" w16cex:dateUtc="2026-08-12T14:56:00Z"/>
   <w16cex:commentExtensible w16cex:durableId="78AC2C67" w16cex:dateUtc="2026-08-12T15:07:00Z"/>
+  <w16cex:commentExtensible w16cex:durableId="0806C522" w16cex:dateUtc="2026-08-27T19:08:00Z"/>
+  <w16cex:commentExtensible w16cex:durableId="732F9D00" w16cex:dateUtc="2026-08-19T12:25:00Z"/>
 </w16cex:commentsExtensible>
 </file>
 
@@ -5151,6 +8401,8 @@
   <w16cid:commentId w16cid:paraId="776D7E5C" w16cid:durableId="7D6A5F9C"/>
   <w16cid:commentId w16cid:paraId="1EDB3855" w16cid:durableId="787C9763"/>
   <w16cid:commentId w16cid:paraId="72931AD7" w16cid:durableId="78AC2C67"/>
+  <w16cid:commentId w16cid:paraId="0F32CD28" w16cid:durableId="0806C522"/>
+  <w16cid:commentId w16cid:paraId="34A496EA" w16cid:durableId="732F9D00"/>
 </w16cid:commentsIds>
 </file>
 
@@ -6286,6 +9538,25 @@
       <w:spacing w:after="100"/>
     </w:pPr>
   </w:style>
+  <w:style w:type="paragraph" w:styleId="Descripcin">
+    <w:name w:val="caption"/>
+    <w:basedOn w:val="Normal"/>
+    <w:next w:val="Normal"/>
+    <w:uiPriority w:val="35"/>
+    <w:unhideWhenUsed/>
+    <w:qFormat/>
+    <w:rsid w:val="00DB7CA6"/>
+    <w:pPr>
+      <w:spacing w:after="200" w:line="240" w:lineRule="auto"/>
+    </w:pPr>
+    <w:rPr>
+      <w:i/>
+      <w:iCs/>
+      <w:color w:val="0E2841" w:themeColor="text2"/>
+      <w:sz w:val="18"/>
+      <w:szCs w:val="18"/>
+    </w:rPr>
+  </w:style>
 </w:styles>
 </file>
 

</xml_diff>

<commit_message>
arte niños e interfaces
</commit_message>
<xml_diff>
--- a/GUION.docx
+++ b/GUION.docx
@@ -6593,6 +6593,245 @@
       <w:pPr>
         <w:jc w:val="both"/>
       </w:pPr>
+      <w:r>
+        <w:rPr>
+          <w:b/>
+          <w:bCs/>
+        </w:rPr>
+        <w:t>GINÉS:</w:t>
+      </w:r>
+      <w:r>
+        <w:t xml:space="preserve"> Ya se acerca el desenlace, la historia ya está en su final, pues dos coronas se preparan para un enlace celebrar.</w:t>
+      </w:r>
+    </w:p>
+    <w:p>
+      <w:pPr>
+        <w:jc w:val="both"/>
+      </w:pPr>
+      <w:r>
+        <w:t>Valencia de Alcántara aguarda, villa de frontera y paso, donde Castilla y Portugal hoy estrecharán sus lazos.</w:t>
+      </w:r>
+    </w:p>
+    <w:p>
+      <w:pPr>
+        <w:jc w:val="both"/>
+      </w:pPr>
+      <w:r>
+        <w:t>Llegan nobles y enviados, entre festejos y algarabía, pues Isabel y don Manuel, han de unirse en este día.</w:t>
+      </w:r>
+    </w:p>
+    <w:p>
+      <w:pPr>
+        <w:jc w:val="both"/>
+      </w:pPr>
+      <w:r>
+        <w:t>Todo aquello preparado, cada carta y cada viaje, encuentra al fin su destino con la llegada del enlace.</w:t>
+      </w:r>
+    </w:p>
+    <w:p>
+      <w:pPr>
+        <w:jc w:val="both"/>
+      </w:pPr>
+      <w:r>
+        <w:t>Mas no adelantemos hechos, ni demos la historia acabada, que aún queda un último acto antes de cerrar la jornada.</w:t>
+      </w:r>
+    </w:p>
+    <w:p>
+      <w:pPr>
+        <w:jc w:val="both"/>
+        <w:rPr>
+          <w:i/>
+          <w:iCs/>
+        </w:rPr>
+      </w:pPr>
+      <w:r>
+        <w:rPr>
+          <w:i/>
+          <w:iCs/>
+        </w:rPr>
+        <w:t>Fundido a negro</w:t>
+      </w:r>
+    </w:p>
+    <w:p>
+      <w:pPr>
+        <w:jc w:val="both"/>
+      </w:pPr>
+      <w:r>
+        <w:rPr>
+          <w:b/>
+          <w:bCs/>
+        </w:rPr>
+        <w:t>HERALDO:</w:t>
+      </w:r>
+      <w:r>
+        <w:t xml:space="preserve"> Ya vengo a hacer el encargo que la reina me encomienda, revisar que está en orden el lugar del casamiento, y que ese dichoso bufón traiga todo lo mandado.</w:t>
+      </w:r>
+    </w:p>
+    <w:p>
+      <w:pPr>
+        <w:jc w:val="both"/>
+      </w:pPr>
+      <w:r>
+        <w:t>¡Eh tú! A ti te quería yo ver, que si por poco fuera llegas después de la boda.</w:t>
+      </w:r>
+    </w:p>
+    <w:p>
+      <w:pPr>
+        <w:jc w:val="both"/>
+      </w:pPr>
+      <w:r>
+        <w:rPr>
+          <w:b/>
+          <w:bCs/>
+        </w:rPr>
+        <w:t>BENJAMÍN:</w:t>
+      </w:r>
+      <w:r>
+        <w:t xml:space="preserve"> Perdón buen señor pero al estar usted tan enfermo </w:t>
+      </w:r>
+      <w:r>
+        <w:t>tuve que hacer su trabajo y el mío.</w:t>
+      </w:r>
+    </w:p>
+    <w:p>
+      <w:pPr>
+        <w:jc w:val="both"/>
+      </w:pPr>
+      <w:r>
+        <w:rPr>
+          <w:b/>
+          <w:bCs/>
+        </w:rPr>
+        <w:t>HERALDO:</w:t>
+      </w:r>
+      <w:r>
+        <w:t xml:space="preserve"> No te vengas tan arriba que solo diste cuatro voces, ¿y bien? ¿Traes todo lo que se te encargó?  ¿Las cintas, las especias, la música, las velas y la miel?</w:t>
+      </w:r>
+    </w:p>
+    <w:p>
+      <w:pPr>
+        <w:jc w:val="both"/>
+      </w:pPr>
+      <w:r>
+        <w:rPr>
+          <w:b/>
+          <w:bCs/>
+        </w:rPr>
+        <w:t>BENJAMÍN:</w:t>
+      </w:r>
+      <w:r>
+        <w:t xml:space="preserve"> Pero ¿de qué velas hablas? Nadie me dijo nada de miel.</w:t>
+      </w:r>
+    </w:p>
+    <w:p>
+      <w:pPr>
+        <w:jc w:val="both"/>
+      </w:pPr>
+      <w:r>
+        <w:rPr>
+          <w:b/>
+          <w:bCs/>
+        </w:rPr>
+        <w:t>HERALDO:</w:t>
+      </w:r>
+      <w:r>
+        <w:t xml:space="preserve"> Dame lo que tengas y hazte con lo que te falte, pero rápido, pues ya está todo preparado y es lo único que falta para contentar a sus majestades.</w:t>
+      </w:r>
+    </w:p>
+    <w:p>
+      <w:pPr>
+        <w:jc w:val="both"/>
+        <w:rPr>
+          <w:i/>
+          <w:iCs/>
+        </w:rPr>
+      </w:pPr>
+      <w:r>
+        <w:rPr>
+          <w:i/>
+          <w:iCs/>
+        </w:rPr>
+        <w:t>Se va el heraldo y llegan 3 mozas cantando…</w:t>
+      </w:r>
+    </w:p>
+    <w:p>
+      <w:pPr>
+        <w:jc w:val="both"/>
+        <w:rPr>
+          <w:i/>
+          <w:iCs/>
+        </w:rPr>
+      </w:pPr>
+      <w:r>
+        <w:rPr>
+          <w:i/>
+          <w:iCs/>
+        </w:rPr>
+        <w:t>ESTE VINO ES UN BUEN VINO VINO GENEROSO QUE TE ALEGRA NUESTRA VIDA Y LA DE LOS OTROS, ESTA COPA TIENE VINO DE MARVAO Y SI TE LA BEEEEEBES TE VAS PA’ LOS LAOS</w:t>
+      </w:r>
+      <w:r>
+        <w:rPr>
+          <w:i/>
+          <w:iCs/>
+        </w:rPr>
+        <w:t xml:space="preserve"> (tmb podría ser el romance de la mora cautiva)</w:t>
+      </w:r>
+    </w:p>
+    <w:p>
+      <w:pPr>
+        <w:jc w:val="both"/>
+      </w:pPr>
+      <w:r>
+        <w:rPr>
+          <w:b/>
+          <w:bCs/>
+        </w:rPr>
+        <w:t>ALMUDENA:</w:t>
+      </w:r>
+      <w:r>
+        <w:t xml:space="preserve"> ¡Corred! ¡Corred que se viene la noche encima y ya está la pompa preparada!</w:t>
+      </w:r>
+    </w:p>
+    <w:p>
+      <w:pPr>
+        <w:jc w:val="both"/>
+      </w:pPr>
+      <w:r>
+        <w:rPr>
+          <w:b/>
+          <w:bCs/>
+        </w:rPr>
+        <w:lastRenderedPageBreak/>
+        <w:t>MARISA:</w:t>
+      </w:r>
+      <w:r>
+        <w:t xml:space="preserve"> ¡Ahora viene esta con fuerte premura! Mira que te lo dije hace tiempo ya. ¡Que se nos hacía tarde y no llegábamos a la boda!</w:t>
+      </w:r>
+    </w:p>
+    <w:p>
+      <w:pPr>
+        <w:jc w:val="both"/>
+      </w:pPr>
+      <w:r>
+        <w:rPr>
+          <w:b/>
+          <w:bCs/>
+        </w:rPr>
+        <w:t>FÁTIMA:</w:t>
+      </w:r>
+      <w:r>
+        <w:t xml:space="preserve"> ¡Y lo peor de todo no es eso! Lo peor es que tenemos ya a todo el pueblo bajando la calle y nos verá de esta guisa.</w:t>
+      </w:r>
+    </w:p>
+    <w:p>
+      <w:pPr>
+        <w:jc w:val="both"/>
+      </w:pPr>
+    </w:p>
+    <w:p>
+      <w:pPr>
+        <w:jc w:val="both"/>
+      </w:pPr>
     </w:p>
     <w:p>
       <w:pPr>
@@ -6910,7 +7149,7 @@
           <w:noProof/>
         </w:rPr>
         <w:drawing>
-          <wp:inline distT="0" distB="0" distL="0" distR="0" wp14:anchorId="3C56B46E" wp14:editId="6554BCA5">
+          <wp:inline distT="0" distB="0" distL="0" distR="0" wp14:anchorId="3C56B46E" wp14:editId="6EA830AA">
             <wp:extent cx="3178629" cy="2492375"/>
             <wp:effectExtent l="0" t="0" r="3175" b="3175"/>
             <wp:docPr id="1838864746" name="Imagen 1"/>
@@ -7517,7 +7756,7 @@
           <w:noProof/>
         </w:rPr>
         <w:drawing>
-          <wp:inline distT="0" distB="0" distL="0" distR="0" wp14:anchorId="2659DA76" wp14:editId="601EAE44">
+          <wp:inline distT="0" distB="0" distL="0" distR="0" wp14:anchorId="2659DA76" wp14:editId="33E4E168">
             <wp:extent cx="3227844" cy="3143250"/>
             <wp:effectExtent l="0" t="0" r="0" b="0"/>
             <wp:docPr id="199490778" name="Imagen 1"/>

</xml_diff>

<commit_message>
mecanica puzzle y guadalupe
</commit_message>
<xml_diff>
--- a/GUION.docx
+++ b/GUION.docx
@@ -6561,15 +6561,30 @@
         <w:jc w:val="both"/>
       </w:pPr>
       <w:r>
-        <w:t>Aparecen 3/4 mozas, cada una con algo distinto, una dice que tiene un tarro de miel, otra que tiene información importante que le dijo su marido (carta sobre la enfermedad de Juan) y otra le dice dónde puede conseguir las velas</w:t>
-      </w:r>
-    </w:p>
-    <w:p>
-      <w:pPr>
-        <w:jc w:val="both"/>
-      </w:pPr>
-      <w:r>
-        <w:t>Bufón sube al castillo, en la torre hay una colmena de donde sacar miel – puzle R u otro puzle de encajar piezas (en función del tiempo), en los establos está el marido de la mujer, quien le da la carta y le encarga dársela a la reina, hablar con npcs para averiguar dónde se encuentra, y las velas las vende un vendedor ambulante a cambio de un gatito (conseguido en el segundo capítulo capítulo)</w:t>
+        <w:t xml:space="preserve">Aparecen 3/4 mozas, cada una con algo distinto, una dice que </w:t>
+      </w:r>
+      <w:r>
+        <w:t>sabe dónde hay miel</w:t>
+      </w:r>
+      <w:r>
+        <w:t>, otra que tiene información importante que le dijo su marido (carta sobre la enfermedad de Juan) y otra le dice dónde puede conseguir las velas</w:t>
+      </w:r>
+    </w:p>
+    <w:p>
+      <w:pPr>
+        <w:jc w:val="both"/>
+      </w:pPr>
+      <w:r>
+        <w:t xml:space="preserve">Bufón sube al castillo, en la torre hay una colmena de donde sacar miel – puzle R u otro puzle de encajar piezas (en función del tiempo), en los establos está el marido de la mujer, quien le da la carta y le encarga dársela a la reina, </w:t>
+      </w:r>
+      <w:r>
+        <w:t>espiar</w:t>
+      </w:r>
+      <w:r>
+        <w:t xml:space="preserve"> con npcs para averiguar dónde se encuentra, y las velas las vende un vendedor ambulante a</w:t>
+      </w:r>
+      <w:r>
+        <w:t>l responder preguntas</w:t>
       </w:r>
     </w:p>
     <w:p>
@@ -6826,7 +6841,1017 @@
     <w:p>
       <w:pPr>
         <w:jc w:val="both"/>
-      </w:pPr>
+        <w:rPr>
+          <w:i/>
+          <w:iCs/>
+        </w:rPr>
+      </w:pPr>
+      <w:r>
+        <w:rPr>
+          <w:i/>
+          <w:iCs/>
+        </w:rPr>
+        <w:t>Llegan con el Bufón y comienza conversación con él</w:t>
+      </w:r>
+    </w:p>
+    <w:p>
+      <w:pPr>
+        <w:jc w:val="both"/>
+      </w:pPr>
+      <w:r>
+        <w:rPr>
+          <w:b/>
+          <w:bCs/>
+        </w:rPr>
+        <w:t>BUFÓN:</w:t>
+      </w:r>
+      <w:r>
+        <w:t xml:space="preserve"> ¡Calma, doncellas! Pero por nuestro Señor, ¿qué estrépito es este?</w:t>
+      </w:r>
+    </w:p>
+    <w:p>
+      <w:pPr>
+        <w:jc w:val="both"/>
+      </w:pPr>
+      <w:r>
+        <w:rPr>
+          <w:b/>
+          <w:bCs/>
+        </w:rPr>
+        <w:t>FÁTIMA:</w:t>
+      </w:r>
+      <w:r>
+        <w:t xml:space="preserve"> ¡Ay! Discúlpeme vuestra Merced. Intentábamos llegar a nuestras casas.</w:t>
+      </w:r>
+    </w:p>
+    <w:p>
+      <w:pPr>
+        <w:jc w:val="both"/>
+      </w:pPr>
+      <w:r>
+        <w:rPr>
+          <w:b/>
+          <w:bCs/>
+        </w:rPr>
+        <w:t>MARISA:</w:t>
+      </w:r>
+      <w:r>
+        <w:t xml:space="preserve"> Pero díganos su nombre, para que podamos dirigirnos a usted y así ayudarle en tooooodo lo que necesite…</w:t>
+      </w:r>
+    </w:p>
+    <w:p>
+      <w:pPr>
+        <w:jc w:val="both"/>
+      </w:pPr>
+      <w:r>
+        <w:rPr>
+          <w:b/>
+          <w:bCs/>
+        </w:rPr>
+        <w:t>BUFÓN:</w:t>
+      </w:r>
+      <w:r>
+        <w:t xml:space="preserve"> Mi nombre es Benjamín, Bufón Real, para servirles. Vengo de Castilla mandado por sus majestades con la misión de asegurarme de que todo esté preparado para la Boda Regia que se dará aquí y en breve plazo…</w:t>
+      </w:r>
+    </w:p>
+    <w:p>
+      <w:pPr>
+        <w:jc w:val="both"/>
+      </w:pPr>
+      <w:r>
+        <w:rPr>
+          <w:b/>
+          <w:bCs/>
+        </w:rPr>
+        <w:t>ALMUDENA:</w:t>
+      </w:r>
+      <w:r>
+        <w:t xml:space="preserve"> Breve plazo, sí. Pero aún queda algo de tiempo y si tiene a bien acompañarme a mi casa, podré ofrecerle un refrigerio para recomponerse de tan calurosa jornada…</w:t>
+      </w:r>
+    </w:p>
+    <w:p>
+      <w:pPr>
+        <w:jc w:val="both"/>
+      </w:pPr>
+      <w:r>
+        <w:rPr>
+          <w:b/>
+          <w:bCs/>
+        </w:rPr>
+        <w:t xml:space="preserve">BUFÓN: </w:t>
+      </w:r>
+      <w:r>
+        <w:t xml:space="preserve">Gracias por el </w:t>
+      </w:r>
+      <w:r>
+        <w:t>ofrecimiento,</w:t>
+      </w:r>
+      <w:r>
+        <w:t xml:space="preserve"> pero me veo en la obligación de rechazarlo. Cuando pensé haber acabado mi tarea me encuentro con que no está todo preparado, que si velas, que si miel, de dónde voy a sacar yo tales cosas en un día festivo como hoy.</w:t>
+      </w:r>
+    </w:p>
+    <w:p>
+      <w:pPr>
+        <w:jc w:val="both"/>
+      </w:pPr>
+      <w:r>
+        <w:rPr>
+          <w:b/>
+          <w:bCs/>
+        </w:rPr>
+        <w:t>MARISA:</w:t>
+      </w:r>
+      <w:r>
+        <w:t xml:space="preserve"> No se preocupe mi buen señor, si miel es lo que precisas me sé de la existencia de un panal en la Torre del Homenaje, puede probar suerte allí.</w:t>
+      </w:r>
+    </w:p>
+    <w:p>
+      <w:pPr>
+        <w:jc w:val="both"/>
+      </w:pPr>
+      <w:r>
+        <w:rPr>
+          <w:b/>
+          <w:bCs/>
+        </w:rPr>
+        <w:t>ALMUDENA:</w:t>
+      </w:r>
+      <w:r>
+        <w:t xml:space="preserve"> Pues yo he oído que un vendedor ambulante se aproxima a la villa, tal vez él tenga velas para vender.</w:t>
+      </w:r>
+    </w:p>
+    <w:p>
+      <w:pPr>
+        <w:jc w:val="both"/>
+      </w:pPr>
+      <w:r>
+        <w:rPr>
+          <w:b/>
+          <w:bCs/>
+        </w:rPr>
+        <w:t>FÁTIMA:</w:t>
+      </w:r>
+      <w:r>
+        <w:t xml:space="preserve"> Pero ¿qué decís insensatas? Qué importa la miel o las velas si no hay boda. Mi marido, que se encuentra en los establos, me ha dicho que ha recibido una carta que se ha de entregar a la reina, dicen que trae nuevas sobre la enfermedad del príncipe Juan.</w:t>
+      </w:r>
+    </w:p>
+    <w:p>
+      <w:pPr>
+        <w:jc w:val="both"/>
+      </w:pPr>
+      <w:r>
+        <w:rPr>
+          <w:b/>
+          <w:bCs/>
+        </w:rPr>
+        <w:t>MARISA:</w:t>
+      </w:r>
+      <w:r>
+        <w:t xml:space="preserve"> Calla mujer, que boda va a haber. Y tú, si tienes dudas al respecto te recomiendo hacerte con ese mensaje y hablar si puedes, con sus majestades. Quizás te alivien los pesares.</w:t>
+      </w:r>
+    </w:p>
+    <w:p>
+      <w:pPr>
+        <w:jc w:val="both"/>
+      </w:pPr>
+      <w:r>
+        <w:rPr>
+          <w:b/>
+          <w:bCs/>
+        </w:rPr>
+        <w:t>ALMUDENA:</w:t>
+      </w:r>
+      <w:r>
+        <w:t xml:space="preserve"> </w:t>
+      </w:r>
+      <w:r>
+        <w:t>Y ahora muchachas espabilad, que tenemos que ir a nuestras casas si queremos llegar a la boda.</w:t>
+      </w:r>
+    </w:p>
+    <w:p>
+      <w:pPr>
+        <w:jc w:val="both"/>
+      </w:pPr>
+      <w:r>
+        <w:rPr>
+          <w:b/>
+          <w:bCs/>
+        </w:rPr>
+        <w:t>BUFÓN:</w:t>
+      </w:r>
+      <w:r>
+        <w:t xml:space="preserve"> Muchas gracias</w:t>
+      </w:r>
+      <w:r>
+        <w:t xml:space="preserve"> por vuestra amabilidad encantadoras damas, me ha servido de mucho esta agradable charla.</w:t>
+      </w:r>
+    </w:p>
+    <w:p>
+      <w:pPr>
+        <w:jc w:val="both"/>
+      </w:pPr>
+      <w:r>
+        <w:lastRenderedPageBreak/>
+        <w:t>Se van las mozas y bufón debería ir buscando por el castillo</w:t>
+      </w:r>
+    </w:p>
+    <w:p>
+      <w:pPr>
+        <w:jc w:val="both"/>
+      </w:pPr>
+      <w:r>
+        <w:t xml:space="preserve">Torre del Homenaje </w:t>
+      </w:r>
+      <w:r>
+        <w:sym w:font="Wingdings" w:char="F0E0"/>
+      </w:r>
+      <w:r>
+        <w:t xml:space="preserve"> son abejas, no hay diálogo como tal, si acaso de uy este debe ser el panal del que me hablaron y poco más</w:t>
+      </w:r>
+    </w:p>
+    <w:p>
+      <w:pPr>
+        <w:jc w:val="both"/>
+      </w:pPr>
+      <w:r>
+        <w:t xml:space="preserve">Vendedor ambulante </w:t>
+      </w:r>
+      <w:r>
+        <w:sym w:font="Wingdings" w:char="F0E0"/>
+      </w:r>
+      <w:r>
+        <w:t xml:space="preserve"> salta diálogo al llegar a él, entrar en una zona concreta</w:t>
+      </w:r>
+    </w:p>
+    <w:p>
+      <w:pPr>
+        <w:jc w:val="both"/>
+      </w:pPr>
+      <w:r>
+        <w:rPr>
+          <w:b/>
+          <w:bCs/>
+        </w:rPr>
+        <w:t>ANSELMO:</w:t>
+      </w:r>
+      <w:r>
+        <w:t xml:space="preserve"> Gente de bien, humildes vecinos de… ¡Valencia de Alcántara! Pues hasta aquí llego con la fe de que sepan que estos productos milagrosos puedan devolver la felicidad a cualquiera de ustedes.</w:t>
+      </w:r>
+    </w:p>
+    <w:p>
+      <w:pPr>
+        <w:jc w:val="both"/>
+      </w:pPr>
+      <w:r>
+        <w:rPr>
+          <w:b/>
+          <w:bCs/>
+        </w:rPr>
+        <w:t>BUFÓN:</w:t>
+      </w:r>
+      <w:r>
+        <w:t xml:space="preserve"> ¡Alto ahí!</w:t>
+      </w:r>
+    </w:p>
+    <w:p>
+      <w:pPr>
+        <w:jc w:val="both"/>
+      </w:pPr>
+      <w:r>
+        <w:rPr>
+          <w:b/>
+          <w:bCs/>
+        </w:rPr>
+        <w:t>ANSELMO:</w:t>
+      </w:r>
+      <w:r>
+        <w:t xml:space="preserve"> Miren, por aquí tenemos un claro ejemplar de persona que necesita de mis bálsamos.</w:t>
+      </w:r>
+    </w:p>
+    <w:p>
+      <w:pPr>
+        <w:jc w:val="both"/>
+      </w:pPr>
+      <w:r>
+        <w:rPr>
+          <w:b/>
+          <w:bCs/>
+        </w:rPr>
+        <w:t>BUFÓN:</w:t>
+      </w:r>
+      <w:r>
+        <w:t xml:space="preserve"> He dicho que alto ahí. Deje de instigar a las gentes de la villa con su verborrea, pícaro parlanchín.</w:t>
+      </w:r>
+    </w:p>
+    <w:p>
+      <w:pPr>
+        <w:jc w:val="both"/>
+      </w:pPr>
+      <w:r>
+        <w:rPr>
+          <w:b/>
+          <w:bCs/>
+        </w:rPr>
+        <w:t>ANSELMO:</w:t>
+      </w:r>
+      <w:r>
+        <w:t xml:space="preserve"> Bien claro está que necesita de un brebaje para la ira contenida… no se preocupe que tengo lo que andaba buscando.</w:t>
+      </w:r>
+    </w:p>
+    <w:p>
+      <w:pPr>
+        <w:jc w:val="both"/>
+      </w:pPr>
+      <w:r>
+        <w:rPr>
+          <w:b/>
+          <w:bCs/>
+        </w:rPr>
+        <w:t>BUFÓN:</w:t>
+      </w:r>
+      <w:r>
+        <w:rPr>
+          <w:b/>
+          <w:bCs/>
+        </w:rPr>
+        <w:t xml:space="preserve"> </w:t>
+      </w:r>
+      <w:r>
+        <w:t xml:space="preserve">Lo único que yo ando buscando son unas velas para la boda de sus majestades. Que hoy acaece el quizá más importante acto que la historia puede regalar a esta población. </w:t>
+      </w:r>
+      <w:r>
+        <w:t>De modo que como no se espabile y ahueque el ala de aquí, va a pasar la noche</w:t>
+      </w:r>
+      <w:r>
+        <w:t xml:space="preserve"> y buena parte del día entre los barrotes del calabozo.</w:t>
+      </w:r>
+    </w:p>
+    <w:p>
+      <w:pPr>
+        <w:jc w:val="both"/>
+      </w:pPr>
+      <w:r>
+        <w:rPr>
+          <w:b/>
+          <w:bCs/>
+        </w:rPr>
+        <w:t>ANSELMO:</w:t>
+      </w:r>
+      <w:r>
+        <w:t xml:space="preserve"> No diga eso mi buen señor, si lo que precisa son velas y no brebajes eso también se lo puedo proporcionar. Pero para ello tendrás que responder correctamente a mis preguntas</w:t>
+      </w:r>
+      <w:r>
+        <w:t>, tú que tanto dices saber sobre bodas y coronas.</w:t>
+      </w:r>
+    </w:p>
+    <w:p>
+      <w:pPr>
+        <w:jc w:val="both"/>
+      </w:pPr>
+    </w:p>
+    <w:p>
+      <w:pPr>
+        <w:jc w:val="both"/>
+      </w:pPr>
+    </w:p>
+    <w:p>
+      <w:pPr>
+        <w:jc w:val="both"/>
+      </w:pPr>
+      <w:r>
+        <w:rPr>
+          <w:b/>
+          <w:bCs/>
+        </w:rPr>
+        <w:t>ANSELMO:</w:t>
+      </w:r>
+      <w:r>
+        <w:t xml:space="preserve"> ¿Preparado?</w:t>
+      </w:r>
+    </w:p>
+    <w:p>
+      <w:pPr>
+        <w:jc w:val="both"/>
+      </w:pPr>
+      <w:r>
+        <w:t>¿En qué día nos encontramos hoy?</w:t>
+      </w:r>
+    </w:p>
+    <w:p>
+      <w:pPr>
+        <w:jc w:val="both"/>
+      </w:pPr>
+      <w:r>
+        <w:rPr>
+          <w:i/>
+          <w:iCs/>
+        </w:rPr>
+        <w:t>Respuestas:</w:t>
+      </w:r>
+      <w:r>
+        <w:t xml:space="preserve"> </w:t>
+      </w:r>
+      <w:r>
+        <w:rPr>
+          <w:b/>
+          <w:bCs/>
+        </w:rPr>
+        <w:t>7 de octubre de 1497</w:t>
+      </w:r>
+      <w:r>
+        <w:t>, 5 de octubre de 1495, 7 de octubre de 1490, 5 de septiembre de 1497</w:t>
+      </w:r>
+    </w:p>
+    <w:p>
+      <w:pPr>
+        <w:jc w:val="both"/>
+      </w:pPr>
+      <w:r>
+        <w:t>¿Qué dura condición pusieron para la boda?</w:t>
+      </w:r>
+    </w:p>
+    <w:p>
+      <w:pPr>
+        <w:jc w:val="both"/>
+      </w:pPr>
+      <w:r>
+        <w:rPr>
+          <w:i/>
+          <w:iCs/>
+        </w:rPr>
+        <w:t xml:space="preserve">Respuestas: </w:t>
+      </w:r>
+      <w:r>
+        <w:rPr>
+          <w:b/>
+          <w:bCs/>
+        </w:rPr>
+        <w:t>Expulsión de los judíos</w:t>
+      </w:r>
+      <w:r>
+        <w:t>, expulsión de los moros, bautismo de los indios, 50 cabezas de ganado.</w:t>
+      </w:r>
+    </w:p>
+    <w:p>
+      <w:pPr>
+        <w:jc w:val="both"/>
+      </w:pPr>
+      <w:r>
+        <w:t>Antes de con don Manuel, Isabel ya había estado casada con alguien portugués, ¿con quién?</w:t>
+      </w:r>
+    </w:p>
+    <w:p>
+      <w:pPr>
+        <w:jc w:val="both"/>
+      </w:pPr>
+      <w:r>
+        <w:rPr>
+          <w:i/>
+          <w:iCs/>
+        </w:rPr>
+        <w:lastRenderedPageBreak/>
+        <w:t>Respuestas:</w:t>
+      </w:r>
+      <w:r>
+        <w:t xml:space="preserve"> </w:t>
+      </w:r>
+      <w:r>
+        <w:rPr>
+          <w:b/>
+          <w:bCs/>
+        </w:rPr>
+        <w:t>Su sobrino Alfonso, príncipe heredero</w:t>
+      </w:r>
+      <w:r>
+        <w:t>; Su hermano Alfonso, rey de Portugal; Su primo Fernando, rey de Portugal; Su primo Alfonso, rey de Portugal.</w:t>
+      </w:r>
+    </w:p>
+    <w:p>
+      <w:pPr>
+        <w:jc w:val="both"/>
+      </w:pPr>
+      <w:r>
+        <w:t>¿Y en qué año tuvo lugar dicho matrimonio?</w:t>
+      </w:r>
+    </w:p>
+    <w:p>
+      <w:pPr>
+        <w:jc w:val="both"/>
+      </w:pPr>
+      <w:r>
+        <w:rPr>
+          <w:i/>
+          <w:iCs/>
+        </w:rPr>
+        <w:t xml:space="preserve">Respuestas: </w:t>
+      </w:r>
+      <w:r>
+        <w:t>1490, 1491, 1492, 1495.</w:t>
+      </w:r>
+    </w:p>
+    <w:p>
+      <w:pPr>
+        <w:jc w:val="both"/>
+      </w:pPr>
+      <w:r>
+        <w:t>¿Por qué crees que los reyes han elegido este</w:t>
+      </w:r>
+      <w:r>
+        <w:t xml:space="preserve"> sitio como lugar del casamiento?</w:t>
+      </w:r>
+    </w:p>
+    <w:p>
+      <w:pPr>
+        <w:jc w:val="both"/>
+      </w:pPr>
+      <w:r>
+        <w:rPr>
+          <w:i/>
+          <w:iCs/>
+        </w:rPr>
+        <w:t>Respuestas:</w:t>
+      </w:r>
+      <w:r>
+        <w:rPr>
+          <w:b/>
+          <w:bCs/>
+        </w:rPr>
+        <w:t xml:space="preserve"> Por su proximidad con la frontera castellano-portuguesa</w:t>
+      </w:r>
+      <w:r>
+        <w:t xml:space="preserve">, </w:t>
+      </w:r>
+      <w:r>
+        <w:t>Por haber sido elegida tradicionalmente para los matrimonios entre ambas coronas</w:t>
+      </w:r>
+      <w:r>
+        <w:t xml:space="preserve">; </w:t>
+      </w:r>
+      <w:r>
+        <w:t>Por encontrarse a medio camino entre Toledo y Lisboa</w:t>
+      </w:r>
+      <w:r>
+        <w:t xml:space="preserve">; </w:t>
+      </w:r>
+      <w:r>
+        <w:t>Porque pertenecía a la Corona portuguesa y facilitaba la llegada de Manuel I.</w:t>
+      </w:r>
+    </w:p>
+    <w:p>
+      <w:pPr>
+        <w:jc w:val="both"/>
+      </w:pPr>
+      <w:r>
+        <w:rPr>
+          <w:b/>
+          <w:bCs/>
+        </w:rPr>
+        <w:t>ANSELMO:</w:t>
+      </w:r>
+      <w:r>
+        <w:t xml:space="preserve"> Veo que conoces bien los entresijos de la realeza, ya te dejo de entretener y toma las prometidas velas.</w:t>
+      </w:r>
+    </w:p>
+    <w:p>
+      <w:pPr>
+        <w:jc w:val="both"/>
+      </w:pPr>
+      <w:r>
+        <w:rPr>
+          <w:i/>
+          <w:iCs/>
+        </w:rPr>
+        <w:t>Si falla</w:t>
+      </w:r>
+    </w:p>
+    <w:p>
+      <w:pPr>
+        <w:jc w:val="both"/>
+      </w:pPr>
+      <w:r>
+        <w:rPr>
+          <w:b/>
+          <w:bCs/>
+        </w:rPr>
+        <w:t>ANSELMO:</w:t>
+      </w:r>
+      <w:r>
+        <w:t xml:space="preserve"> Al parecer no sabes tanto como creía, quizás entre el pueblo encuentres las respuestas que te faltan.</w:t>
+      </w:r>
+    </w:p>
+    <w:p>
+      <w:pPr>
+        <w:jc w:val="both"/>
+        <w:rPr>
+          <w:i/>
+          <w:iCs/>
+        </w:rPr>
+      </w:pPr>
+      <w:r>
+        <w:rPr>
+          <w:i/>
+          <w:iCs/>
+        </w:rPr>
+        <w:t>Información sobre el tema en alguna conversación del pueblo y demás</w:t>
+      </w:r>
+    </w:p>
+    <w:p>
+      <w:pPr>
+        <w:jc w:val="both"/>
+        <w:rPr>
+          <w:i/>
+          <w:iCs/>
+        </w:rPr>
+      </w:pPr>
+      <w:r>
+        <w:rPr>
+          <w:i/>
+          <w:iCs/>
+        </w:rPr>
+        <w:t>En el establo</w:t>
+      </w:r>
+    </w:p>
+    <w:p>
+      <w:pPr>
+        <w:jc w:val="both"/>
+      </w:pPr>
+      <w:r>
+        <w:rPr>
+          <w:b/>
+          <w:bCs/>
+        </w:rPr>
+        <w:t xml:space="preserve">BUFÓN: </w:t>
+      </w:r>
+      <w:r>
+        <w:t>Creo que eres el hombre al que busco.</w:t>
+      </w:r>
+    </w:p>
+    <w:p>
+      <w:pPr>
+        <w:jc w:val="both"/>
+      </w:pPr>
+      <w:r>
+        <w:rPr>
+          <w:b/>
+          <w:bCs/>
+        </w:rPr>
+        <w:t>BARTOLOMÉ:</w:t>
+      </w:r>
+      <w:r>
+        <w:t xml:space="preserve"> ¿Qué se me requiere?</w:t>
+      </w:r>
+    </w:p>
+    <w:p>
+      <w:pPr>
+        <w:jc w:val="both"/>
+      </w:pPr>
+      <w:r>
+        <w:rPr>
+          <w:b/>
+          <w:bCs/>
+        </w:rPr>
+        <w:t>BUFÓN:</w:t>
+      </w:r>
+      <w:r>
+        <w:t xml:space="preserve"> He conocido a su encantadora mujer hace un rato diciendo no sé qué sobre una carta a entregar, si a vuesa merced le conviene puedo encargarme de hacérsela llegar a la reina.</w:t>
+      </w:r>
+    </w:p>
+    <w:p>
+      <w:pPr>
+        <w:jc w:val="both"/>
+      </w:pPr>
+      <w:r>
+        <w:rPr>
+          <w:b/>
+          <w:bCs/>
+        </w:rPr>
+        <w:t>BARTOLOMÉ:</w:t>
+      </w:r>
+      <w:r>
+        <w:t xml:space="preserve"> ¿Y tú quién eres? ¿Qué ganas tú con todo esto? ¿No serás un espía enviado por los franceses?</w:t>
+      </w:r>
+    </w:p>
+    <w:p>
+      <w:pPr>
+        <w:jc w:val="both"/>
+      </w:pPr>
+      <w:r>
+        <w:rPr>
+          <w:b/>
+          <w:bCs/>
+        </w:rPr>
+        <w:t>BUFÓN:</w:t>
+      </w:r>
+      <w:r>
+        <w:t xml:space="preserve"> No sé de qué espías me hablas. Solo soy un enviado por los reyes encargado de preparar el enlace, si es que va a haber enlace.</w:t>
+      </w:r>
+    </w:p>
+    <w:p>
+      <w:pPr>
+        <w:jc w:val="both"/>
+      </w:pPr>
+      <w:r>
+        <w:rPr>
+          <w:b/>
+          <w:bCs/>
+        </w:rPr>
+        <w:t>BARTOLOMÉ:</w:t>
+      </w:r>
+      <w:r>
+        <w:rPr>
+          <w:b/>
+          <w:bCs/>
+        </w:rPr>
+        <w:t xml:space="preserve"> </w:t>
+      </w:r>
+      <w:r>
+        <w:t>En ese caso,</w:t>
+      </w:r>
+      <w:r>
+        <w:t xml:space="preserve"> </w:t>
+      </w:r>
+      <w:r>
+        <w:t>l</w:t>
+      </w:r>
+      <w:r>
+        <w:t>as nuevas que traen esta carta</w:t>
+      </w:r>
+      <w:r>
+        <w:t xml:space="preserve"> solo han de entregarse a los reyes, no vaya a ser que caiga en malas manos y llegue a oídos de alguien que no nos convenga. </w:t>
+      </w:r>
+    </w:p>
+    <w:p>
+      <w:pPr>
+        <w:jc w:val="both"/>
+      </w:pPr>
+      <w:r>
+        <w:t>[Se abre la carta y la lee]</w:t>
+      </w:r>
+    </w:p>
+    <w:p>
+      <w:pPr>
+        <w:rPr>
+          <w:i/>
+          <w:iCs/>
+        </w:rPr>
+      </w:pPr>
+      <w:r>
+        <w:rPr>
+          <w:i/>
+          <w:iCs/>
+        </w:rPr>
+        <w:t>Conversaciones sobre dónde encontrar a la reina</w:t>
+      </w:r>
+    </w:p>
+    <w:p>
+      <w:pPr>
+        <w:jc w:val="both"/>
+      </w:pPr>
+      <w:r>
+        <w:rPr>
+          <w:b/>
+          <w:bCs/>
+        </w:rPr>
+        <w:t>BUFÓN:</w:t>
+      </w:r>
+      <w:r>
+        <w:t xml:space="preserve"> Mi reina, mi reina, noticias traigo. </w:t>
+      </w:r>
+    </w:p>
+    <w:p>
+      <w:pPr>
+        <w:jc w:val="both"/>
+      </w:pPr>
+      <w:r>
+        <w:rPr>
+          <w:b/>
+          <w:bCs/>
+        </w:rPr>
+        <w:t>ISABEL:</w:t>
+      </w:r>
+      <w:r>
+        <w:t xml:space="preserve"> Habla bufón.</w:t>
+      </w:r>
+    </w:p>
+    <w:p>
+      <w:pPr>
+        <w:jc w:val="both"/>
+      </w:pPr>
+      <w:r>
+        <w:rPr>
+          <w:b/>
+          <w:bCs/>
+        </w:rPr>
+        <w:lastRenderedPageBreak/>
+        <w:t>BUFÓN:</w:t>
+      </w:r>
+      <w:r>
+        <w:t xml:space="preserve"> Vuestro príncipe señora, vuestro príncipe real, tras empeorar las sus fiebres el alma quiere a Dios dar.</w:t>
+      </w:r>
+    </w:p>
+    <w:p>
+      <w:pPr>
+        <w:jc w:val="both"/>
+      </w:pPr>
+      <w:r>
+        <w:rPr>
+          <w:b/>
+          <w:bCs/>
+        </w:rPr>
+        <w:t>ISABEL:</w:t>
+      </w:r>
+      <w:r>
+        <w:t xml:space="preserve"> Y decidme bufón, ¿es tanta la gravedad de esas extrañas fiebres que atormentan a Don Juan?</w:t>
+      </w:r>
+    </w:p>
+    <w:p>
+      <w:pPr>
+        <w:jc w:val="both"/>
+      </w:pPr>
+      <w:r>
+        <w:rPr>
+          <w:b/>
+          <w:bCs/>
+        </w:rPr>
+        <w:t>BUFÓN:</w:t>
+      </w:r>
+      <w:r>
+        <w:t xml:space="preserve"> ¡Mucha es Reina y Señora! Pues parece que es viruela la causa de todo el mal. Mas el rey le manda unas letras donde describe el estado de nuestro infante real.</w:t>
+      </w:r>
+    </w:p>
+    <w:p>
+      <w:pPr>
+        <w:jc w:val="both"/>
+      </w:pPr>
+      <w:r>
+        <w:rPr>
+          <w:b/>
+          <w:bCs/>
+        </w:rPr>
+        <w:t>ISABEL:</w:t>
+      </w:r>
+      <w:r>
+        <w:t xml:space="preserve"> ¡Mi ángel! Dios me lo ha dado y ahora me lo quiere quitar. Duras pruebas me ha mandado y las tengo que aceptar, pero ahora me pregunto: ¿Qué pecado cometí para este castigo alcanzar?</w:t>
+      </w:r>
+    </w:p>
+    <w:p>
+      <w:pPr>
+        <w:jc w:val="both"/>
+      </w:pPr>
+      <w:r>
+        <w:rPr>
+          <w:b/>
+          <w:bCs/>
+        </w:rPr>
+        <w:t xml:space="preserve">BUFÓN: </w:t>
+      </w:r>
+      <w:r>
+        <w:t>Con vuestra venia señora con Don Manuel hablaré para posponer el enlace.</w:t>
+      </w:r>
+    </w:p>
+    <w:p>
+      <w:pPr>
+        <w:jc w:val="both"/>
+      </w:pPr>
+      <w:r>
+        <w:rPr>
+          <w:b/>
+          <w:bCs/>
+        </w:rPr>
+        <w:t>ISABEL:</w:t>
+      </w:r>
+      <w:r>
+        <w:t xml:space="preserve"> ¡Nada parecido ha de hacer! La unidad peninsular depende de aquesta boda y ningún impedimento la tiene que retrasar. Nada la Infanta ha de saber hasta entrar en Portugal. Y ahora bufón, cesemos en nuestros llantos y acudamos a su encuentro que una infanta he de casar.</w:t>
+      </w:r>
+    </w:p>
+    <w:p>
+      <w:pPr>
+        <w:jc w:val="both"/>
+        <w:rPr>
+          <w:i/>
+          <w:iCs/>
+        </w:rPr>
+      </w:pPr>
+      <w:r>
+        <w:rPr>
+          <w:i/>
+          <w:iCs/>
+        </w:rPr>
+        <w:t>Llegada a la iglesia</w:t>
+      </w:r>
+    </w:p>
+    <w:p>
+      <w:pPr>
+        <w:jc w:val="both"/>
+      </w:pPr>
+      <w:r>
+        <w:rPr>
+          <w:b/>
+          <w:bCs/>
+        </w:rPr>
+        <w:t>HERALDO:</w:t>
+      </w:r>
+      <w:r>
+        <w:t xml:space="preserve"> Veamos… Todo está preparado. No falta nada.</w:t>
+      </w:r>
+    </w:p>
+    <w:p>
+      <w:pPr>
+        <w:jc w:val="both"/>
+      </w:pPr>
+      <w:r>
+        <w:rPr>
+          <w:b/>
+          <w:bCs/>
+        </w:rPr>
+        <w:t xml:space="preserve">BUFÓN: </w:t>
+      </w:r>
+      <w:r>
+        <w:t>¿Eso significa que por fin puedo descansar?</w:t>
+      </w:r>
+    </w:p>
+    <w:p>
+      <w:pPr>
+        <w:jc w:val="both"/>
+      </w:pPr>
+      <w:r>
+        <w:rPr>
+          <w:b/>
+          <w:bCs/>
+        </w:rPr>
+        <w:t>HERALDO:</w:t>
+      </w:r>
+      <w:r>
+        <w:t xml:space="preserve"> Significa que has terminado tu trabajo. El nuestro apenas comienza.</w:t>
+      </w:r>
+    </w:p>
+    <w:p>
+      <w:pPr>
+        <w:jc w:val="both"/>
+      </w:pPr>
+      <w:r>
+        <w:rPr>
+          <w:b/>
+          <w:bCs/>
+        </w:rPr>
+        <w:t xml:space="preserve">BUFÓN: </w:t>
+      </w:r>
+      <w:r>
+        <w:t>Siempre hay una letra pequeña…</w:t>
+      </w:r>
+    </w:p>
+    <w:p>
+      <w:pPr>
+        <w:jc w:val="both"/>
+      </w:pPr>
+      <w:r>
+        <w:rPr>
+          <w:b/>
+          <w:bCs/>
+        </w:rPr>
+        <w:t>HERALDO:</w:t>
+      </w:r>
+      <w:r>
+        <w:t xml:space="preserve"> Los preparativos están dispuestos, los invitados ocupan sus lugares y la comitiva portuguesa está lista.</w:t>
+      </w:r>
+    </w:p>
+    <w:p>
+      <w:pPr>
+        <w:jc w:val="both"/>
+      </w:pPr>
+      <w:r>
+        <w:rPr>
+          <w:b/>
+          <w:bCs/>
+        </w:rPr>
+        <w:t>BUFÓN:</w:t>
+      </w:r>
+      <w:r>
+        <w:t xml:space="preserve"> Después de tantos viajes, cartas y contratiempos, ha llegado el momento.</w:t>
+      </w:r>
+    </w:p>
+    <w:p>
+      <w:pPr>
+        <w:jc w:val="both"/>
+      </w:pPr>
+      <w:r>
+        <w:rPr>
+          <w:b/>
+          <w:bCs/>
+        </w:rPr>
+        <w:t>HERALDO:</w:t>
+      </w:r>
+      <w:r>
+        <w:t xml:space="preserve"> Ve con los demás. Hoy, en Valencia de Alcántara la infanta Isabel de Aragón y el rey Manuel de Portugal unirán sus destinos.</w:t>
+      </w:r>
+    </w:p>
+    <w:p>
+      <w:pPr>
+        <w:jc w:val="both"/>
+      </w:pPr>
+      <w:r>
+        <w:t>Que comiencen las celebraciones.</w:t>
+      </w:r>
     </w:p>
     <w:p>
       <w:pPr>
@@ -6844,6 +7869,12 @@
     </w:p>
     <w:p>
       <w:r>
+        <w:br w:type="page"/>
+      </w:r>
+    </w:p>
+    <w:p>
+      <w:r>
+        <w:lastRenderedPageBreak/>
         <w:t>MEMORIA</w:t>
       </w:r>
     </w:p>
@@ -7011,7 +8042,6 @@
           <w:noProof/>
           <w:lang w:eastAsia="es-ES"/>
         </w:rPr>
-        <w:lastRenderedPageBreak/>
         <w:drawing>
           <wp:inline distT="0" distB="0" distL="0" distR="0" wp14:anchorId="2FE5813F" wp14:editId="129C13CC">
             <wp:extent cx="5400040" cy="2174875"/>
@@ -7115,6 +8145,7 @@
         <w:rPr>
           <w:rFonts w:ascii="Times New Roman" w:hAnsi="Times New Roman" w:cs="Times New Roman"/>
         </w:rPr>
+        <w:lastRenderedPageBreak/>
         <w:t>Su utilización permite situar al jugador en un espacio directamente relacionado con la monarquía castellana y utilizar el patrimonio histórico como parte del desarrollo narrativo del proyecto.</w:t>
       </w:r>
     </w:p>
@@ -7149,7 +8180,7 @@
           <w:noProof/>
         </w:rPr>
         <w:drawing>
-          <wp:inline distT="0" distB="0" distL="0" distR="0" wp14:anchorId="3C56B46E" wp14:editId="6EA830AA">
+          <wp:inline distT="0" distB="0" distL="0" distR="0" wp14:anchorId="3C56B46E" wp14:editId="32547C98">
             <wp:extent cx="3178629" cy="2492375"/>
             <wp:effectExtent l="0" t="0" r="3175" b="3175"/>
             <wp:docPr id="1838864746" name="Imagen 1"/>
@@ -7271,7 +8302,6 @@
           <w:rFonts w:ascii="Times New Roman" w:hAnsi="Times New Roman" w:cs="Times New Roman"/>
           <w:noProof/>
         </w:rPr>
-        <w:lastRenderedPageBreak/>
         <w:drawing>
           <wp:inline distT="0" distB="0" distL="0" distR="0" wp14:anchorId="7ED5FA3A" wp14:editId="71ED7FAC">
             <wp:extent cx="3213462" cy="2142308"/>
@@ -7388,6 +8418,7 @@
         <w:rPr>
           <w:rFonts w:ascii="Times New Roman" w:hAnsi="Times New Roman" w:cs="Times New Roman"/>
         </w:rPr>
+        <w:lastRenderedPageBreak/>
         <w:tab/>
         <w:t>A la hora de construir el escenario, se ha representado principalmente la Plaza Mayor de Medina del Campo, junto con los muros y la fachada correspondientes al volumen exterior del conjunto palaciego. Asimismo, se ha incluido una de las dependencias interiores del palacio, empleada dentro del desarrollo narrativo como estancia en la que se encuentran los Reyes Católicos.</w:t>
       </w:r>
@@ -7452,7 +8483,6 @@
           <w:rFonts w:ascii="Times New Roman" w:hAnsi="Times New Roman" w:cs="Times New Roman"/>
           <w:noProof/>
         </w:rPr>
-        <w:lastRenderedPageBreak/>
         <w:drawing>
           <wp:inline distT="0" distB="0" distL="0" distR="0" wp14:anchorId="7582AD42" wp14:editId="313DC280">
             <wp:extent cx="3979577" cy="2037521"/>
@@ -7571,6 +8601,7 @@
           <w:rFonts w:ascii="Times New Roman" w:hAnsi="Times New Roman" w:cs="Times New Roman"/>
           <w:noProof/>
         </w:rPr>
+        <w:lastRenderedPageBreak/>
         <w:drawing>
           <wp:inline distT="0" distB="0" distL="0" distR="0" wp14:anchorId="295B765A" wp14:editId="34D829F8">
             <wp:extent cx="3793626" cy="2529827"/>
@@ -7736,8 +8767,14 @@
         <w:rPr>
           <w:rFonts w:ascii="Times New Roman" w:hAnsi="Times New Roman" w:cs="Times New Roman"/>
         </w:rPr>
+        <w:t xml:space="preserve">En 1497, el Castillo-Fortaleza de Valencia de Alcántara conservaba todavía una configuración medieval. La documentación conservada permite constatar la existencia de la fortaleza desde los siglos anteriores, presentando un recinto defensivo que continuó siendo utilizado y mantenido durante el siglo XV. Contaba con 5 torres que defendían el </w:t>
+      </w:r>
+      <w:r>
+        <w:rPr>
+          <w:rFonts w:ascii="Times New Roman" w:hAnsi="Times New Roman" w:cs="Times New Roman"/>
+        </w:rPr>
         <w:lastRenderedPageBreak/>
-        <w:t>En 1497, el Castillo-Fortaleza de Valencia de Alcántara conservaba todavía una configuración medieval. La documentación conservada permite constatar la existencia de la fortaleza desde los siglos anteriores, presentando un recinto defensivo que continuó siendo utilizado y mantenido durante el siglo XV. Contaba con 5 torres que defendían el perímetro, si bien solo se conoce el nombre de dos de ellas, la del Tesoro y la del Homenaje, la cual sigue en pie hoy en día.</w:t>
+        <w:t>perímetro, si bien solo se conoce el nombre de dos de ellas, la del Tesoro y la del Homenaje, la cual sigue en pie hoy en día.</w:t>
       </w:r>
     </w:p>
     <w:p>
@@ -7756,7 +8793,7 @@
           <w:noProof/>
         </w:rPr>
         <w:drawing>
-          <wp:inline distT="0" distB="0" distL="0" distR="0" wp14:anchorId="2659DA76" wp14:editId="33E4E168">
+          <wp:inline distT="0" distB="0" distL="0" distR="0" wp14:anchorId="2659DA76" wp14:editId="21937DF9">
             <wp:extent cx="3227844" cy="3143250"/>
             <wp:effectExtent l="0" t="0" r="0" b="0"/>
             <wp:docPr id="199490778" name="Imagen 1"/>
@@ -8010,23 +9047,29 @@
         <w:rPr>
           <w:rFonts w:ascii="Times New Roman" w:hAnsi="Times New Roman" w:cs="Times New Roman"/>
         </w:rPr>
+        <w:t>[Foto del modelado]</w:t>
+      </w:r>
+    </w:p>
+    <w:p>
+      <w:pPr>
+        <w:spacing w:after="180"/>
+        <w:jc w:val="both"/>
+        <w:rPr>
+          <w:rFonts w:ascii="Times New Roman" w:hAnsi="Times New Roman" w:cs="Times New Roman"/>
+        </w:rPr>
+      </w:pPr>
+      <w:r>
+        <w:rPr>
+          <w:rFonts w:ascii="Times New Roman" w:hAnsi="Times New Roman" w:cs="Times New Roman"/>
+        </w:rPr>
+        <w:t xml:space="preserve">Por este motivo, la iglesia adquiere una especial importancia dentro de la narrativa, al convertirse en uno de los espacios principales para representar la culminación de las </w:t>
+      </w:r>
+      <w:r>
+        <w:rPr>
+          <w:rFonts w:ascii="Times New Roman" w:hAnsi="Times New Roman" w:cs="Times New Roman"/>
+        </w:rPr>
         <w:lastRenderedPageBreak/>
-        <w:t>[Foto del modelado]</w:t>
-      </w:r>
-    </w:p>
-    <w:p>
-      <w:pPr>
-        <w:spacing w:after="180"/>
-        <w:jc w:val="both"/>
-        <w:rPr>
-          <w:rFonts w:ascii="Times New Roman" w:hAnsi="Times New Roman" w:cs="Times New Roman"/>
-        </w:rPr>
-      </w:pPr>
-      <w:r>
-        <w:rPr>
-          <w:rFonts w:ascii="Times New Roman" w:hAnsi="Times New Roman" w:cs="Times New Roman"/>
-        </w:rPr>
-        <w:t>Por este motivo, la iglesia adquiere una especial importancia dentro de la narrativa, al convertirse en uno de los espacios principales para representar la culminación de las negociaciones matrimoniales desarrolladas durante los capítulos anteriores y la unión entre las monarquías castellana y portuguesa.</w:t>
+        <w:t>negociaciones matrimoniales desarrolladas durante los capítulos anteriores y la unión entre las monarquías castellana y portuguesa.</w:t>
       </w:r>
     </w:p>
     <w:p>
@@ -9354,7 +10397,6 @@
   <w:style w:type="character" w:default="1" w:styleId="Fuentedeprrafopredeter">
     <w:name w:val="Default Paragraph Font"/>
     <w:uiPriority w:val="1"/>
-    <w:semiHidden/>
     <w:unhideWhenUsed/>
   </w:style>
   <w:style w:type="table" w:default="1" w:styleId="Tablanormal">

</xml_diff>

<commit_message>
Escenario 3, personajes y estructura cap2
</commit_message>
<xml_diff>
--- a/GUION.docx
+++ b/GUION.docx
@@ -7354,10 +7354,7 @@
         <w:jc w:val="both"/>
       </w:pPr>
       <w:r>
-        <w:t>¿Por qué crees que los reyes han elegido este</w:t>
-      </w:r>
-      <w:r>
-        <w:t xml:space="preserve"> sitio como lugar del casamiento?</w:t>
+        <w:t>¿Por qué crees que los reyes han elegido este sitio como lugar del casamiento?</w:t>
       </w:r>
     </w:p>
     <w:p>
@@ -8180,7 +8177,7 @@
           <w:noProof/>
         </w:rPr>
         <w:drawing>
-          <wp:inline distT="0" distB="0" distL="0" distR="0" wp14:anchorId="3C56B46E" wp14:editId="32547C98">
+          <wp:inline distT="0" distB="0" distL="0" distR="0" wp14:anchorId="3C56B46E" wp14:editId="4B20C8B8">
             <wp:extent cx="3178629" cy="2492375"/>
             <wp:effectExtent l="0" t="0" r="3175" b="3175"/>
             <wp:docPr id="1838864746" name="Imagen 1"/>
@@ -8793,7 +8790,7 @@
           <w:noProof/>
         </w:rPr>
         <w:drawing>
-          <wp:inline distT="0" distB="0" distL="0" distR="0" wp14:anchorId="2659DA76" wp14:editId="21937DF9">
+          <wp:inline distT="0" distB="0" distL="0" distR="0" wp14:anchorId="2659DA76" wp14:editId="7D6C9F1B">
             <wp:extent cx="3227844" cy="3143250"/>
             <wp:effectExtent l="0" t="0" r="0" b="0"/>
             <wp:docPr id="199490778" name="Imagen 1"/>
@@ -10397,6 +10394,7 @@
   <w:style w:type="character" w:default="1" w:styleId="Fuentedeprrafopredeter">
     <w:name w:val="Default Paragraph Font"/>
     <w:uiPriority w:val="1"/>
+    <w:semiHidden/>
     <w:unhideWhenUsed/>
   </w:style>
   <w:style w:type="table" w:default="1" w:styleId="Tablanormal">

</xml_diff>